<commit_message>
Aurora: 4 Edge points, Stronger Power and Extra Power Edges, one Class IV power at creation with the GM's approval
Co-Authored-By: Claude Opus 5.5 <noreply@anthropic.com>
Claude-Session: https://claude.ai/code/session_015SADCFzhKijkC2foUmXrpC
</commit_message>
<xml_diff>
--- a/legend-dynamics/aurora/Aurora_Players_Guide.docx
+++ b/legend-dynamics/aurora/Aurora_Players_Guide.docx
@@ -2465,7 +2465,7 @@
           <w:bCs/>
           <w:b/>
         </w:rPr>
-        <w:t xml:space="preserve">3 points</w:t>
+        <w:t xml:space="preserve">4 points</w:t>
       </w:r>
       <w:r>
         <w:t xml:space="preserve"> </w:t>
@@ -2628,6 +2628,69 @@
               <w:rPr>
                 <w:sz w:val="19"/>
               </w:rPr>
+              <w:t xml:space="preserve">4</w:t>
+            </w:r>
+          </w:p>
+        </w:tc>
+        <w:tc>
+          <w:tcPr/>
+          <w:p>
+            <w:pPr>
+              <w:pStyle w:val="Compact"/>
+              <w:jc w:val="left"/>
+            </w:pPr>
+            <w:r>
+              <w:rPr>
+                <w:sz w:val="19"/>
+              </w:rPr>
+              <w:t xml:space="preserve">None</w:t>
+            </w:r>
+          </w:p>
+        </w:tc>
+      </w:tr>
+      <w:tr>
+        <w:tc>
+          <w:tcPr/>
+          <w:p>
+            <w:pPr>
+              <w:pStyle w:val="Compact"/>
+              <w:jc w:val="left"/>
+            </w:pPr>
+            <w:r>
+              <w:rPr>
+                <w:b/>
+                <w:sz w:val="19"/>
+              </w:rPr>
+              <w:t xml:space="preserve">Adept</w:t>
+            </w:r>
+          </w:p>
+        </w:tc>
+        <w:tc>
+          <w:tcPr/>
+          <w:p>
+            <w:pPr>
+              <w:pStyle w:val="Compact"/>
+              <w:jc w:val="left"/>
+            </w:pPr>
+            <w:r>
+              <w:rPr>
+                <w:sz w:val="19"/>
+              </w:rPr>
+              <w:t xml:space="preserve">1</w:t>
+            </w:r>
+          </w:p>
+        </w:tc>
+        <w:tc>
+          <w:tcPr/>
+          <w:p>
+            <w:pPr>
+              <w:pStyle w:val="Compact"/>
+              <w:jc w:val="left"/>
+            </w:pPr>
+            <w:r>
+              <w:rPr>
+                <w:sz w:val="19"/>
+              </w:rPr>
               <w:t xml:space="preserve">3</w:t>
             </w:r>
           </w:p>
@@ -2643,6 +2706,69 @@
               <w:rPr>
                 <w:sz w:val="19"/>
               </w:rPr>
+              <w:t xml:space="preserve">Body −1, Intellect +1</w:t>
+            </w:r>
+          </w:p>
+        </w:tc>
+      </w:tr>
+      <w:tr>
+        <w:tc>
+          <w:tcPr/>
+          <w:p>
+            <w:pPr>
+              <w:pStyle w:val="Compact"/>
+              <w:jc w:val="left"/>
+            </w:pPr>
+            <w:r>
+              <w:rPr>
+                <w:b/>
+                <w:sz w:val="19"/>
+              </w:rPr>
+              <w:t xml:space="preserve">Aurora-born</w:t>
+            </w:r>
+          </w:p>
+        </w:tc>
+        <w:tc>
+          <w:tcPr/>
+          <w:p>
+            <w:pPr>
+              <w:pStyle w:val="Compact"/>
+              <w:jc w:val="left"/>
+            </w:pPr>
+            <w:r>
+              <w:rPr>
+                <w:sz w:val="19"/>
+              </w:rPr>
+              <w:t xml:space="preserve">2</w:t>
+            </w:r>
+          </w:p>
+        </w:tc>
+        <w:tc>
+          <w:tcPr/>
+          <w:p>
+            <w:pPr>
+              <w:pStyle w:val="Compact"/>
+              <w:jc w:val="left"/>
+            </w:pPr>
+            <w:r>
+              <w:rPr>
+                <w:sz w:val="19"/>
+              </w:rPr>
+              <w:t xml:space="preserve">2</w:t>
+            </w:r>
+          </w:p>
+        </w:tc>
+        <w:tc>
+          <w:tcPr/>
+          <w:p>
+            <w:pPr>
+              <w:pStyle w:val="Compact"/>
+              <w:jc w:val="left"/>
+            </w:pPr>
+            <w:r>
+              <w:rPr>
+                <w:sz w:val="19"/>
+              </w:rPr>
               <w:t xml:space="preserve">None</w:t>
             </w:r>
           </w:p>
@@ -2661,7 +2787,337 @@
                 <w:b/>
                 <w:sz w:val="19"/>
               </w:rPr>
-              <w:t xml:space="preserve">Adept</w:t>
+              <w:t xml:space="preserve">Bonded</w:t>
+            </w:r>
+          </w:p>
+        </w:tc>
+        <w:tc>
+          <w:tcPr/>
+          <w:p>
+            <w:pPr>
+              <w:pStyle w:val="Compact"/>
+              <w:jc w:val="left"/>
+            </w:pPr>
+            <w:r>
+              <w:rPr>
+                <w:sz w:val="19"/>
+              </w:rPr>
+              <w:t xml:space="preserve">2</w:t>
+            </w:r>
+          </w:p>
+        </w:tc>
+        <w:tc>
+          <w:tcPr/>
+          <w:p>
+            <w:pPr>
+              <w:pStyle w:val="Compact"/>
+              <w:jc w:val="left"/>
+            </w:pPr>
+            <w:r>
+              <w:rPr>
+                <w:sz w:val="19"/>
+              </w:rPr>
+              <w:t xml:space="preserve">2</w:t>
+            </w:r>
+          </w:p>
+        </w:tc>
+        <w:tc>
+          <w:tcPr/>
+          <w:p>
+            <w:pPr>
+              <w:pStyle w:val="Compact"/>
+              <w:jc w:val="left"/>
+            </w:pPr>
+            <w:r>
+              <w:rPr>
+                <w:sz w:val="19"/>
+              </w:rPr>
+              <w:t xml:space="preserve">Presence −1, Will +1</w:t>
+            </w:r>
+          </w:p>
+        </w:tc>
+      </w:tr>
+      <w:tr>
+        <w:tc>
+          <w:tcPr/>
+          <w:p>
+            <w:pPr>
+              <w:pStyle w:val="Compact"/>
+              <w:jc w:val="left"/>
+            </w:pPr>
+            <w:r>
+              <w:rPr>
+                <w:b/>
+                <w:sz w:val="19"/>
+              </w:rPr>
+              <w:t xml:space="preserve">Lab-made</w:t>
+            </w:r>
+          </w:p>
+        </w:tc>
+        <w:tc>
+          <w:tcPr/>
+          <w:p>
+            <w:pPr>
+              <w:pStyle w:val="Compact"/>
+              <w:jc w:val="left"/>
+            </w:pPr>
+            <w:r>
+              <w:rPr>
+                <w:sz w:val="19"/>
+              </w:rPr>
+              <w:t xml:space="preserve">2</w:t>
+            </w:r>
+          </w:p>
+        </w:tc>
+        <w:tc>
+          <w:tcPr/>
+          <w:p>
+            <w:pPr>
+              <w:pStyle w:val="Compact"/>
+              <w:jc w:val="left"/>
+            </w:pPr>
+            <w:r>
+              <w:rPr>
+                <w:sz w:val="19"/>
+              </w:rPr>
+              <w:t xml:space="preserve">2</w:t>
+            </w:r>
+          </w:p>
+        </w:tc>
+        <w:tc>
+          <w:tcPr/>
+          <w:p>
+            <w:pPr>
+              <w:pStyle w:val="Compact"/>
+              <w:jc w:val="left"/>
+            </w:pPr>
+            <w:r>
+              <w:rPr>
+                <w:sz w:val="19"/>
+              </w:rPr>
+              <w:t xml:space="preserve">Body +1, Presence −1</w:t>
+            </w:r>
+          </w:p>
+        </w:tc>
+      </w:tr>
+      <w:tr>
+        <w:tc>
+          <w:tcPr/>
+          <w:p>
+            <w:pPr>
+              <w:pStyle w:val="Compact"/>
+              <w:jc w:val="left"/>
+            </w:pPr>
+            <w:r>
+              <w:rPr>
+                <w:b/>
+                <w:sz w:val="19"/>
+              </w:rPr>
+              <w:t xml:space="preserve">Otherworlder</w:t>
+            </w:r>
+          </w:p>
+        </w:tc>
+        <w:tc>
+          <w:tcPr/>
+          <w:p>
+            <w:pPr>
+              <w:pStyle w:val="Compact"/>
+              <w:jc w:val="left"/>
+            </w:pPr>
+            <w:r>
+              <w:rPr>
+                <w:sz w:val="19"/>
+              </w:rPr>
+              <w:t xml:space="preserve">2</w:t>
+            </w:r>
+          </w:p>
+        </w:tc>
+        <w:tc>
+          <w:tcPr/>
+          <w:p>
+            <w:pPr>
+              <w:pStyle w:val="Compact"/>
+              <w:jc w:val="left"/>
+            </w:pPr>
+            <w:r>
+              <w:rPr>
+                <w:sz w:val="19"/>
+              </w:rPr>
+              <w:t xml:space="preserve">2</w:t>
+            </w:r>
+          </w:p>
+        </w:tc>
+        <w:tc>
+          <w:tcPr/>
+          <w:p>
+            <w:pPr>
+              <w:pStyle w:val="Compact"/>
+              <w:jc w:val="left"/>
+            </w:pPr>
+            <w:r>
+              <w:rPr>
+                <w:sz w:val="19"/>
+              </w:rPr>
+              <w:t xml:space="preserve">Agility +1, Will −1</w:t>
+            </w:r>
+          </w:p>
+        </w:tc>
+      </w:tr>
+      <w:tr>
+        <w:tc>
+          <w:tcPr/>
+          <w:p>
+            <w:pPr>
+              <w:pStyle w:val="Compact"/>
+              <w:jc w:val="left"/>
+            </w:pPr>
+            <w:r>
+              <w:rPr>
+                <w:b/>
+                <w:sz w:val="19"/>
+              </w:rPr>
+              <w:t xml:space="preserve">Shadow Earth Defector (GM’s permission)</w:t>
+            </w:r>
+          </w:p>
+        </w:tc>
+        <w:tc>
+          <w:tcPr/>
+          <w:p>
+            <w:pPr>
+              <w:pStyle w:val="Compact"/>
+              <w:jc w:val="left"/>
+            </w:pPr>
+            <w:r>
+              <w:rPr>
+                <w:sz w:val="19"/>
+              </w:rPr>
+              <w:t xml:space="preserve">2</w:t>
+            </w:r>
+          </w:p>
+        </w:tc>
+        <w:tc>
+          <w:tcPr/>
+          <w:p>
+            <w:pPr>
+              <w:pStyle w:val="Compact"/>
+              <w:jc w:val="left"/>
+            </w:pPr>
+            <w:r>
+              <w:rPr>
+                <w:sz w:val="19"/>
+              </w:rPr>
+              <w:t xml:space="preserve">2</w:t>
+            </w:r>
+          </w:p>
+        </w:tc>
+        <w:tc>
+          <w:tcPr/>
+          <w:p>
+            <w:pPr>
+              <w:pStyle w:val="Compact"/>
+              <w:jc w:val="left"/>
+            </w:pPr>
+            <w:r>
+              <w:rPr>
+                <w:sz w:val="19"/>
+              </w:rPr>
+              <w:t xml:space="preserve">Agility +1, Presence −1</w:t>
+            </w:r>
+          </w:p>
+        </w:tc>
+      </w:tr>
+      <w:tr>
+        <w:tc>
+          <w:tcPr/>
+          <w:p>
+            <w:pPr>
+              <w:pStyle w:val="Compact"/>
+              <w:jc w:val="left"/>
+            </w:pPr>
+            <w:r>
+              <w:rPr>
+                <w:b/>
+                <w:sz w:val="19"/>
+              </w:rPr>
+              <w:t xml:space="preserve">Touched</w:t>
+            </w:r>
+          </w:p>
+        </w:tc>
+        <w:tc>
+          <w:tcPr/>
+          <w:p>
+            <w:pPr>
+              <w:pStyle w:val="Compact"/>
+              <w:jc w:val="left"/>
+            </w:pPr>
+            <w:r>
+              <w:rPr>
+                <w:sz w:val="19"/>
+              </w:rPr>
+              <w:t xml:space="preserve">2</w:t>
+            </w:r>
+          </w:p>
+        </w:tc>
+        <w:tc>
+          <w:tcPr/>
+          <w:p>
+            <w:pPr>
+              <w:pStyle w:val="Compact"/>
+              <w:jc w:val="left"/>
+            </w:pPr>
+            <w:r>
+              <w:rPr>
+                <w:sz w:val="19"/>
+              </w:rPr>
+              <w:t xml:space="preserve">2</w:t>
+            </w:r>
+          </w:p>
+        </w:tc>
+        <w:tc>
+          <w:tcPr/>
+          <w:p>
+            <w:pPr>
+              <w:pStyle w:val="Compact"/>
+              <w:jc w:val="left"/>
+            </w:pPr>
+            <w:r>
+              <w:rPr>
+                <w:sz w:val="19"/>
+              </w:rPr>
+              <w:t xml:space="preserve">Intellect −1, Will +1</w:t>
+            </w:r>
+          </w:p>
+        </w:tc>
+      </w:tr>
+      <w:tr>
+        <w:tc>
+          <w:tcPr/>
+          <w:p>
+            <w:pPr>
+              <w:pStyle w:val="Compact"/>
+              <w:jc w:val="left"/>
+            </w:pPr>
+            <w:r>
+              <w:rPr>
+                <w:b/>
+                <w:sz w:val="19"/>
+              </w:rPr>
+              <w:t xml:space="preserve">Ambrosia</w:t>
+            </w:r>
+          </w:p>
+        </w:tc>
+        <w:tc>
+          <w:tcPr/>
+          <w:p>
+            <w:pPr>
+              <w:pStyle w:val="Compact"/>
+              <w:jc w:val="left"/>
+            </w:pPr>
+            <w:r>
+              <w:rPr>
+                <w:sz w:val="19"/>
+              </w:rPr>
+              <w:t xml:space="preserve">3</w:t>
             </w:r>
           </w:p>
         </w:tc>
@@ -2691,55 +3147,40 @@
               <w:rPr>
                 <w:sz w:val="19"/>
               </w:rPr>
-              <w:t xml:space="preserve">2</w:t>
-            </w:r>
-          </w:p>
-        </w:tc>
-        <w:tc>
-          <w:tcPr/>
-          <w:p>
-            <w:pPr>
-              <w:pStyle w:val="Compact"/>
-              <w:jc w:val="left"/>
-            </w:pPr>
-            <w:r>
-              <w:rPr>
-                <w:sz w:val="19"/>
-              </w:rPr>
-              <w:t xml:space="preserve">Body −1, Intellect +1</w:t>
-            </w:r>
-          </w:p>
-        </w:tc>
-      </w:tr>
-      <w:tr>
-        <w:tc>
-          <w:tcPr/>
-          <w:p>
-            <w:pPr>
-              <w:pStyle w:val="Compact"/>
-              <w:jc w:val="left"/>
-            </w:pPr>
-            <w:r>
-              <w:rPr>
-                <w:b/>
-                <w:sz w:val="19"/>
-              </w:rPr>
-              <w:t xml:space="preserve">Aurora-born</w:t>
-            </w:r>
-          </w:p>
-        </w:tc>
-        <w:tc>
-          <w:tcPr/>
-          <w:p>
-            <w:pPr>
-              <w:pStyle w:val="Compact"/>
-              <w:jc w:val="left"/>
-            </w:pPr>
-            <w:r>
-              <w:rPr>
-                <w:sz w:val="19"/>
-              </w:rPr>
-              <w:t xml:space="preserve">2</w:t>
+              <w:t xml:space="preserve">Body +1, Agility −1, Intellect −1, Presence +1</w:t>
+            </w:r>
+          </w:p>
+        </w:tc>
+      </w:tr>
+      <w:tr>
+        <w:tc>
+          <w:tcPr/>
+          <w:p>
+            <w:pPr>
+              <w:pStyle w:val="Compact"/>
+              <w:jc w:val="left"/>
+            </w:pPr>
+            <w:r>
+              <w:rPr>
+                <w:b/>
+                <w:sz w:val="19"/>
+              </w:rPr>
+              <w:t xml:space="preserve">Mythic</w:t>
+            </w:r>
+          </w:p>
+        </w:tc>
+        <w:tc>
+          <w:tcPr/>
+          <w:p>
+            <w:pPr>
+              <w:pStyle w:val="Compact"/>
+              <w:jc w:val="left"/>
+            </w:pPr>
+            <w:r>
+              <w:rPr>
+                <w:sz w:val="19"/>
+              </w:rPr>
+              <w:t xml:space="preserve">3</w:t>
             </w:r>
           </w:p>
         </w:tc>
@@ -2755,447 +3196,6 @@
                 <w:sz w:val="19"/>
               </w:rPr>
               <w:t xml:space="preserve">1</w:t>
-            </w:r>
-          </w:p>
-        </w:tc>
-        <w:tc>
-          <w:tcPr/>
-          <w:p>
-            <w:pPr>
-              <w:pStyle w:val="Compact"/>
-              <w:jc w:val="left"/>
-            </w:pPr>
-            <w:r>
-              <w:rPr>
-                <w:sz w:val="19"/>
-              </w:rPr>
-              <w:t xml:space="preserve">None</w:t>
-            </w:r>
-          </w:p>
-        </w:tc>
-      </w:tr>
-      <w:tr>
-        <w:tc>
-          <w:tcPr/>
-          <w:p>
-            <w:pPr>
-              <w:pStyle w:val="Compact"/>
-              <w:jc w:val="left"/>
-            </w:pPr>
-            <w:r>
-              <w:rPr>
-                <w:b/>
-                <w:sz w:val="19"/>
-              </w:rPr>
-              <w:t xml:space="preserve">Bonded</w:t>
-            </w:r>
-          </w:p>
-        </w:tc>
-        <w:tc>
-          <w:tcPr/>
-          <w:p>
-            <w:pPr>
-              <w:pStyle w:val="Compact"/>
-              <w:jc w:val="left"/>
-            </w:pPr>
-            <w:r>
-              <w:rPr>
-                <w:sz w:val="19"/>
-              </w:rPr>
-              <w:t xml:space="preserve">2</w:t>
-            </w:r>
-          </w:p>
-        </w:tc>
-        <w:tc>
-          <w:tcPr/>
-          <w:p>
-            <w:pPr>
-              <w:pStyle w:val="Compact"/>
-              <w:jc w:val="left"/>
-            </w:pPr>
-            <w:r>
-              <w:rPr>
-                <w:sz w:val="19"/>
-              </w:rPr>
-              <w:t xml:space="preserve">1</w:t>
-            </w:r>
-          </w:p>
-        </w:tc>
-        <w:tc>
-          <w:tcPr/>
-          <w:p>
-            <w:pPr>
-              <w:pStyle w:val="Compact"/>
-              <w:jc w:val="left"/>
-            </w:pPr>
-            <w:r>
-              <w:rPr>
-                <w:sz w:val="19"/>
-              </w:rPr>
-              <w:t xml:space="preserve">Presence −1, Will +1</w:t>
-            </w:r>
-          </w:p>
-        </w:tc>
-      </w:tr>
-      <w:tr>
-        <w:tc>
-          <w:tcPr/>
-          <w:p>
-            <w:pPr>
-              <w:pStyle w:val="Compact"/>
-              <w:jc w:val="left"/>
-            </w:pPr>
-            <w:r>
-              <w:rPr>
-                <w:b/>
-                <w:sz w:val="19"/>
-              </w:rPr>
-              <w:t xml:space="preserve">Lab-made</w:t>
-            </w:r>
-          </w:p>
-        </w:tc>
-        <w:tc>
-          <w:tcPr/>
-          <w:p>
-            <w:pPr>
-              <w:pStyle w:val="Compact"/>
-              <w:jc w:val="left"/>
-            </w:pPr>
-            <w:r>
-              <w:rPr>
-                <w:sz w:val="19"/>
-              </w:rPr>
-              <w:t xml:space="preserve">2</w:t>
-            </w:r>
-          </w:p>
-        </w:tc>
-        <w:tc>
-          <w:tcPr/>
-          <w:p>
-            <w:pPr>
-              <w:pStyle w:val="Compact"/>
-              <w:jc w:val="left"/>
-            </w:pPr>
-            <w:r>
-              <w:rPr>
-                <w:sz w:val="19"/>
-              </w:rPr>
-              <w:t xml:space="preserve">1</w:t>
-            </w:r>
-          </w:p>
-        </w:tc>
-        <w:tc>
-          <w:tcPr/>
-          <w:p>
-            <w:pPr>
-              <w:pStyle w:val="Compact"/>
-              <w:jc w:val="left"/>
-            </w:pPr>
-            <w:r>
-              <w:rPr>
-                <w:sz w:val="19"/>
-              </w:rPr>
-              <w:t xml:space="preserve">Body +1, Presence −1</w:t>
-            </w:r>
-          </w:p>
-        </w:tc>
-      </w:tr>
-      <w:tr>
-        <w:tc>
-          <w:tcPr/>
-          <w:p>
-            <w:pPr>
-              <w:pStyle w:val="Compact"/>
-              <w:jc w:val="left"/>
-            </w:pPr>
-            <w:r>
-              <w:rPr>
-                <w:b/>
-                <w:sz w:val="19"/>
-              </w:rPr>
-              <w:t xml:space="preserve">Otherworlder</w:t>
-            </w:r>
-          </w:p>
-        </w:tc>
-        <w:tc>
-          <w:tcPr/>
-          <w:p>
-            <w:pPr>
-              <w:pStyle w:val="Compact"/>
-              <w:jc w:val="left"/>
-            </w:pPr>
-            <w:r>
-              <w:rPr>
-                <w:sz w:val="19"/>
-              </w:rPr>
-              <w:t xml:space="preserve">2</w:t>
-            </w:r>
-          </w:p>
-        </w:tc>
-        <w:tc>
-          <w:tcPr/>
-          <w:p>
-            <w:pPr>
-              <w:pStyle w:val="Compact"/>
-              <w:jc w:val="left"/>
-            </w:pPr>
-            <w:r>
-              <w:rPr>
-                <w:sz w:val="19"/>
-              </w:rPr>
-              <w:t xml:space="preserve">1</w:t>
-            </w:r>
-          </w:p>
-        </w:tc>
-        <w:tc>
-          <w:tcPr/>
-          <w:p>
-            <w:pPr>
-              <w:pStyle w:val="Compact"/>
-              <w:jc w:val="left"/>
-            </w:pPr>
-            <w:r>
-              <w:rPr>
-                <w:sz w:val="19"/>
-              </w:rPr>
-              <w:t xml:space="preserve">Agility +1, Will −1</w:t>
-            </w:r>
-          </w:p>
-        </w:tc>
-      </w:tr>
-      <w:tr>
-        <w:tc>
-          <w:tcPr/>
-          <w:p>
-            <w:pPr>
-              <w:pStyle w:val="Compact"/>
-              <w:jc w:val="left"/>
-            </w:pPr>
-            <w:r>
-              <w:rPr>
-                <w:b/>
-                <w:sz w:val="19"/>
-              </w:rPr>
-              <w:t xml:space="preserve">Shadow Earth Defector (GM’s permission)</w:t>
-            </w:r>
-          </w:p>
-        </w:tc>
-        <w:tc>
-          <w:tcPr/>
-          <w:p>
-            <w:pPr>
-              <w:pStyle w:val="Compact"/>
-              <w:jc w:val="left"/>
-            </w:pPr>
-            <w:r>
-              <w:rPr>
-                <w:sz w:val="19"/>
-              </w:rPr>
-              <w:t xml:space="preserve">2</w:t>
-            </w:r>
-          </w:p>
-        </w:tc>
-        <w:tc>
-          <w:tcPr/>
-          <w:p>
-            <w:pPr>
-              <w:pStyle w:val="Compact"/>
-              <w:jc w:val="left"/>
-            </w:pPr>
-            <w:r>
-              <w:rPr>
-                <w:sz w:val="19"/>
-              </w:rPr>
-              <w:t xml:space="preserve">1</w:t>
-            </w:r>
-          </w:p>
-        </w:tc>
-        <w:tc>
-          <w:tcPr/>
-          <w:p>
-            <w:pPr>
-              <w:pStyle w:val="Compact"/>
-              <w:jc w:val="left"/>
-            </w:pPr>
-            <w:r>
-              <w:rPr>
-                <w:sz w:val="19"/>
-              </w:rPr>
-              <w:t xml:space="preserve">Agility +1, Presence −1</w:t>
-            </w:r>
-          </w:p>
-        </w:tc>
-      </w:tr>
-      <w:tr>
-        <w:tc>
-          <w:tcPr/>
-          <w:p>
-            <w:pPr>
-              <w:pStyle w:val="Compact"/>
-              <w:jc w:val="left"/>
-            </w:pPr>
-            <w:r>
-              <w:rPr>
-                <w:b/>
-                <w:sz w:val="19"/>
-              </w:rPr>
-              <w:t xml:space="preserve">Touched</w:t>
-            </w:r>
-          </w:p>
-        </w:tc>
-        <w:tc>
-          <w:tcPr/>
-          <w:p>
-            <w:pPr>
-              <w:pStyle w:val="Compact"/>
-              <w:jc w:val="left"/>
-            </w:pPr>
-            <w:r>
-              <w:rPr>
-                <w:sz w:val="19"/>
-              </w:rPr>
-              <w:t xml:space="preserve">2</w:t>
-            </w:r>
-          </w:p>
-        </w:tc>
-        <w:tc>
-          <w:tcPr/>
-          <w:p>
-            <w:pPr>
-              <w:pStyle w:val="Compact"/>
-              <w:jc w:val="left"/>
-            </w:pPr>
-            <w:r>
-              <w:rPr>
-                <w:sz w:val="19"/>
-              </w:rPr>
-              <w:t xml:space="preserve">1</w:t>
-            </w:r>
-          </w:p>
-        </w:tc>
-        <w:tc>
-          <w:tcPr/>
-          <w:p>
-            <w:pPr>
-              <w:pStyle w:val="Compact"/>
-              <w:jc w:val="left"/>
-            </w:pPr>
-            <w:r>
-              <w:rPr>
-                <w:sz w:val="19"/>
-              </w:rPr>
-              <w:t xml:space="preserve">Intellect −1, Will +1</w:t>
-            </w:r>
-          </w:p>
-        </w:tc>
-      </w:tr>
-      <w:tr>
-        <w:tc>
-          <w:tcPr/>
-          <w:p>
-            <w:pPr>
-              <w:pStyle w:val="Compact"/>
-              <w:jc w:val="left"/>
-            </w:pPr>
-            <w:r>
-              <w:rPr>
-                <w:b/>
-                <w:sz w:val="19"/>
-              </w:rPr>
-              <w:t xml:space="preserve">Ambrosia</w:t>
-            </w:r>
-          </w:p>
-        </w:tc>
-        <w:tc>
-          <w:tcPr/>
-          <w:p>
-            <w:pPr>
-              <w:pStyle w:val="Compact"/>
-              <w:jc w:val="left"/>
-            </w:pPr>
-            <w:r>
-              <w:rPr>
-                <w:sz w:val="19"/>
-              </w:rPr>
-              <w:t xml:space="preserve">3</w:t>
-            </w:r>
-          </w:p>
-        </w:tc>
-        <w:tc>
-          <w:tcPr/>
-          <w:p>
-            <w:pPr>
-              <w:pStyle w:val="Compact"/>
-              <w:jc w:val="left"/>
-            </w:pPr>
-            <w:r>
-              <w:rPr>
-                <w:sz w:val="19"/>
-              </w:rPr>
-              <w:t xml:space="preserve">0</w:t>
-            </w:r>
-          </w:p>
-        </w:tc>
-        <w:tc>
-          <w:tcPr/>
-          <w:p>
-            <w:pPr>
-              <w:pStyle w:val="Compact"/>
-              <w:jc w:val="left"/>
-            </w:pPr>
-            <w:r>
-              <w:rPr>
-                <w:sz w:val="19"/>
-              </w:rPr>
-              <w:t xml:space="preserve">Body +1, Agility −1, Intellect −1, Presence +1</w:t>
-            </w:r>
-          </w:p>
-        </w:tc>
-      </w:tr>
-      <w:tr>
-        <w:tc>
-          <w:tcPr/>
-          <w:p>
-            <w:pPr>
-              <w:pStyle w:val="Compact"/>
-              <w:jc w:val="left"/>
-            </w:pPr>
-            <w:r>
-              <w:rPr>
-                <w:b/>
-                <w:sz w:val="19"/>
-              </w:rPr>
-              <w:t xml:space="preserve">Mythic</w:t>
-            </w:r>
-          </w:p>
-        </w:tc>
-        <w:tc>
-          <w:tcPr/>
-          <w:p>
-            <w:pPr>
-              <w:pStyle w:val="Compact"/>
-              <w:jc w:val="left"/>
-            </w:pPr>
-            <w:r>
-              <w:rPr>
-                <w:sz w:val="19"/>
-              </w:rPr>
-              <w:t xml:space="preserve">3</w:t>
-            </w:r>
-          </w:p>
-        </w:tc>
-        <w:tc>
-          <w:tcPr/>
-          <w:p>
-            <w:pPr>
-              <w:pStyle w:val="Compact"/>
-              <w:jc w:val="left"/>
-            </w:pPr>
-            <w:r>
-              <w:rPr>
-                <w:sz w:val="19"/>
-              </w:rPr>
-              <w:t xml:space="preserve">0</w:t>
             </w:r>
           </w:p>
         </w:tc>
@@ -3601,6 +3601,102 @@
           </w:p>
         </w:tc>
       </w:tr>
+      <w:tr>
+        <w:tc>
+          <w:tcPr/>
+          <w:p>
+            <w:pPr>
+              <w:pStyle w:val="Compact"/>
+              <w:jc w:val="left"/>
+            </w:pPr>
+            <w:r>
+              <w:rPr>
+                <w:b/>
+                <w:sz w:val="19"/>
+              </w:rPr>
+              <w:t xml:space="preserve">Stronger Power</w:t>
+            </w:r>
+          </w:p>
+        </w:tc>
+        <w:tc>
+          <w:tcPr/>
+          <w:p>
+            <w:pPr>
+              <w:pStyle w:val="Compact"/>
+              <w:jc w:val="left"/>
+            </w:pPr>
+            <w:r>
+              <w:rPr>
+                <w:sz w:val="19"/>
+              </w:rPr>
+              <w:t xml:space="preserve">Raise one of your powers by one Class. Class III is the limit at creation, unless the GM approves one power at Class IV.</w:t>
+            </w:r>
+          </w:p>
+        </w:tc>
+        <w:tc>
+          <w:tcPr/>
+          <w:p>
+            <w:pPr>
+              <w:pStyle w:val="Compact"/>
+              <w:jc w:val="left"/>
+            </w:pPr>
+            <w:r>
+              <w:rPr>
+                <w:sz w:val="19"/>
+              </w:rPr>
+              <w:t xml:space="preserve">3</w:t>
+            </w:r>
+          </w:p>
+        </w:tc>
+      </w:tr>
+      <w:tr>
+        <w:tc>
+          <w:tcPr/>
+          <w:p>
+            <w:pPr>
+              <w:pStyle w:val="Compact"/>
+              <w:jc w:val="left"/>
+            </w:pPr>
+            <w:r>
+              <w:rPr>
+                <w:b/>
+                <w:sz w:val="19"/>
+              </w:rPr>
+              <w:t xml:space="preserve">Extra Power</w:t>
+            </w:r>
+          </w:p>
+        </w:tc>
+        <w:tc>
+          <w:tcPr/>
+          <w:p>
+            <w:pPr>
+              <w:pStyle w:val="Compact"/>
+              <w:jc w:val="left"/>
+            </w:pPr>
+            <w:r>
+              <w:rPr>
+                <w:sz w:val="19"/>
+              </w:rPr>
+              <w:t xml:space="preserve">One more power, at Class I.</w:t>
+            </w:r>
+          </w:p>
+        </w:tc>
+        <w:tc>
+          <w:tcPr/>
+          <w:p>
+            <w:pPr>
+              <w:pStyle w:val="Compact"/>
+              <w:jc w:val="left"/>
+            </w:pPr>
+            <w:r>
+              <w:rPr>
+                <w:sz w:val="19"/>
+              </w:rPr>
+              <w:t xml:space="preserve">1</w:t>
+            </w:r>
+          </w:p>
+        </w:tc>
+      </w:tr>
     </w:tbl>
     <w:bookmarkEnd w:id="26"/>
     <w:bookmarkStart w:id="27" w:name="spending-points"/>
@@ -5073,7 +5169,7 @@
         <w:pStyle w:val="FirstParagraph"/>
       </w:pPr>
       <w:r>
-        <w:t xml:space="preserve">Aurora-born (tier 2, 1 Edges): Extra Spark. Body 12, Agility 10, Intellect 10, Presence 12, Will 11.</w:t>
+        <w:t xml:space="preserve">Aurora-born (tier 2, 2 Edges): Extra Spark, Stronger Power. Body 12, Agility 10, Intellect 10, Presence 12, Will 11.</w:t>
       </w:r>
     </w:p>
     <w:p>
@@ -5199,7 +5295,7 @@
         <w:t xml:space="preserve"> </w:t>
       </w:r>
       <w:r>
-        <w:t xml:space="preserve">Toughness II, Strength I, Enhanced Senses I.</w:t>
+        <w:t xml:space="preserve">Toughness III, Strength I, Enhanced Senses I.</w:t>
       </w:r>
     </w:p>
     <w:p>
@@ -13252,13 +13348,13 @@
     </w:p>
     <w:bookmarkEnd w:id="68"/>
     <w:bookmarkEnd w:id="69"/>
-    <w:bookmarkStart w:id="77" w:name="the-world-of-exlaw"/>
+    <w:bookmarkStart w:id="77" w:name="the-world-of-aurora"/>
     <w:p>
       <w:pPr>
         <w:pStyle w:val="Heading1"/>
       </w:pPr>
       <w:r>
-        <w:t xml:space="preserve">The world of ExLAW</w:t>
+        <w:t xml:space="preserve">The world of Aurora</w:t>
       </w:r>
     </w:p>
     <w:bookmarkStart w:id="70" w:name="the-first-wave"/>
@@ -16826,6 +16922,262 @@
       </w:r>
       <w:r>
         <w:t xml:space="preserve">character takes.</w:t>
+      </w:r>
+    </w:p>
+    <w:p>
+      <w:pPr>
+        <w:pStyle w:val="BodyText"/>
+      </w:pPr>
+      <w:r>
+        <w:rPr>
+          <w:bCs/>
+          <w:b/>
+        </w:rPr>
+        <w:t xml:space="preserve">Aurora characters have 4 Edge points</w:t>
+      </w:r>
+      <w:r>
+        <w:t xml:space="preserve"> </w:t>
+      </w:r>
+      <w:r>
+        <w:t xml:space="preserve">(one more than other Legend Dynamics settings), and two Edges of their own:</w:t>
+      </w:r>
+    </w:p>
+    <w:tbl>
+      <w:tblPr>
+        <w:tblStyle w:val="Table"/>
+        <w:tblW w:type="pct" w:w="5000"/>
+        <w:tblLook w:firstRow="1" w:lastRow="0" w:firstColumn="0" w:lastColumn="0" w:noHBand="0" w:noVBand="0" w:val="0020"/>
+        <w:jc w:val="start"/>
+        <w:tblBorders>
+          <w:top w:val="single" w:sz="4" w:color="B8C2D3"/>
+          <w:left w:val="single" w:sz="4" w:color="B8C2D3"/>
+          <w:bottom w:val="single" w:sz="4" w:color="B8C2D3"/>
+          <w:right w:val="single" w:sz="4" w:color="B8C2D3"/>
+          <w:insideH w:val="single" w:sz="4" w:color="B8C2D3"/>
+          <w:insideV w:val="single" w:sz="4" w:color="B8C2D3"/>
+        </w:tblBorders>
+      </w:tblPr>
+      <w:tblGrid>
+        <w:gridCol w:w="2640"/>
+        <w:gridCol w:w="2640"/>
+        <w:gridCol w:w="2640"/>
+      </w:tblGrid>
+      <w:tr>
+        <w:trPr>
+          <w:tblHeader w:val="true"/>
+        </w:trPr>
+        <w:tc>
+          <w:tcPr>
+            <w:shd w:val="clear" w:fill="E8EEF8"/>
+          </w:tcPr>
+          <w:p>
+            <w:pPr>
+              <w:pStyle w:val="Compact"/>
+              <w:jc w:val="left"/>
+            </w:pPr>
+            <w:r>
+              <w:rPr>
+                <w:b/>
+                <w:sz w:val="19"/>
+              </w:rPr>
+              <w:t xml:space="preserve">Edge</w:t>
+            </w:r>
+          </w:p>
+        </w:tc>
+        <w:tc>
+          <w:tcPr>
+            <w:shd w:val="clear" w:fill="E8EEF8"/>
+          </w:tcPr>
+          <w:p>
+            <w:pPr>
+              <w:pStyle w:val="Compact"/>
+              <w:jc w:val="left"/>
+            </w:pPr>
+            <w:r>
+              <w:rPr>
+                <w:b/>
+                <w:sz w:val="19"/>
+              </w:rPr>
+              <w:t xml:space="preserve">Effect</w:t>
+            </w:r>
+          </w:p>
+        </w:tc>
+        <w:tc>
+          <w:tcPr>
+            <w:shd w:val="clear" w:fill="E8EEF8"/>
+          </w:tcPr>
+          <w:p>
+            <w:pPr>
+              <w:pStyle w:val="Compact"/>
+              <w:jc w:val="left"/>
+            </w:pPr>
+            <w:r>
+              <w:rPr>
+                <w:b/>
+                <w:sz w:val="19"/>
+              </w:rPr>
+              <w:t xml:space="preserve">Limit</w:t>
+            </w:r>
+          </w:p>
+        </w:tc>
+      </w:tr>
+      <w:tr>
+        <w:tc>
+          <w:tcPr/>
+          <w:p>
+            <w:pPr>
+              <w:pStyle w:val="Compact"/>
+              <w:jc w:val="left"/>
+            </w:pPr>
+            <w:r>
+              <w:rPr>
+                <w:bCs/>
+                <w:b/>
+                <w:sz w:val="19"/>
+              </w:rPr>
+              <w:t xml:space="preserve">Stronger Power</w:t>
+            </w:r>
+          </w:p>
+        </w:tc>
+        <w:tc>
+          <w:tcPr/>
+          <w:p>
+            <w:pPr>
+              <w:pStyle w:val="Compact"/>
+              <w:jc w:val="left"/>
+            </w:pPr>
+            <w:r>
+              <w:rPr>
+                <w:sz w:val="19"/>
+              </w:rPr>
+              <w:t xml:space="preserve">Raise one of your powers by one Class</w:t>
+            </w:r>
+          </w:p>
+        </w:tc>
+        <w:tc>
+          <w:tcPr/>
+          <w:p>
+            <w:pPr>
+              <w:pStyle w:val="Compact"/>
+              <w:jc w:val="left"/>
+            </w:pPr>
+            <w:r>
+              <w:rPr>
+                <w:sz w:val="19"/>
+              </w:rPr>
+              <w:t xml:space="preserve">Up to three; Class III is the limit at creation, unless the GM approves</w:t>
+            </w:r>
+            <w:r>
+              <w:rPr>
+                <w:sz w:val="19"/>
+              </w:rPr>
+              <w:t xml:space="preserve"> </w:t>
+            </w:r>
+            <w:r>
+              <w:rPr>
+                <w:bCs/>
+                <w:b/>
+                <w:sz w:val="19"/>
+              </w:rPr>
+              <w:t xml:space="preserve">one power at Class IV</w:t>
+            </w:r>
+            <w:r>
+              <w:rPr>
+                <w:sz w:val="19"/>
+              </w:rPr>
+              <w:t xml:space="preserve"> </w:t>
+            </w:r>
+            <w:r>
+              <w:rPr>
+                <w:sz w:val="19"/>
+              </w:rPr>
+              <w:t xml:space="preserve">(tick</w:t>
+            </w:r>
+            <w:r>
+              <w:rPr>
+                <w:sz w:val="19"/>
+              </w:rPr>
+              <w:t xml:space="preserve"> </w:t>
+            </w:r>
+            <w:r>
+              <w:rPr>
+                <w:iCs/>
+                <w:i/>
+                <w:sz w:val="19"/>
+              </w:rPr>
+              <w:t xml:space="preserve">GM’s approval for Class IV</w:t>
+            </w:r>
+            <w:r>
+              <w:rPr>
+                <w:sz w:val="19"/>
+              </w:rPr>
+              <w:t xml:space="preserve"> </w:t>
+            </w:r>
+            <w:r>
+              <w:rPr>
+                <w:sz w:val="19"/>
+              </w:rPr>
+              <w:t xml:space="preserve">in the creator)</w:t>
+            </w:r>
+          </w:p>
+        </w:tc>
+      </w:tr>
+      <w:tr>
+        <w:tc>
+          <w:tcPr/>
+          <w:p>
+            <w:pPr>
+              <w:pStyle w:val="Compact"/>
+              <w:jc w:val="left"/>
+            </w:pPr>
+            <w:r>
+              <w:rPr>
+                <w:bCs/>
+                <w:b/>
+                <w:sz w:val="19"/>
+              </w:rPr>
+              <w:t xml:space="preserve">Extra Power</w:t>
+            </w:r>
+          </w:p>
+        </w:tc>
+        <w:tc>
+          <w:tcPr/>
+          <w:p>
+            <w:pPr>
+              <w:pStyle w:val="Compact"/>
+              <w:jc w:val="left"/>
+            </w:pPr>
+            <w:r>
+              <w:rPr>
+                <w:sz w:val="19"/>
+              </w:rPr>
+              <w:t xml:space="preserve">One more power, at Class I</w:t>
+            </w:r>
+          </w:p>
+        </w:tc>
+        <w:tc>
+          <w:tcPr/>
+          <w:p>
+            <w:pPr>
+              <w:pStyle w:val="Compact"/>
+              <w:jc w:val="left"/>
+            </w:pPr>
+            <w:r>
+              <w:rPr>
+                <w:sz w:val="19"/>
+              </w:rPr>
+              <w:t xml:space="preserve">Once</w:t>
+            </w:r>
+          </w:p>
+        </w:tc>
+      </w:tr>
+    </w:tbl>
+    <w:p>
+      <w:pPr>
+        <w:pStyle w:val="BodyText"/>
+      </w:pPr>
+      <w:r>
+        <w:t xml:space="preserve">So an Ambrosia or Mythic character can start with a Class IV power by spending their one Edge, if the GM agrees; a tier 2 Operant can trade their Edges for a stronger power or a fourth one.</w:t>
       </w:r>
     </w:p>
     <w:bookmarkEnd w:id="84"/>
@@ -25941,7 +26293,7 @@
         <w:t xml:space="preserve"> </w:t>
       </w:r>
       <w:r>
-        <w:t xml:space="preserve">Extra Spark.</w:t>
+        <w:t xml:space="preserve">Extra Spark, A friend; a friend: her missing partner’s last informant, who only talks to her.</w:t>
       </w:r>
     </w:p>
     <w:p>
@@ -26189,7 +26541,7 @@
         <w:t xml:space="preserve"> </w:t>
       </w:r>
       <w:r>
-        <w:t xml:space="preserve">+1 attribute point, Extra Trained skill, A friend; a friend: a DIRE engineer who still owes him for Basra.</w:t>
+        <w:t xml:space="preserve">+1 attribute point, Extra Trained skill, A friend, Extra Spark; a friend: a DIRE engineer who still owes him for Basra.</w:t>
       </w:r>
     </w:p>
     <w:p>
@@ -26391,29 +26743,13 @@
           <w:bCs/>
           <w:b/>
         </w:rPr>
-        <w:t xml:space="preserve">Advantage:</w:t>
-      </w:r>
-      <w:r>
-        <w:t xml:space="preserve"> </w:t>
-      </w:r>
-      <w:r>
-        <w:t xml:space="preserve">Golden Ideal (origin; companion: The Anger).</w:t>
-      </w:r>
-      <w:r>
-        <w:t xml:space="preserve"> </w:t>
-      </w:r>
-      <w:r>
-        <w:rPr>
-          <w:bCs/>
-          <w:b/>
-        </w:rPr>
-        <w:t xml:space="preserve">Complication:</w:t>
-      </w:r>
-      <w:r>
-        <w:t xml:space="preserve"> </w:t>
-      </w:r>
-      <w:r>
-        <w:t xml:space="preserve">Media Darling; trigger: a crowd with phones out.</w:t>
+        <w:t xml:space="preserve">Edges:</w:t>
+      </w:r>
+      <w:r>
+        <w:t xml:space="preserve"> </w:t>
+      </w:r>
+      <w:r>
+        <w:t xml:space="preserve">Stronger Power.</w:t>
       </w:r>
     </w:p>
     <w:p>
@@ -26429,13 +26765,29 @@
           <w:bCs/>
           <w:b/>
         </w:rPr>
-        <w:t xml:space="preserve">Powers:</w:t>
-      </w:r>
-      <w:r>
-        <w:t xml:space="preserve"> </w:t>
-      </w:r>
-      <w:r>
-        <w:t xml:space="preserve">Strength III, Flight II, Toughness I.</w:t>
+        <w:t xml:space="preserve">Advantage:</w:t>
+      </w:r>
+      <w:r>
+        <w:t xml:space="preserve"> </w:t>
+      </w:r>
+      <w:r>
+        <w:t xml:space="preserve">Golden Ideal (origin; companion: The Anger).</w:t>
+      </w:r>
+      <w:r>
+        <w:t xml:space="preserve"> </w:t>
+      </w:r>
+      <w:r>
+        <w:rPr>
+          <w:bCs/>
+          <w:b/>
+        </w:rPr>
+        <w:t xml:space="preserve">Complication:</w:t>
+      </w:r>
+      <w:r>
+        <w:t xml:space="preserve"> </w:t>
+      </w:r>
+      <w:r>
+        <w:t xml:space="preserve">Media Darling; trigger: a crowd with phones out.</w:t>
       </w:r>
     </w:p>
     <w:p>
@@ -26451,13 +26803,13 @@
           <w:bCs/>
           <w:b/>
         </w:rPr>
-        <w:t xml:space="preserve">Legal status:</w:t>
-      </w:r>
-      <w:r>
-        <w:t xml:space="preserve"> </w:t>
-      </w:r>
-      <w:r>
-        <w:t xml:space="preserve">Registered.</w:t>
+        <w:t xml:space="preserve">Powers:</w:t>
+      </w:r>
+      <w:r>
+        <w:t xml:space="preserve"> </w:t>
+      </w:r>
+      <w:r>
+        <w:t xml:space="preserve">Strength IV, Flight II, Toughness I.</w:t>
       </w:r>
     </w:p>
     <w:p>
@@ -26473,6 +26825,28 @@
           <w:bCs/>
           <w:b/>
         </w:rPr>
+        <w:t xml:space="preserve">Legal status:</w:t>
+      </w:r>
+      <w:r>
+        <w:t xml:space="preserve"> </w:t>
+      </w:r>
+      <w:r>
+        <w:t xml:space="preserve">Registered.</w:t>
+      </w:r>
+    </w:p>
+    <w:p>
+      <w:pPr>
+        <w:numPr>
+          <w:ilvl w:val="0"/>
+          <w:numId w:val="1024"/>
+        </w:numPr>
+        <w:pStyle w:val="Compact"/>
+      </w:pPr>
+      <w:r>
+        <w:rPr>
+          <w:bCs/>
+          <w:b/>
+        </w:rPr>
         <w:t xml:space="preserve">Why I do this:</w:t>
       </w:r>
       <w:r>
@@ -26605,7 +26979,7 @@
         <w:t xml:space="preserve"> </w:t>
       </w:r>
       <w:r>
-        <w:t xml:space="preserve">+1 attribute point, A fine weapon or tool; a fine tool: the Lammas Grimoire, annotated in four hands (+2 Occult).</w:t>
+        <w:t xml:space="preserve">+1 attribute point, A fine weapon or tool, Stronger Power; a fine tool: the Lammas Grimoire, annotated in four hands (+2 Occult).</w:t>
       </w:r>
     </w:p>
     <w:p>
@@ -26665,7 +27039,7 @@
         <w:t xml:space="preserve"> </w:t>
       </w:r>
       <w:r>
-        <w:t xml:space="preserve">Warding II, Mystic Sight I.</w:t>
+        <w:t xml:space="preserve">Warding III, Mystic Sight I.</w:t>
       </w:r>
     </w:p>
     <w:p>
@@ -26835,7 +27209,7 @@
         <w:t xml:space="preserve"> </w:t>
       </w:r>
       <w:r>
-        <w:t xml:space="preserve">+1 attribute point.</w:t>
+        <w:t xml:space="preserve">+1 attribute point, Extra Power.</w:t>
       </w:r>
     </w:p>
     <w:p>
@@ -26895,7 +27269,7 @@
         <w:t xml:space="preserve"> </w:t>
       </w:r>
       <w:r>
-        <w:t xml:space="preserve">Psychometry II, Precognition I, Empathy I.</w:t>
+        <w:t xml:space="preserve">Psychometry II, Precognition I, Empathy I, Enhanced Senses I.</w:t>
       </w:r>
     </w:p>
     <w:p>
@@ -27086,7 +27460,7 @@
         <w:t xml:space="preserve"> </w:t>
       </w:r>
       <w:r>
-        <w:t xml:space="preserve">Extra Spark.</w:t>
+        <w:t xml:space="preserve">Extra Spark, Stronger Power.</w:t>
       </w:r>
     </w:p>
     <w:p>
@@ -27146,7 +27520,7 @@
         <w:t xml:space="preserve"> </w:t>
       </w:r>
       <w:r>
-        <w:t xml:space="preserve">Blast II, Speed I, Technopathy I.</w:t>
+        <w:t xml:space="preserve">Blast III, Speed I, Technopathy I.</w:t>
       </w:r>
     </w:p>
     <w:p>
@@ -27316,7 +27690,7 @@
         <w:t xml:space="preserve"> </w:t>
       </w:r>
       <w:r>
-        <w:t xml:space="preserve">A friend; a friend: her ExLAW handler, Agent Dorsey, who covers for her more than he should.</w:t>
+        <w:t xml:space="preserve">A friend, Extra Spark; a friend: her ExLAW handler, Agent Dorsey, who covers for her more than he should.</w:t>
       </w:r>
     </w:p>
     <w:p>
@@ -28446,6 +28820,69 @@
               <w:rPr>
                 <w:sz w:val="19"/>
               </w:rPr>
+              <w:t xml:space="preserve">4</w:t>
+            </w:r>
+          </w:p>
+        </w:tc>
+        <w:tc>
+          <w:tcPr/>
+          <w:p>
+            <w:pPr>
+              <w:pStyle w:val="Compact"/>
+              <w:jc w:val="left"/>
+            </w:pPr>
+            <w:r>
+              <w:rPr>
+                <w:sz w:val="19"/>
+              </w:rPr>
+              <w:t xml:space="preserve">None</w:t>
+            </w:r>
+          </w:p>
+        </w:tc>
+      </w:tr>
+      <w:tr>
+        <w:tc>
+          <w:tcPr/>
+          <w:p>
+            <w:pPr>
+              <w:pStyle w:val="Compact"/>
+              <w:jc w:val="left"/>
+            </w:pPr>
+            <w:r>
+              <w:rPr>
+                <w:b/>
+                <w:sz w:val="19"/>
+              </w:rPr>
+              <w:t xml:space="preserve">Adept</w:t>
+            </w:r>
+          </w:p>
+        </w:tc>
+        <w:tc>
+          <w:tcPr/>
+          <w:p>
+            <w:pPr>
+              <w:pStyle w:val="Compact"/>
+              <w:jc w:val="left"/>
+            </w:pPr>
+            <w:r>
+              <w:rPr>
+                <w:sz w:val="19"/>
+              </w:rPr>
+              <w:t xml:space="preserve">1</w:t>
+            </w:r>
+          </w:p>
+        </w:tc>
+        <w:tc>
+          <w:tcPr/>
+          <w:p>
+            <w:pPr>
+              <w:pStyle w:val="Compact"/>
+              <w:jc w:val="left"/>
+            </w:pPr>
+            <w:r>
+              <w:rPr>
+                <w:sz w:val="19"/>
+              </w:rPr>
               <w:t xml:space="preserve">3</w:t>
             </w:r>
           </w:p>
@@ -28461,6 +28898,69 @@
               <w:rPr>
                 <w:sz w:val="19"/>
               </w:rPr>
+              <w:t xml:space="preserve">Body −1, Intellect +1</w:t>
+            </w:r>
+          </w:p>
+        </w:tc>
+      </w:tr>
+      <w:tr>
+        <w:tc>
+          <w:tcPr/>
+          <w:p>
+            <w:pPr>
+              <w:pStyle w:val="Compact"/>
+              <w:jc w:val="left"/>
+            </w:pPr>
+            <w:r>
+              <w:rPr>
+                <w:b/>
+                <w:sz w:val="19"/>
+              </w:rPr>
+              <w:t xml:space="preserve">Aurora-born</w:t>
+            </w:r>
+          </w:p>
+        </w:tc>
+        <w:tc>
+          <w:tcPr/>
+          <w:p>
+            <w:pPr>
+              <w:pStyle w:val="Compact"/>
+              <w:jc w:val="left"/>
+            </w:pPr>
+            <w:r>
+              <w:rPr>
+                <w:sz w:val="19"/>
+              </w:rPr>
+              <w:t xml:space="preserve">2</w:t>
+            </w:r>
+          </w:p>
+        </w:tc>
+        <w:tc>
+          <w:tcPr/>
+          <w:p>
+            <w:pPr>
+              <w:pStyle w:val="Compact"/>
+              <w:jc w:val="left"/>
+            </w:pPr>
+            <w:r>
+              <w:rPr>
+                <w:sz w:val="19"/>
+              </w:rPr>
+              <w:t xml:space="preserve">2</w:t>
+            </w:r>
+          </w:p>
+        </w:tc>
+        <w:tc>
+          <w:tcPr/>
+          <w:p>
+            <w:pPr>
+              <w:pStyle w:val="Compact"/>
+              <w:jc w:val="left"/>
+            </w:pPr>
+            <w:r>
+              <w:rPr>
+                <w:sz w:val="19"/>
+              </w:rPr>
               <w:t xml:space="preserve">None</w:t>
             </w:r>
           </w:p>
@@ -28479,7 +28979,337 @@
                 <w:b/>
                 <w:sz w:val="19"/>
               </w:rPr>
-              <w:t xml:space="preserve">Adept</w:t>
+              <w:t xml:space="preserve">Bonded</w:t>
+            </w:r>
+          </w:p>
+        </w:tc>
+        <w:tc>
+          <w:tcPr/>
+          <w:p>
+            <w:pPr>
+              <w:pStyle w:val="Compact"/>
+              <w:jc w:val="left"/>
+            </w:pPr>
+            <w:r>
+              <w:rPr>
+                <w:sz w:val="19"/>
+              </w:rPr>
+              <w:t xml:space="preserve">2</w:t>
+            </w:r>
+          </w:p>
+        </w:tc>
+        <w:tc>
+          <w:tcPr/>
+          <w:p>
+            <w:pPr>
+              <w:pStyle w:val="Compact"/>
+              <w:jc w:val="left"/>
+            </w:pPr>
+            <w:r>
+              <w:rPr>
+                <w:sz w:val="19"/>
+              </w:rPr>
+              <w:t xml:space="preserve">2</w:t>
+            </w:r>
+          </w:p>
+        </w:tc>
+        <w:tc>
+          <w:tcPr/>
+          <w:p>
+            <w:pPr>
+              <w:pStyle w:val="Compact"/>
+              <w:jc w:val="left"/>
+            </w:pPr>
+            <w:r>
+              <w:rPr>
+                <w:sz w:val="19"/>
+              </w:rPr>
+              <w:t xml:space="preserve">Presence −1, Will +1</w:t>
+            </w:r>
+          </w:p>
+        </w:tc>
+      </w:tr>
+      <w:tr>
+        <w:tc>
+          <w:tcPr/>
+          <w:p>
+            <w:pPr>
+              <w:pStyle w:val="Compact"/>
+              <w:jc w:val="left"/>
+            </w:pPr>
+            <w:r>
+              <w:rPr>
+                <w:b/>
+                <w:sz w:val="19"/>
+              </w:rPr>
+              <w:t xml:space="preserve">Lab-made</w:t>
+            </w:r>
+          </w:p>
+        </w:tc>
+        <w:tc>
+          <w:tcPr/>
+          <w:p>
+            <w:pPr>
+              <w:pStyle w:val="Compact"/>
+              <w:jc w:val="left"/>
+            </w:pPr>
+            <w:r>
+              <w:rPr>
+                <w:sz w:val="19"/>
+              </w:rPr>
+              <w:t xml:space="preserve">2</w:t>
+            </w:r>
+          </w:p>
+        </w:tc>
+        <w:tc>
+          <w:tcPr/>
+          <w:p>
+            <w:pPr>
+              <w:pStyle w:val="Compact"/>
+              <w:jc w:val="left"/>
+            </w:pPr>
+            <w:r>
+              <w:rPr>
+                <w:sz w:val="19"/>
+              </w:rPr>
+              <w:t xml:space="preserve">2</w:t>
+            </w:r>
+          </w:p>
+        </w:tc>
+        <w:tc>
+          <w:tcPr/>
+          <w:p>
+            <w:pPr>
+              <w:pStyle w:val="Compact"/>
+              <w:jc w:val="left"/>
+            </w:pPr>
+            <w:r>
+              <w:rPr>
+                <w:sz w:val="19"/>
+              </w:rPr>
+              <w:t xml:space="preserve">Body +1, Presence −1</w:t>
+            </w:r>
+          </w:p>
+        </w:tc>
+      </w:tr>
+      <w:tr>
+        <w:tc>
+          <w:tcPr/>
+          <w:p>
+            <w:pPr>
+              <w:pStyle w:val="Compact"/>
+              <w:jc w:val="left"/>
+            </w:pPr>
+            <w:r>
+              <w:rPr>
+                <w:b/>
+                <w:sz w:val="19"/>
+              </w:rPr>
+              <w:t xml:space="preserve">Otherworlder</w:t>
+            </w:r>
+          </w:p>
+        </w:tc>
+        <w:tc>
+          <w:tcPr/>
+          <w:p>
+            <w:pPr>
+              <w:pStyle w:val="Compact"/>
+              <w:jc w:val="left"/>
+            </w:pPr>
+            <w:r>
+              <w:rPr>
+                <w:sz w:val="19"/>
+              </w:rPr>
+              <w:t xml:space="preserve">2</w:t>
+            </w:r>
+          </w:p>
+        </w:tc>
+        <w:tc>
+          <w:tcPr/>
+          <w:p>
+            <w:pPr>
+              <w:pStyle w:val="Compact"/>
+              <w:jc w:val="left"/>
+            </w:pPr>
+            <w:r>
+              <w:rPr>
+                <w:sz w:val="19"/>
+              </w:rPr>
+              <w:t xml:space="preserve">2</w:t>
+            </w:r>
+          </w:p>
+        </w:tc>
+        <w:tc>
+          <w:tcPr/>
+          <w:p>
+            <w:pPr>
+              <w:pStyle w:val="Compact"/>
+              <w:jc w:val="left"/>
+            </w:pPr>
+            <w:r>
+              <w:rPr>
+                <w:sz w:val="19"/>
+              </w:rPr>
+              <w:t xml:space="preserve">Agility +1, Will −1</w:t>
+            </w:r>
+          </w:p>
+        </w:tc>
+      </w:tr>
+      <w:tr>
+        <w:tc>
+          <w:tcPr/>
+          <w:p>
+            <w:pPr>
+              <w:pStyle w:val="Compact"/>
+              <w:jc w:val="left"/>
+            </w:pPr>
+            <w:r>
+              <w:rPr>
+                <w:b/>
+                <w:sz w:val="19"/>
+              </w:rPr>
+              <w:t xml:space="preserve">Shadow Earth Defector (GM’s permission)</w:t>
+            </w:r>
+          </w:p>
+        </w:tc>
+        <w:tc>
+          <w:tcPr/>
+          <w:p>
+            <w:pPr>
+              <w:pStyle w:val="Compact"/>
+              <w:jc w:val="left"/>
+            </w:pPr>
+            <w:r>
+              <w:rPr>
+                <w:sz w:val="19"/>
+              </w:rPr>
+              <w:t xml:space="preserve">2</w:t>
+            </w:r>
+          </w:p>
+        </w:tc>
+        <w:tc>
+          <w:tcPr/>
+          <w:p>
+            <w:pPr>
+              <w:pStyle w:val="Compact"/>
+              <w:jc w:val="left"/>
+            </w:pPr>
+            <w:r>
+              <w:rPr>
+                <w:sz w:val="19"/>
+              </w:rPr>
+              <w:t xml:space="preserve">2</w:t>
+            </w:r>
+          </w:p>
+        </w:tc>
+        <w:tc>
+          <w:tcPr/>
+          <w:p>
+            <w:pPr>
+              <w:pStyle w:val="Compact"/>
+              <w:jc w:val="left"/>
+            </w:pPr>
+            <w:r>
+              <w:rPr>
+                <w:sz w:val="19"/>
+              </w:rPr>
+              <w:t xml:space="preserve">Agility +1, Presence −1</w:t>
+            </w:r>
+          </w:p>
+        </w:tc>
+      </w:tr>
+      <w:tr>
+        <w:tc>
+          <w:tcPr/>
+          <w:p>
+            <w:pPr>
+              <w:pStyle w:val="Compact"/>
+              <w:jc w:val="left"/>
+            </w:pPr>
+            <w:r>
+              <w:rPr>
+                <w:b/>
+                <w:sz w:val="19"/>
+              </w:rPr>
+              <w:t xml:space="preserve">Touched</w:t>
+            </w:r>
+          </w:p>
+        </w:tc>
+        <w:tc>
+          <w:tcPr/>
+          <w:p>
+            <w:pPr>
+              <w:pStyle w:val="Compact"/>
+              <w:jc w:val="left"/>
+            </w:pPr>
+            <w:r>
+              <w:rPr>
+                <w:sz w:val="19"/>
+              </w:rPr>
+              <w:t xml:space="preserve">2</w:t>
+            </w:r>
+          </w:p>
+        </w:tc>
+        <w:tc>
+          <w:tcPr/>
+          <w:p>
+            <w:pPr>
+              <w:pStyle w:val="Compact"/>
+              <w:jc w:val="left"/>
+            </w:pPr>
+            <w:r>
+              <w:rPr>
+                <w:sz w:val="19"/>
+              </w:rPr>
+              <w:t xml:space="preserve">2</w:t>
+            </w:r>
+          </w:p>
+        </w:tc>
+        <w:tc>
+          <w:tcPr/>
+          <w:p>
+            <w:pPr>
+              <w:pStyle w:val="Compact"/>
+              <w:jc w:val="left"/>
+            </w:pPr>
+            <w:r>
+              <w:rPr>
+                <w:sz w:val="19"/>
+              </w:rPr>
+              <w:t xml:space="preserve">Intellect −1, Will +1</w:t>
+            </w:r>
+          </w:p>
+        </w:tc>
+      </w:tr>
+      <w:tr>
+        <w:tc>
+          <w:tcPr/>
+          <w:p>
+            <w:pPr>
+              <w:pStyle w:val="Compact"/>
+              <w:jc w:val="left"/>
+            </w:pPr>
+            <w:r>
+              <w:rPr>
+                <w:b/>
+                <w:sz w:val="19"/>
+              </w:rPr>
+              <w:t xml:space="preserve">Ambrosia</w:t>
+            </w:r>
+          </w:p>
+        </w:tc>
+        <w:tc>
+          <w:tcPr/>
+          <w:p>
+            <w:pPr>
+              <w:pStyle w:val="Compact"/>
+              <w:jc w:val="left"/>
+            </w:pPr>
+            <w:r>
+              <w:rPr>
+                <w:sz w:val="19"/>
+              </w:rPr>
+              <w:t xml:space="preserve">3</w:t>
             </w:r>
           </w:p>
         </w:tc>
@@ -28509,55 +29339,40 @@
               <w:rPr>
                 <w:sz w:val="19"/>
               </w:rPr>
-              <w:t xml:space="preserve">2</w:t>
-            </w:r>
-          </w:p>
-        </w:tc>
-        <w:tc>
-          <w:tcPr/>
-          <w:p>
-            <w:pPr>
-              <w:pStyle w:val="Compact"/>
-              <w:jc w:val="left"/>
-            </w:pPr>
-            <w:r>
-              <w:rPr>
-                <w:sz w:val="19"/>
-              </w:rPr>
-              <w:t xml:space="preserve">Body −1, Intellect +1</w:t>
-            </w:r>
-          </w:p>
-        </w:tc>
-      </w:tr>
-      <w:tr>
-        <w:tc>
-          <w:tcPr/>
-          <w:p>
-            <w:pPr>
-              <w:pStyle w:val="Compact"/>
-              <w:jc w:val="left"/>
-            </w:pPr>
-            <w:r>
-              <w:rPr>
-                <w:b/>
-                <w:sz w:val="19"/>
-              </w:rPr>
-              <w:t xml:space="preserve">Aurora-born</w:t>
-            </w:r>
-          </w:p>
-        </w:tc>
-        <w:tc>
-          <w:tcPr/>
-          <w:p>
-            <w:pPr>
-              <w:pStyle w:val="Compact"/>
-              <w:jc w:val="left"/>
-            </w:pPr>
-            <w:r>
-              <w:rPr>
-                <w:sz w:val="19"/>
-              </w:rPr>
-              <w:t xml:space="preserve">2</w:t>
+              <w:t xml:space="preserve">Body +1, Agility −1, Intellect −1, Presence +1</w:t>
+            </w:r>
+          </w:p>
+        </w:tc>
+      </w:tr>
+      <w:tr>
+        <w:tc>
+          <w:tcPr/>
+          <w:p>
+            <w:pPr>
+              <w:pStyle w:val="Compact"/>
+              <w:jc w:val="left"/>
+            </w:pPr>
+            <w:r>
+              <w:rPr>
+                <w:b/>
+                <w:sz w:val="19"/>
+              </w:rPr>
+              <w:t xml:space="preserve">Mythic</w:t>
+            </w:r>
+          </w:p>
+        </w:tc>
+        <w:tc>
+          <w:tcPr/>
+          <w:p>
+            <w:pPr>
+              <w:pStyle w:val="Compact"/>
+              <w:jc w:val="left"/>
+            </w:pPr>
+            <w:r>
+              <w:rPr>
+                <w:sz w:val="19"/>
+              </w:rPr>
+              <w:t xml:space="preserve">3</w:t>
             </w:r>
           </w:p>
         </w:tc>
@@ -28573,447 +29388,6 @@
                 <w:sz w:val="19"/>
               </w:rPr>
               <w:t xml:space="preserve">1</w:t>
-            </w:r>
-          </w:p>
-        </w:tc>
-        <w:tc>
-          <w:tcPr/>
-          <w:p>
-            <w:pPr>
-              <w:pStyle w:val="Compact"/>
-              <w:jc w:val="left"/>
-            </w:pPr>
-            <w:r>
-              <w:rPr>
-                <w:sz w:val="19"/>
-              </w:rPr>
-              <w:t xml:space="preserve">None</w:t>
-            </w:r>
-          </w:p>
-        </w:tc>
-      </w:tr>
-      <w:tr>
-        <w:tc>
-          <w:tcPr/>
-          <w:p>
-            <w:pPr>
-              <w:pStyle w:val="Compact"/>
-              <w:jc w:val="left"/>
-            </w:pPr>
-            <w:r>
-              <w:rPr>
-                <w:b/>
-                <w:sz w:val="19"/>
-              </w:rPr>
-              <w:t xml:space="preserve">Bonded</w:t>
-            </w:r>
-          </w:p>
-        </w:tc>
-        <w:tc>
-          <w:tcPr/>
-          <w:p>
-            <w:pPr>
-              <w:pStyle w:val="Compact"/>
-              <w:jc w:val="left"/>
-            </w:pPr>
-            <w:r>
-              <w:rPr>
-                <w:sz w:val="19"/>
-              </w:rPr>
-              <w:t xml:space="preserve">2</w:t>
-            </w:r>
-          </w:p>
-        </w:tc>
-        <w:tc>
-          <w:tcPr/>
-          <w:p>
-            <w:pPr>
-              <w:pStyle w:val="Compact"/>
-              <w:jc w:val="left"/>
-            </w:pPr>
-            <w:r>
-              <w:rPr>
-                <w:sz w:val="19"/>
-              </w:rPr>
-              <w:t xml:space="preserve">1</w:t>
-            </w:r>
-          </w:p>
-        </w:tc>
-        <w:tc>
-          <w:tcPr/>
-          <w:p>
-            <w:pPr>
-              <w:pStyle w:val="Compact"/>
-              <w:jc w:val="left"/>
-            </w:pPr>
-            <w:r>
-              <w:rPr>
-                <w:sz w:val="19"/>
-              </w:rPr>
-              <w:t xml:space="preserve">Presence −1, Will +1</w:t>
-            </w:r>
-          </w:p>
-        </w:tc>
-      </w:tr>
-      <w:tr>
-        <w:tc>
-          <w:tcPr/>
-          <w:p>
-            <w:pPr>
-              <w:pStyle w:val="Compact"/>
-              <w:jc w:val="left"/>
-            </w:pPr>
-            <w:r>
-              <w:rPr>
-                <w:b/>
-                <w:sz w:val="19"/>
-              </w:rPr>
-              <w:t xml:space="preserve">Lab-made</w:t>
-            </w:r>
-          </w:p>
-        </w:tc>
-        <w:tc>
-          <w:tcPr/>
-          <w:p>
-            <w:pPr>
-              <w:pStyle w:val="Compact"/>
-              <w:jc w:val="left"/>
-            </w:pPr>
-            <w:r>
-              <w:rPr>
-                <w:sz w:val="19"/>
-              </w:rPr>
-              <w:t xml:space="preserve">2</w:t>
-            </w:r>
-          </w:p>
-        </w:tc>
-        <w:tc>
-          <w:tcPr/>
-          <w:p>
-            <w:pPr>
-              <w:pStyle w:val="Compact"/>
-              <w:jc w:val="left"/>
-            </w:pPr>
-            <w:r>
-              <w:rPr>
-                <w:sz w:val="19"/>
-              </w:rPr>
-              <w:t xml:space="preserve">1</w:t>
-            </w:r>
-          </w:p>
-        </w:tc>
-        <w:tc>
-          <w:tcPr/>
-          <w:p>
-            <w:pPr>
-              <w:pStyle w:val="Compact"/>
-              <w:jc w:val="left"/>
-            </w:pPr>
-            <w:r>
-              <w:rPr>
-                <w:sz w:val="19"/>
-              </w:rPr>
-              <w:t xml:space="preserve">Body +1, Presence −1</w:t>
-            </w:r>
-          </w:p>
-        </w:tc>
-      </w:tr>
-      <w:tr>
-        <w:tc>
-          <w:tcPr/>
-          <w:p>
-            <w:pPr>
-              <w:pStyle w:val="Compact"/>
-              <w:jc w:val="left"/>
-            </w:pPr>
-            <w:r>
-              <w:rPr>
-                <w:b/>
-                <w:sz w:val="19"/>
-              </w:rPr>
-              <w:t xml:space="preserve">Otherworlder</w:t>
-            </w:r>
-          </w:p>
-        </w:tc>
-        <w:tc>
-          <w:tcPr/>
-          <w:p>
-            <w:pPr>
-              <w:pStyle w:val="Compact"/>
-              <w:jc w:val="left"/>
-            </w:pPr>
-            <w:r>
-              <w:rPr>
-                <w:sz w:val="19"/>
-              </w:rPr>
-              <w:t xml:space="preserve">2</w:t>
-            </w:r>
-          </w:p>
-        </w:tc>
-        <w:tc>
-          <w:tcPr/>
-          <w:p>
-            <w:pPr>
-              <w:pStyle w:val="Compact"/>
-              <w:jc w:val="left"/>
-            </w:pPr>
-            <w:r>
-              <w:rPr>
-                <w:sz w:val="19"/>
-              </w:rPr>
-              <w:t xml:space="preserve">1</w:t>
-            </w:r>
-          </w:p>
-        </w:tc>
-        <w:tc>
-          <w:tcPr/>
-          <w:p>
-            <w:pPr>
-              <w:pStyle w:val="Compact"/>
-              <w:jc w:val="left"/>
-            </w:pPr>
-            <w:r>
-              <w:rPr>
-                <w:sz w:val="19"/>
-              </w:rPr>
-              <w:t xml:space="preserve">Agility +1, Will −1</w:t>
-            </w:r>
-          </w:p>
-        </w:tc>
-      </w:tr>
-      <w:tr>
-        <w:tc>
-          <w:tcPr/>
-          <w:p>
-            <w:pPr>
-              <w:pStyle w:val="Compact"/>
-              <w:jc w:val="left"/>
-            </w:pPr>
-            <w:r>
-              <w:rPr>
-                <w:b/>
-                <w:sz w:val="19"/>
-              </w:rPr>
-              <w:t xml:space="preserve">Shadow Earth Defector (GM’s permission)</w:t>
-            </w:r>
-          </w:p>
-        </w:tc>
-        <w:tc>
-          <w:tcPr/>
-          <w:p>
-            <w:pPr>
-              <w:pStyle w:val="Compact"/>
-              <w:jc w:val="left"/>
-            </w:pPr>
-            <w:r>
-              <w:rPr>
-                <w:sz w:val="19"/>
-              </w:rPr>
-              <w:t xml:space="preserve">2</w:t>
-            </w:r>
-          </w:p>
-        </w:tc>
-        <w:tc>
-          <w:tcPr/>
-          <w:p>
-            <w:pPr>
-              <w:pStyle w:val="Compact"/>
-              <w:jc w:val="left"/>
-            </w:pPr>
-            <w:r>
-              <w:rPr>
-                <w:sz w:val="19"/>
-              </w:rPr>
-              <w:t xml:space="preserve">1</w:t>
-            </w:r>
-          </w:p>
-        </w:tc>
-        <w:tc>
-          <w:tcPr/>
-          <w:p>
-            <w:pPr>
-              <w:pStyle w:val="Compact"/>
-              <w:jc w:val="left"/>
-            </w:pPr>
-            <w:r>
-              <w:rPr>
-                <w:sz w:val="19"/>
-              </w:rPr>
-              <w:t xml:space="preserve">Agility +1, Presence −1</w:t>
-            </w:r>
-          </w:p>
-        </w:tc>
-      </w:tr>
-      <w:tr>
-        <w:tc>
-          <w:tcPr/>
-          <w:p>
-            <w:pPr>
-              <w:pStyle w:val="Compact"/>
-              <w:jc w:val="left"/>
-            </w:pPr>
-            <w:r>
-              <w:rPr>
-                <w:b/>
-                <w:sz w:val="19"/>
-              </w:rPr>
-              <w:t xml:space="preserve">Touched</w:t>
-            </w:r>
-          </w:p>
-        </w:tc>
-        <w:tc>
-          <w:tcPr/>
-          <w:p>
-            <w:pPr>
-              <w:pStyle w:val="Compact"/>
-              <w:jc w:val="left"/>
-            </w:pPr>
-            <w:r>
-              <w:rPr>
-                <w:sz w:val="19"/>
-              </w:rPr>
-              <w:t xml:space="preserve">2</w:t>
-            </w:r>
-          </w:p>
-        </w:tc>
-        <w:tc>
-          <w:tcPr/>
-          <w:p>
-            <w:pPr>
-              <w:pStyle w:val="Compact"/>
-              <w:jc w:val="left"/>
-            </w:pPr>
-            <w:r>
-              <w:rPr>
-                <w:sz w:val="19"/>
-              </w:rPr>
-              <w:t xml:space="preserve">1</w:t>
-            </w:r>
-          </w:p>
-        </w:tc>
-        <w:tc>
-          <w:tcPr/>
-          <w:p>
-            <w:pPr>
-              <w:pStyle w:val="Compact"/>
-              <w:jc w:val="left"/>
-            </w:pPr>
-            <w:r>
-              <w:rPr>
-                <w:sz w:val="19"/>
-              </w:rPr>
-              <w:t xml:space="preserve">Intellect −1, Will +1</w:t>
-            </w:r>
-          </w:p>
-        </w:tc>
-      </w:tr>
-      <w:tr>
-        <w:tc>
-          <w:tcPr/>
-          <w:p>
-            <w:pPr>
-              <w:pStyle w:val="Compact"/>
-              <w:jc w:val="left"/>
-            </w:pPr>
-            <w:r>
-              <w:rPr>
-                <w:b/>
-                <w:sz w:val="19"/>
-              </w:rPr>
-              <w:t xml:space="preserve">Ambrosia</w:t>
-            </w:r>
-          </w:p>
-        </w:tc>
-        <w:tc>
-          <w:tcPr/>
-          <w:p>
-            <w:pPr>
-              <w:pStyle w:val="Compact"/>
-              <w:jc w:val="left"/>
-            </w:pPr>
-            <w:r>
-              <w:rPr>
-                <w:sz w:val="19"/>
-              </w:rPr>
-              <w:t xml:space="preserve">3</w:t>
-            </w:r>
-          </w:p>
-        </w:tc>
-        <w:tc>
-          <w:tcPr/>
-          <w:p>
-            <w:pPr>
-              <w:pStyle w:val="Compact"/>
-              <w:jc w:val="left"/>
-            </w:pPr>
-            <w:r>
-              <w:rPr>
-                <w:sz w:val="19"/>
-              </w:rPr>
-              <w:t xml:space="preserve">0</w:t>
-            </w:r>
-          </w:p>
-        </w:tc>
-        <w:tc>
-          <w:tcPr/>
-          <w:p>
-            <w:pPr>
-              <w:pStyle w:val="Compact"/>
-              <w:jc w:val="left"/>
-            </w:pPr>
-            <w:r>
-              <w:rPr>
-                <w:sz w:val="19"/>
-              </w:rPr>
-              <w:t xml:space="preserve">Body +1, Agility −1, Intellect −1, Presence +1</w:t>
-            </w:r>
-          </w:p>
-        </w:tc>
-      </w:tr>
-      <w:tr>
-        <w:tc>
-          <w:tcPr/>
-          <w:p>
-            <w:pPr>
-              <w:pStyle w:val="Compact"/>
-              <w:jc w:val="left"/>
-            </w:pPr>
-            <w:r>
-              <w:rPr>
-                <w:b/>
-                <w:sz w:val="19"/>
-              </w:rPr>
-              <w:t xml:space="preserve">Mythic</w:t>
-            </w:r>
-          </w:p>
-        </w:tc>
-        <w:tc>
-          <w:tcPr/>
-          <w:p>
-            <w:pPr>
-              <w:pStyle w:val="Compact"/>
-              <w:jc w:val="left"/>
-            </w:pPr>
-            <w:r>
-              <w:rPr>
-                <w:sz w:val="19"/>
-              </w:rPr>
-              <w:t xml:space="preserve">3</w:t>
-            </w:r>
-          </w:p>
-        </w:tc>
-        <w:tc>
-          <w:tcPr/>
-          <w:p>
-            <w:pPr>
-              <w:pStyle w:val="Compact"/>
-              <w:jc w:val="left"/>
-            </w:pPr>
-            <w:r>
-              <w:rPr>
-                <w:sz w:val="19"/>
-              </w:rPr>
-              <w:t xml:space="preserve">0</w:t>
             </w:r>
           </w:p>
         </w:tc>
@@ -29052,7 +29426,7 @@
           <w:iCs/>
           <w:i/>
         </w:rPr>
-        <w:t xml:space="preserve">Tier 0 · 3 Edges · None</w:t>
+        <w:t xml:space="preserve">Tier 0 · 4 Edges · None</w:t>
       </w:r>
     </w:p>
     <w:p>
@@ -29402,7 +29776,7 @@
           <w:iCs/>
           <w:i/>
         </w:rPr>
-        <w:t xml:space="preserve">Tier 1 · 2 Edges · Body −1, Intellect +1</w:t>
+        <w:t xml:space="preserve">Tier 1 · 3 Edges · Body −1, Intellect +1</w:t>
       </w:r>
     </w:p>
     <w:p>
@@ -29764,7 +30138,7 @@
           <w:iCs/>
           <w:i/>
         </w:rPr>
-        <w:t xml:space="preserve">Tier 2 · 1 Edge · None</w:t>
+        <w:t xml:space="preserve">Tier 2 · 2 Edges · None</w:t>
       </w:r>
     </w:p>
     <w:p>
@@ -30114,7 +30488,7 @@
           <w:iCs/>
           <w:i/>
         </w:rPr>
-        <w:t xml:space="preserve">Tier 2 · 1 Edge · Presence −1, Will +1</w:t>
+        <w:t xml:space="preserve">Tier 2 · 2 Edges · Presence −1, Will +1</w:t>
       </w:r>
     </w:p>
     <w:p>
@@ -30476,7 +30850,7 @@
           <w:iCs/>
           <w:i/>
         </w:rPr>
-        <w:t xml:space="preserve">Tier 2 · 1 Edge · Body +1, Presence −1</w:t>
+        <w:t xml:space="preserve">Tier 2 · 2 Edges · Body +1, Presence −1</w:t>
       </w:r>
     </w:p>
     <w:p>
@@ -30826,7 +31200,7 @@
           <w:iCs/>
           <w:i/>
         </w:rPr>
-        <w:t xml:space="preserve">Tier 2 · 1 Edge · Agility +1, Will −1</w:t>
+        <w:t xml:space="preserve">Tier 2 · 2 Edges · Agility +1, Will −1</w:t>
       </w:r>
     </w:p>
     <w:p>
@@ -31176,7 +31550,7 @@
           <w:iCs/>
           <w:i/>
         </w:rPr>
-        <w:t xml:space="preserve">Tier 2 · 1 Edge · Agility +1, Presence −1 · GM’s permission</w:t>
+        <w:t xml:space="preserve">Tier 2 · 2 Edges · Agility +1, Presence −1 · GM’s permission</w:t>
       </w:r>
     </w:p>
     <w:p>
@@ -31538,7 +31912,7 @@
           <w:iCs/>
           <w:i/>
         </w:rPr>
-        <w:t xml:space="preserve">Tier 2 · 1 Edge · Intellect −1, Will +1</w:t>
+        <w:t xml:space="preserve">Tier 2 · 2 Edges · Intellect −1, Will +1</w:t>
       </w:r>
     </w:p>
     <w:p>
@@ -31903,7 +32277,7 @@
           <w:iCs/>
           <w:i/>
         </w:rPr>
-        <w:t xml:space="preserve">Tier 3 · 0 Edges · Body +1, Agility −1, Intellect −1, Presence +1</w:t>
+        <w:t xml:space="preserve">Tier 3 · 1 Edge · Body +1, Agility −1, Intellect −1, Presence +1</w:t>
       </w:r>
     </w:p>
     <w:p>
@@ -32265,7 +32639,7 @@
           <w:iCs/>
           <w:i/>
         </w:rPr>
-        <w:t xml:space="preserve">Tier 3 · 0 Edges · Body +1, Intellect −1, Presence −1, Will +1</w:t>
+        <w:t xml:space="preserve">Tier 3 · 1 Edge · Body +1, Intellect −1, Presence −1, Will +1</w:t>
       </w:r>
     </w:p>
     <w:p>
@@ -32869,7 +33243,7 @@
         <w:pStyle w:val="FirstParagraph"/>
       </w:pPr>
       <w:r>
-        <w:t xml:space="preserve">The tier measures how much the origin gives on its own. Each tier costs one of your 3 Edge points, so stronger origins start with fewer Edges.</w:t>
+        <w:t xml:space="preserve">The tier measures how much the origin gives on its own. Each tier costs one of your 4 Edge points, so stronger origins start with fewer Edges.</w:t>
       </w:r>
     </w:p>
     <w:tbl>
@@ -34268,7 +34642,7 @@
         <w:t xml:space="preserve"> </w:t>
       </w:r>
       <w:r>
-        <w:t xml:space="preserve">attributes start at 10, adjusted by origin (always totaling zero), plus 5 points; maximum 13 plus any origin bonus. 3 points split between origin tier and Edges. Generalist: one Specialty and nine Trained. Specialist: one Expert at +5 and seven Trained. One advantage (general or origin) and one complication; an optional Allegiance.</w:t>
+        <w:t xml:space="preserve">attributes start at 10, adjusted by origin (always totaling zero), plus 5 points; maximum 13 plus any origin bonus. 4 points split between origin tier and Edges. Generalist: one Specialty and nine Trained. Specialist: one Expert at +5 and seven Trained. One advantage (general or origin) and one complication; an optional Allegiance.</w:t>
       </w:r>
     </w:p>
     <w:p>

</xml_diff>

<commit_message>
Aurora: Cantrips, a power that grants quick spells working at its Class (2-5 known), failed casts mark Strain
Co-Authored-By: Claude Opus 5.5 <noreply@anthropic.com>
Claude-Session: https://claude.ai/code/session_015SADCFzhKijkC2foUmXrpC
</commit_message>
<xml_diff>
--- a/legend-dynamics/aurora/Aurora_Players_Guide.docx
+++ b/legend-dynamics/aurora/Aurora_Players_Guide.docx
@@ -16150,7 +16150,7 @@
     </w:p>
     <w:bookmarkEnd w:id="81"/>
     <w:bookmarkEnd w:id="82"/>
-    <w:bookmarkStart w:id="96" w:name="powers"/>
+    <w:bookmarkStart w:id="97" w:name="powers"/>
     <w:p>
       <w:pPr>
         <w:pStyle w:val="Heading1"/>
@@ -20426,6 +20426,84 @@
                 <w:b/>
                 <w:sz w:val="19"/>
               </w:rPr>
+              <w:t xml:space="preserve">Cantrips</w:t>
+            </w:r>
+            <w:r>
+              <w:rPr>
+                <w:b/>
+                <w:sz w:val="19"/>
+              </w:rPr>
+              <w:t xml:space="preserve"> </w:t>
+            </w:r>
+            <w:r>
+              <w:rPr>
+                <w:b/>
+                <w:sz w:val="19"/>
+              </w:rPr>
+              <w:t xml:space="preserve">(quick spells; a failed cast marks Strain)</w:t>
+            </w:r>
+          </w:p>
+        </w:tc>
+        <w:tc>
+          <w:tcPr/>
+          <w:p>
+            <w:pPr>
+              <w:pStyle w:val="Compact"/>
+              <w:jc w:val="left"/>
+            </w:pPr>
+            <w:r>
+              <w:rPr>
+                <w:sz w:val="19"/>
+              </w:rPr>
+              <w:t xml:space="preserve">Know 2 cantrips: quick spells cast in one action, each working at Class I.</w:t>
+            </w:r>
+          </w:p>
+        </w:tc>
+        <w:tc>
+          <w:tcPr/>
+          <w:p>
+            <w:pPr>
+              <w:pStyle w:val="Compact"/>
+              <w:jc w:val="left"/>
+            </w:pPr>
+            <w:r>
+              <w:rPr>
+                <w:sz w:val="19"/>
+              </w:rPr>
+              <w:t xml:space="preserve">Know 3 cantrips, each working at Class II.</w:t>
+            </w:r>
+          </w:p>
+        </w:tc>
+        <w:tc>
+          <w:tcPr/>
+          <w:p>
+            <w:pPr>
+              <w:pStyle w:val="Compact"/>
+              <w:jc w:val="left"/>
+            </w:pPr>
+            <w:r>
+              <w:rPr>
+                <w:sz w:val="19"/>
+              </w:rPr>
+              <w:t xml:space="preserve">Know 4 cantrips, each working at Class III.</w:t>
+            </w:r>
+          </w:p>
+        </w:tc>
+      </w:tr>
+      <w:tr>
+        <w:tc>
+          <w:tcPr/>
+          <w:p>
+            <w:pPr>
+              <w:pStyle w:val="Compact"/>
+              <w:jc w:val="left"/>
+            </w:pPr>
+            <w:r>
+              <w:rPr>
+                <w:bCs/>
+                <w:b/>
+                <w:sz w:val="19"/>
+              </w:rPr>
               <w:t xml:space="preserve">Teleport</w:t>
             </w:r>
           </w:p>
@@ -21308,7 +21386,7 @@
         <w:pStyle w:val="FirstParagraph"/>
       </w:pPr>
       <w:r>
-        <w:t xml:space="preserve">Most powers simply go further at Classes IV to VI. Speed, Flight, Super Leaping and Teleport have set limits at every Class: speeds in multiples of the speed of sound (Mach 1 is about 760 mph), and distances in feet and miles. Player characters reach these Classes only by pushing (one action, one box of Strain); the GM’s characters may have them outright.</w:t>
+        <w:t xml:space="preserve">Most powers simply go further at Classes IV to VI. Speed, Flight, Super Leaping, Cantrips and Teleport have set limits at every Class: speeds in multiples of the speed of sound (Mach 1 is about 760 mph), and distances in feet and miles. Player characters reach these Classes only by pushing (one action, one box of Strain); the GM’s characters may have them outright.</w:t>
       </w:r>
     </w:p>
     <w:tbl>
@@ -21615,6 +21693,70 @@
                 <w:b/>
                 <w:sz w:val="19"/>
               </w:rPr>
+              <w:t xml:space="preserve">Cantrips</w:t>
+            </w:r>
+          </w:p>
+        </w:tc>
+        <w:tc>
+          <w:tcPr/>
+          <w:p>
+            <w:pPr>
+              <w:pStyle w:val="Compact"/>
+              <w:jc w:val="left"/>
+            </w:pPr>
+            <w:r>
+              <w:rPr>
+                <w:sz w:val="19"/>
+              </w:rPr>
+              <w:t xml:space="preserve">Know 5 cantrips, each working at Class IV.</w:t>
+            </w:r>
+          </w:p>
+        </w:tc>
+        <w:tc>
+          <w:tcPr/>
+          <w:p>
+            <w:pPr>
+              <w:pStyle w:val="Compact"/>
+              <w:jc w:val="left"/>
+            </w:pPr>
+            <w:r>
+              <w:rPr>
+                <w:sz w:val="19"/>
+              </w:rPr>
+              <w:t xml:space="preserve">Know 6 cantrips, each working at Class V.</w:t>
+            </w:r>
+          </w:p>
+        </w:tc>
+        <w:tc>
+          <w:tcPr/>
+          <w:p>
+            <w:pPr>
+              <w:pStyle w:val="Compact"/>
+              <w:jc w:val="left"/>
+            </w:pPr>
+            <w:r>
+              <w:rPr>
+                <w:sz w:val="19"/>
+              </w:rPr>
+              <w:t xml:space="preserve">Know 7 cantrips, each working at Class VI.</w:t>
+            </w:r>
+          </w:p>
+        </w:tc>
+      </w:tr>
+      <w:tr>
+        <w:tc>
+          <w:tcPr/>
+          <w:p>
+            <w:pPr>
+              <w:pStyle w:val="Compact"/>
+              <w:jc w:val="left"/>
+            </w:pPr>
+            <w:r>
+              <w:rPr>
+                <w:bCs/>
+                <w:b/>
+                <w:sz w:val="19"/>
+              </w:rPr>
               <w:t xml:space="preserve">Teleport</w:t>
             </w:r>
           </w:p>
@@ -21721,13 +21863,13 @@
       </w:r>
     </w:p>
     <w:bookmarkEnd w:id="92"/>
-    <w:bookmarkStart w:id="93" w:name="rituals"/>
+    <w:bookmarkStart w:id="93" w:name="cantrips"/>
     <w:p>
       <w:pPr>
         <w:pStyle w:val="Heading2"/>
       </w:pPr>
       <w:r>
-        <w:t xml:space="preserve">Rituals</w:t>
+        <w:t xml:space="preserve">Cantrips</w:t>
       </w:r>
     </w:p>
     <w:p>
@@ -21735,22 +21877,218 @@
         <w:pStyle w:val="FirstParagraph"/>
       </w:pPr>
       <w:r>
-        <w:t xml:space="preserve">Adepts can</w:t>
-      </w:r>
-      <w:r>
-        <w:t xml:space="preserve"> </w:t>
-      </w:r>
-      <w:r>
-        <w:rPr>
-          <w:bCs/>
-          <w:b/>
-        </w:rPr>
-        <w:t xml:space="preserve">emulate any power by ritual</w:t>
-      </w:r>
-      <w:r>
-        <w:t xml:space="preserve">, at any Class up to their own highest.</w:t>
-      </w:r>
-    </w:p>
+        <w:t xml:space="preserve">Comic-book magic is fast: a bolt, a shield, a binding, in a single panel.</w:t>
+      </w:r>
+      <w:r>
+        <w:t xml:space="preserve"> </w:t>
+      </w:r>
+      <w:r>
+        <w:rPr>
+          <w:bCs/>
+          <w:b/>
+        </w:rPr>
+        <w:t xml:space="preserve">Cantrips</w:t>
+      </w:r>
+      <w:r>
+        <w:t xml:space="preserve"> </w:t>
+      </w:r>
+      <w:r>
+        <w:t xml:space="preserve">is a power for that. Instead of one effect, it gives you a few quick spells, and each one works at the power’s Class.</w:t>
+      </w:r>
+    </w:p>
+    <w:tbl>
+      <w:tblPr>
+        <w:tblStyle w:val="Table"/>
+        <w:tblW w:type="auto" w:w="0"/>
+        <w:tblLook w:firstRow="1" w:lastRow="0" w:firstColumn="0" w:lastColumn="0" w:noHBand="0" w:noVBand="0" w:val="0020"/>
+        <w:jc w:val="start"/>
+        <w:tblBorders>
+          <w:top w:val="single" w:sz="4" w:color="B8C2D3"/>
+          <w:left w:val="single" w:sz="4" w:color="B8C2D3"/>
+          <w:bottom w:val="single" w:sz="4" w:color="B8C2D3"/>
+          <w:right w:val="single" w:sz="4" w:color="B8C2D3"/>
+          <w:insideH w:val="single" w:sz="4" w:color="B8C2D3"/>
+          <w:insideV w:val="single" w:sz="4" w:color="B8C2D3"/>
+        </w:tblBorders>
+      </w:tblPr>
+      <w:tblGrid>
+        <w:gridCol w:w="3960"/>
+        <w:gridCol w:w="3960"/>
+      </w:tblGrid>
+      <w:tr>
+        <w:trPr>
+          <w:tblHeader w:val="true"/>
+        </w:trPr>
+        <w:tc>
+          <w:tcPr>
+            <w:shd w:val="clear" w:fill="E8EEF8"/>
+          </w:tcPr>
+          <w:p>
+            <w:pPr>
+              <w:pStyle w:val="Compact"/>
+              <w:jc w:val="left"/>
+            </w:pPr>
+            <w:r>
+              <w:rPr>
+                <w:b/>
+                <w:sz w:val="19"/>
+              </w:rPr>
+              <w:t xml:space="preserve">Cantrips Class</w:t>
+            </w:r>
+          </w:p>
+        </w:tc>
+        <w:tc>
+          <w:tcPr>
+            <w:shd w:val="clear" w:fill="E8EEF8"/>
+          </w:tcPr>
+          <w:p>
+            <w:pPr>
+              <w:pStyle w:val="Compact"/>
+              <w:jc w:val="left"/>
+            </w:pPr>
+            <w:r>
+              <w:rPr>
+                <w:b/>
+                <w:sz w:val="19"/>
+              </w:rPr>
+              <w:t xml:space="preserve">Cantrips known</w:t>
+            </w:r>
+          </w:p>
+        </w:tc>
+      </w:tr>
+      <w:tr>
+        <w:tc>
+          <w:tcPr/>
+          <w:p>
+            <w:pPr>
+              <w:pStyle w:val="Compact"/>
+              <w:jc w:val="left"/>
+            </w:pPr>
+            <w:r>
+              <w:rPr>
+                <w:b/>
+                <w:sz w:val="19"/>
+              </w:rPr>
+              <w:t xml:space="preserve">I</w:t>
+            </w:r>
+          </w:p>
+        </w:tc>
+        <w:tc>
+          <w:tcPr/>
+          <w:p>
+            <w:pPr>
+              <w:pStyle w:val="Compact"/>
+              <w:jc w:val="left"/>
+            </w:pPr>
+            <w:r>
+              <w:rPr>
+                <w:sz w:val="19"/>
+              </w:rPr>
+              <w:t xml:space="preserve">2</w:t>
+            </w:r>
+          </w:p>
+        </w:tc>
+      </w:tr>
+      <w:tr>
+        <w:tc>
+          <w:tcPr/>
+          <w:p>
+            <w:pPr>
+              <w:pStyle w:val="Compact"/>
+              <w:jc w:val="left"/>
+            </w:pPr>
+            <w:r>
+              <w:rPr>
+                <w:b/>
+                <w:sz w:val="19"/>
+              </w:rPr>
+              <w:t xml:space="preserve">II</w:t>
+            </w:r>
+          </w:p>
+        </w:tc>
+        <w:tc>
+          <w:tcPr/>
+          <w:p>
+            <w:pPr>
+              <w:pStyle w:val="Compact"/>
+              <w:jc w:val="left"/>
+            </w:pPr>
+            <w:r>
+              <w:rPr>
+                <w:sz w:val="19"/>
+              </w:rPr>
+              <w:t xml:space="preserve">3</w:t>
+            </w:r>
+          </w:p>
+        </w:tc>
+      </w:tr>
+      <w:tr>
+        <w:tc>
+          <w:tcPr/>
+          <w:p>
+            <w:pPr>
+              <w:pStyle w:val="Compact"/>
+              <w:jc w:val="left"/>
+            </w:pPr>
+            <w:r>
+              <w:rPr>
+                <w:b/>
+                <w:sz w:val="19"/>
+              </w:rPr>
+              <w:t xml:space="preserve">III</w:t>
+            </w:r>
+          </w:p>
+        </w:tc>
+        <w:tc>
+          <w:tcPr/>
+          <w:p>
+            <w:pPr>
+              <w:pStyle w:val="Compact"/>
+              <w:jc w:val="left"/>
+            </w:pPr>
+            <w:r>
+              <w:rPr>
+                <w:sz w:val="19"/>
+              </w:rPr>
+              <w:t xml:space="preserve">4</w:t>
+            </w:r>
+          </w:p>
+        </w:tc>
+      </w:tr>
+      <w:tr>
+        <w:tc>
+          <w:tcPr/>
+          <w:p>
+            <w:pPr>
+              <w:pStyle w:val="Compact"/>
+              <w:jc w:val="left"/>
+            </w:pPr>
+            <w:r>
+              <w:rPr>
+                <w:b/>
+                <w:sz w:val="19"/>
+              </w:rPr>
+              <w:t xml:space="preserve">IV (GM’s approval)</w:t>
+            </w:r>
+          </w:p>
+        </w:tc>
+        <w:tc>
+          <w:tcPr/>
+          <w:p>
+            <w:pPr>
+              <w:pStyle w:val="Compact"/>
+              <w:jc w:val="left"/>
+            </w:pPr>
+            <w:r>
+              <w:rPr>
+                <w:sz w:val="19"/>
+              </w:rPr>
+              <w:t xml:space="preserve">5</w:t>
+            </w:r>
+          </w:p>
+        </w:tc>
+      </w:tr>
+    </w:tbl>
     <w:p>
       <w:pPr>
         <w:numPr>
@@ -21764,13 +22102,13 @@
           <w:bCs/>
           <w:b/>
         </w:rPr>
-        <w:t xml:space="preserve">Time:</w:t>
-      </w:r>
-      <w:r>
-        <w:t xml:space="preserve"> </w:t>
-      </w:r>
-      <w:r>
-        <w:t xml:space="preserve">Class I takes ten minutes, Class II an hour, Class III a night. A ritual can’t be done in the middle of a fight.</w:t>
+        <w:t xml:space="preserve">Casting:</w:t>
+      </w:r>
+      <w:r>
+        <w:t xml:space="preserve"> </w:t>
+      </w:r>
+      <w:r>
+        <w:t xml:space="preserve">one action and a Powers roll; the target resists with Dodge, Body or Will where it makes sense.</w:t>
       </w:r>
     </w:p>
     <w:p>
@@ -21786,13 +22124,26 @@
           <w:bCs/>
           <w:b/>
         </w:rPr>
-        <w:t xml:space="preserve">The roll:</w:t>
-      </w:r>
-      <w:r>
-        <w:t xml:space="preserve"> </w:t>
-      </w:r>
-      <w:r>
-        <w:t xml:space="preserve">Powers, at −2 for Class II and −4 for Class III.</w:t>
+        <w:t xml:space="preserve">The price of versatility:</w:t>
+      </w:r>
+      <w:r>
+        <w:t xml:space="preserve"> </w:t>
+      </w:r>
+      <w:r>
+        <w:t xml:space="preserve">a failed cast marks a box of</w:t>
+      </w:r>
+      <w:r>
+        <w:t xml:space="preserve"> </w:t>
+      </w:r>
+      <w:r>
+        <w:rPr>
+          <w:bCs/>
+          <w:b/>
+        </w:rPr>
+        <w:t xml:space="preserve">Strain</w:t>
+      </w:r>
+      <w:r>
+        <w:t xml:space="preserve">, which other powers don’t.</w:t>
       </w:r>
     </w:p>
     <w:p>
@@ -21808,13 +22159,13 @@
           <w:bCs/>
           <w:b/>
         </w:rPr>
-        <w:t xml:space="preserve">Effect:</w:t>
-      </w:r>
-      <w:r>
-        <w:t xml:space="preserve"> </w:t>
-      </w:r>
-      <w:r>
-        <w:t xml:space="preserve">the power works once, or for one scene, as the GM judges, and can be cast on someone else.</w:t>
+        <w:t xml:space="preserve">Growing:</w:t>
+      </w:r>
+      <w:r>
+        <w:t xml:space="preserve"> </w:t>
+      </w:r>
+      <w:r>
+        <w:t xml:space="preserve">pushing, Stronger Power and growth in play all work as usual; each Class higher teaches you another cantrip and strengthens them all.</w:t>
       </w:r>
     </w:p>
     <w:p>
@@ -21830,13 +22181,13 @@
           <w:bCs/>
           <w:b/>
         </w:rPr>
-        <w:t xml:space="preserve">Cost:</w:t>
-      </w:r>
-      <w:r>
-        <w:t xml:space="preserve"> </w:t>
-      </w:r>
-      <w:r>
-        <w:t xml:space="preserve">a failed ritual marks a box of Strain. A natural 18 means something answered that shouldn’t have.</w:t>
+        <w:t xml:space="preserve">Who:</w:t>
+      </w:r>
+      <w:r>
+        <w:t xml:space="preserve"> </w:t>
+      </w:r>
+      <w:r>
+        <w:t xml:space="preserve">Cantrips is on the Adept’s mystic list. Other origins can take it with a magical reason: a Bonded artifact, a Mythic heritage, a Touched vision.</w:t>
       </w:r>
     </w:p>
     <w:p>
@@ -21844,6 +22195,638 @@
         <w:numPr>
           <w:ilvl w:val="0"/>
           <w:numId w:val="1018"/>
+        </w:numPr>
+        <w:pStyle w:val="Compact"/>
+      </w:pPr>
+      <w:r>
+        <w:rPr>
+          <w:bCs/>
+          <w:b/>
+        </w:rPr>
+        <w:t xml:space="preserve">Changing:</w:t>
+      </w:r>
+      <w:r>
+        <w:t xml:space="preserve"> </w:t>
+      </w:r>
+      <w:r>
+        <w:t xml:space="preserve">between cases, swap one cantrip for another with a week of study.</w:t>
+      </w:r>
+    </w:p>
+    <w:tbl>
+      <w:tblPr>
+        <w:tblStyle w:val="Table"/>
+        <w:tblW w:type="pct" w:w="5000"/>
+        <w:tblLook w:firstRow="1" w:lastRow="0" w:firstColumn="0" w:lastColumn="0" w:noHBand="0" w:noVBand="0" w:val="0020"/>
+        <w:jc w:val="start"/>
+        <w:tblBorders>
+          <w:top w:val="single" w:sz="4" w:color="B8C2D3"/>
+          <w:left w:val="single" w:sz="4" w:color="B8C2D3"/>
+          <w:bottom w:val="single" w:sz="4" w:color="B8C2D3"/>
+          <w:right w:val="single" w:sz="4" w:color="B8C2D3"/>
+          <w:insideH w:val="single" w:sz="4" w:color="B8C2D3"/>
+          <w:insideV w:val="single" w:sz="4" w:color="B8C2D3"/>
+        </w:tblBorders>
+      </w:tblPr>
+      <w:tblGrid>
+        <w:gridCol w:w="3960"/>
+        <w:gridCol w:w="3960"/>
+      </w:tblGrid>
+      <w:tr>
+        <w:trPr>
+          <w:tblHeader w:val="true"/>
+        </w:trPr>
+        <w:tc>
+          <w:tcPr>
+            <w:shd w:val="clear" w:fill="E8EEF8"/>
+          </w:tcPr>
+          <w:p>
+            <w:pPr>
+              <w:pStyle w:val="Compact"/>
+              <w:jc w:val="left"/>
+            </w:pPr>
+            <w:r>
+              <w:rPr>
+                <w:b/>
+                <w:sz w:val="19"/>
+              </w:rPr>
+              <w:t xml:space="preserve">Cantrip</w:t>
+            </w:r>
+          </w:p>
+        </w:tc>
+        <w:tc>
+          <w:tcPr>
+            <w:shd w:val="clear" w:fill="E8EEF8"/>
+          </w:tcPr>
+          <w:p>
+            <w:pPr>
+              <w:pStyle w:val="Compact"/>
+              <w:jc w:val="left"/>
+            </w:pPr>
+            <w:r>
+              <w:rPr>
+                <w:b/>
+                <w:sz w:val="19"/>
+              </w:rPr>
+              <w:t xml:space="preserve">Effect</w:t>
+            </w:r>
+          </w:p>
+        </w:tc>
+      </w:tr>
+      <w:tr>
+        <w:tc>
+          <w:tcPr/>
+          <w:p>
+            <w:pPr>
+              <w:pStyle w:val="Compact"/>
+              <w:jc w:val="left"/>
+            </w:pPr>
+            <w:r>
+              <w:rPr>
+                <w:b/>
+                <w:sz w:val="19"/>
+              </w:rPr>
+              <w:t xml:space="preserve">Bolt</w:t>
+            </w:r>
+          </w:p>
+        </w:tc>
+        <w:tc>
+          <w:tcPr/>
+          <w:p>
+            <w:pPr>
+              <w:pStyle w:val="Compact"/>
+              <w:jc w:val="left"/>
+            </w:pPr>
+            <w:r>
+              <w:rPr>
+                <w:sz w:val="19"/>
+              </w:rPr>
+              <w:t xml:space="preserve">A mystic blast: an attack at the power’s Class, effective at Short range.</w:t>
+            </w:r>
+          </w:p>
+        </w:tc>
+      </w:tr>
+      <w:tr>
+        <w:tc>
+          <w:tcPr/>
+          <w:p>
+            <w:pPr>
+              <w:pStyle w:val="Compact"/>
+              <w:jc w:val="left"/>
+            </w:pPr>
+            <w:r>
+              <w:rPr>
+                <w:b/>
+                <w:sz w:val="19"/>
+              </w:rPr>
+              <w:t xml:space="preserve">Shield</w:t>
+            </w:r>
+          </w:p>
+        </w:tc>
+        <w:tc>
+          <w:tcPr/>
+          <w:p>
+            <w:pPr>
+              <w:pStyle w:val="Compact"/>
+              <w:jc w:val="left"/>
+            </w:pPr>
+            <w:r>
+              <w:rPr>
+                <w:sz w:val="19"/>
+              </w:rPr>
+              <w:t xml:space="preserve">A barrier: Defense at the power’s Class until your next turn.</w:t>
+            </w:r>
+          </w:p>
+        </w:tc>
+      </w:tr>
+      <w:tr>
+        <w:tc>
+          <w:tcPr/>
+          <w:p>
+            <w:pPr>
+              <w:pStyle w:val="Compact"/>
+              <w:jc w:val="left"/>
+            </w:pPr>
+            <w:r>
+              <w:rPr>
+                <w:b/>
+                <w:sz w:val="19"/>
+              </w:rPr>
+              <w:t xml:space="preserve">Bind</w:t>
+            </w:r>
+          </w:p>
+        </w:tc>
+        <w:tc>
+          <w:tcPr/>
+          <w:p>
+            <w:pPr>
+              <w:pStyle w:val="Compact"/>
+              <w:jc w:val="left"/>
+            </w:pPr>
+            <w:r>
+              <w:rPr>
+                <w:sz w:val="19"/>
+              </w:rPr>
+              <w:t xml:space="preserve">Bands of force hold a target in place (Body resists).</w:t>
+            </w:r>
+          </w:p>
+        </w:tc>
+      </w:tr>
+      <w:tr>
+        <w:tc>
+          <w:tcPr/>
+          <w:p>
+            <w:pPr>
+              <w:pStyle w:val="Compact"/>
+              <w:jc w:val="left"/>
+            </w:pPr>
+            <w:r>
+              <w:rPr>
+                <w:b/>
+                <w:sz w:val="19"/>
+              </w:rPr>
+              <w:t xml:space="preserve">Dispel</w:t>
+            </w:r>
+          </w:p>
+        </w:tc>
+        <w:tc>
+          <w:tcPr/>
+          <w:p>
+            <w:pPr>
+              <w:pStyle w:val="Compact"/>
+              <w:jc w:val="left"/>
+            </w:pPr>
+            <w:r>
+              <w:rPr>
+                <w:sz w:val="19"/>
+              </w:rPr>
+              <w:t xml:space="preserve">Cancel a spell, ward or magical effect of equal or lower Class.</w:t>
+            </w:r>
+          </w:p>
+        </w:tc>
+      </w:tr>
+      <w:tr>
+        <w:tc>
+          <w:tcPr/>
+          <w:p>
+            <w:pPr>
+              <w:pStyle w:val="Compact"/>
+              <w:jc w:val="left"/>
+            </w:pPr>
+            <w:r>
+              <w:rPr>
+                <w:b/>
+                <w:sz w:val="19"/>
+              </w:rPr>
+              <w:t xml:space="preserve">Veil</w:t>
+            </w:r>
+          </w:p>
+        </w:tc>
+        <w:tc>
+          <w:tcPr/>
+          <w:p>
+            <w:pPr>
+              <w:pStyle w:val="Compact"/>
+              <w:jc w:val="left"/>
+            </w:pPr>
+            <w:r>
+              <w:rPr>
+                <w:sz w:val="19"/>
+              </w:rPr>
+              <w:t xml:space="preserve">Hide yourself or an object from sight for the scene.</w:t>
+            </w:r>
+          </w:p>
+        </w:tc>
+      </w:tr>
+      <w:tr>
+        <w:tc>
+          <w:tcPr/>
+          <w:p>
+            <w:pPr>
+              <w:pStyle w:val="Compact"/>
+              <w:jc w:val="left"/>
+            </w:pPr>
+            <w:r>
+              <w:rPr>
+                <w:b/>
+                <w:sz w:val="19"/>
+              </w:rPr>
+              <w:t xml:space="preserve">Glamour</w:t>
+            </w:r>
+          </w:p>
+        </w:tc>
+        <w:tc>
+          <w:tcPr/>
+          <w:p>
+            <w:pPr>
+              <w:pStyle w:val="Compact"/>
+              <w:jc w:val="left"/>
+            </w:pPr>
+            <w:r>
+              <w:rPr>
+                <w:sz w:val="19"/>
+              </w:rPr>
+              <w:t xml:space="preserve">A quick illusion that fools the eye (Will or Intellect sees through it).</w:t>
+            </w:r>
+          </w:p>
+        </w:tc>
+      </w:tr>
+      <w:tr>
+        <w:tc>
+          <w:tcPr/>
+          <w:p>
+            <w:pPr>
+              <w:pStyle w:val="Compact"/>
+              <w:jc w:val="left"/>
+            </w:pPr>
+            <w:r>
+              <w:rPr>
+                <w:b/>
+                <w:sz w:val="19"/>
+              </w:rPr>
+              <w:t xml:space="preserve">Sight</w:t>
+            </w:r>
+          </w:p>
+        </w:tc>
+        <w:tc>
+          <w:tcPr/>
+          <w:p>
+            <w:pPr>
+              <w:pStyle w:val="Compact"/>
+              <w:jc w:val="left"/>
+            </w:pPr>
+            <w:r>
+              <w:rPr>
+                <w:sz w:val="19"/>
+              </w:rPr>
+              <w:t xml:space="preserve">See magic, spirits, curses and disguises.</w:t>
+            </w:r>
+          </w:p>
+        </w:tc>
+      </w:tr>
+      <w:tr>
+        <w:tc>
+          <w:tcPr/>
+          <w:p>
+            <w:pPr>
+              <w:pStyle w:val="Compact"/>
+              <w:jc w:val="left"/>
+            </w:pPr>
+            <w:r>
+              <w:rPr>
+                <w:b/>
+                <w:sz w:val="19"/>
+              </w:rPr>
+              <w:t xml:space="preserve">Hex</w:t>
+            </w:r>
+          </w:p>
+        </w:tc>
+        <w:tc>
+          <w:tcPr/>
+          <w:p>
+            <w:pPr>
+              <w:pStyle w:val="Compact"/>
+              <w:jc w:val="left"/>
+            </w:pPr>
+            <w:r>
+              <w:rPr>
+                <w:sz w:val="19"/>
+              </w:rPr>
+              <w:t xml:space="preserve">−2 to all of a target’s rolls for the scene (Will resists).</w:t>
+            </w:r>
+          </w:p>
+        </w:tc>
+      </w:tr>
+      <w:tr>
+        <w:tc>
+          <w:tcPr/>
+          <w:p>
+            <w:pPr>
+              <w:pStyle w:val="Compact"/>
+              <w:jc w:val="left"/>
+            </w:pPr>
+            <w:r>
+              <w:rPr>
+                <w:b/>
+                <w:sz w:val="19"/>
+              </w:rPr>
+              <w:t xml:space="preserve">Charm</w:t>
+            </w:r>
+          </w:p>
+        </w:tc>
+        <w:tc>
+          <w:tcPr/>
+          <w:p>
+            <w:pPr>
+              <w:pStyle w:val="Compact"/>
+              <w:jc w:val="left"/>
+            </w:pPr>
+            <w:r>
+              <w:rPr>
+                <w:sz w:val="19"/>
+              </w:rPr>
+              <w:t xml:space="preserve">The target treats you as a friend for the scene (Will resists).</w:t>
+            </w:r>
+          </w:p>
+        </w:tc>
+      </w:tr>
+      <w:tr>
+        <w:tc>
+          <w:tcPr/>
+          <w:p>
+            <w:pPr>
+              <w:pStyle w:val="Compact"/>
+              <w:jc w:val="left"/>
+            </w:pPr>
+            <w:r>
+              <w:rPr>
+                <w:b/>
+                <w:sz w:val="19"/>
+              </w:rPr>
+              <w:t xml:space="preserve">Levitate</w:t>
+            </w:r>
+          </w:p>
+        </w:tc>
+        <w:tc>
+          <w:tcPr/>
+          <w:p>
+            <w:pPr>
+              <w:pStyle w:val="Compact"/>
+              <w:jc w:val="left"/>
+            </w:pPr>
+            <w:r>
+              <w:rPr>
+                <w:sz w:val="19"/>
+              </w:rPr>
+              <w:t xml:space="preserve">Float yourself or an object; at higher Classes, a car or a group.</w:t>
+            </w:r>
+          </w:p>
+        </w:tc>
+      </w:tr>
+      <w:tr>
+        <w:tc>
+          <w:tcPr/>
+          <w:p>
+            <w:pPr>
+              <w:pStyle w:val="Compact"/>
+              <w:jc w:val="left"/>
+            </w:pPr>
+            <w:r>
+              <w:rPr>
+                <w:b/>
+                <w:sz w:val="19"/>
+              </w:rPr>
+              <w:t xml:space="preserve">Step</w:t>
+            </w:r>
+          </w:p>
+        </w:tc>
+        <w:tc>
+          <w:tcPr/>
+          <w:p>
+            <w:pPr>
+              <w:pStyle w:val="Compact"/>
+              <w:jc w:val="left"/>
+            </w:pPr>
+            <w:r>
+              <w:rPr>
+                <w:sz w:val="19"/>
+              </w:rPr>
+              <w:t xml:space="preserve">Vanish and reappear within Close range; farther at higher Classes.</w:t>
+            </w:r>
+          </w:p>
+        </w:tc>
+      </w:tr>
+      <w:tr>
+        <w:tc>
+          <w:tcPr/>
+          <w:p>
+            <w:pPr>
+              <w:pStyle w:val="Compact"/>
+              <w:jc w:val="left"/>
+            </w:pPr>
+            <w:r>
+              <w:rPr>
+                <w:b/>
+                <w:sz w:val="19"/>
+              </w:rPr>
+              <w:t xml:space="preserve">Mend</w:t>
+            </w:r>
+          </w:p>
+        </w:tc>
+        <w:tc>
+          <w:tcPr/>
+          <w:p>
+            <w:pPr>
+              <w:pStyle w:val="Compact"/>
+              <w:jc w:val="left"/>
+            </w:pPr>
+            <w:r>
+              <w:rPr>
+                <w:sz w:val="19"/>
+              </w:rPr>
+              <w:t xml:space="preserve">Clear one injury box, once per wound.</w:t>
+            </w:r>
+          </w:p>
+        </w:tc>
+      </w:tr>
+    </w:tbl>
+    <w:p>
+      <w:pPr>
+        <w:pStyle w:val="BodyText"/>
+      </w:pPr>
+      <w:r>
+        <w:t xml:space="preserve">Rituals are still the way to do</w:t>
+      </w:r>
+      <w:r>
+        <w:t xml:space="preserve"> </w:t>
+      </w:r>
+      <w:r>
+        <w:rPr>
+          <w:iCs/>
+          <w:i/>
+        </w:rPr>
+        <w:t xml:space="preserve">anything</w:t>
+      </w:r>
+      <w:r>
+        <w:t xml:space="preserve">, given time and fuel. Cantrips are the way to do a few things</w:t>
+      </w:r>
+      <w:r>
+        <w:t xml:space="preserve"> </w:t>
+      </w:r>
+      <w:r>
+        <w:rPr>
+          <w:iCs/>
+          <w:i/>
+        </w:rPr>
+        <w:t xml:space="preserve">now</w:t>
+      </w:r>
+      <w:r>
+        <w:t xml:space="preserve">.</w:t>
+      </w:r>
+    </w:p>
+    <w:bookmarkEnd w:id="93"/>
+    <w:bookmarkStart w:id="94" w:name="rituals"/>
+    <w:p>
+      <w:pPr>
+        <w:pStyle w:val="Heading2"/>
+      </w:pPr>
+      <w:r>
+        <w:t xml:space="preserve">Rituals</w:t>
+      </w:r>
+    </w:p>
+    <w:p>
+      <w:pPr>
+        <w:pStyle w:val="FirstParagraph"/>
+      </w:pPr>
+      <w:r>
+        <w:t xml:space="preserve">Adepts can</w:t>
+      </w:r>
+      <w:r>
+        <w:t xml:space="preserve"> </w:t>
+      </w:r>
+      <w:r>
+        <w:rPr>
+          <w:bCs/>
+          <w:b/>
+        </w:rPr>
+        <w:t xml:space="preserve">emulate any power by ritual</w:t>
+      </w:r>
+      <w:r>
+        <w:t xml:space="preserve">, at any Class up to their own highest.</w:t>
+      </w:r>
+    </w:p>
+    <w:p>
+      <w:pPr>
+        <w:numPr>
+          <w:ilvl w:val="0"/>
+          <w:numId w:val="1019"/>
+        </w:numPr>
+        <w:pStyle w:val="Compact"/>
+      </w:pPr>
+      <w:r>
+        <w:rPr>
+          <w:bCs/>
+          <w:b/>
+        </w:rPr>
+        <w:t xml:space="preserve">Time:</w:t>
+      </w:r>
+      <w:r>
+        <w:t xml:space="preserve"> </w:t>
+      </w:r>
+      <w:r>
+        <w:t xml:space="preserve">Class I takes ten minutes, Class II an hour, Class III a night. A ritual can’t be done in the middle of a fight.</w:t>
+      </w:r>
+    </w:p>
+    <w:p>
+      <w:pPr>
+        <w:numPr>
+          <w:ilvl w:val="0"/>
+          <w:numId w:val="1019"/>
+        </w:numPr>
+        <w:pStyle w:val="Compact"/>
+      </w:pPr>
+      <w:r>
+        <w:rPr>
+          <w:bCs/>
+          <w:b/>
+        </w:rPr>
+        <w:t xml:space="preserve">The roll:</w:t>
+      </w:r>
+      <w:r>
+        <w:t xml:space="preserve"> </w:t>
+      </w:r>
+      <w:r>
+        <w:t xml:space="preserve">Powers, at −2 for Class II and −4 for Class III.</w:t>
+      </w:r>
+    </w:p>
+    <w:p>
+      <w:pPr>
+        <w:numPr>
+          <w:ilvl w:val="0"/>
+          <w:numId w:val="1019"/>
+        </w:numPr>
+        <w:pStyle w:val="Compact"/>
+      </w:pPr>
+      <w:r>
+        <w:rPr>
+          <w:bCs/>
+          <w:b/>
+        </w:rPr>
+        <w:t xml:space="preserve">Effect:</w:t>
+      </w:r>
+      <w:r>
+        <w:t xml:space="preserve"> </w:t>
+      </w:r>
+      <w:r>
+        <w:t xml:space="preserve">the power works once, or for one scene, as the GM judges, and can be cast on someone else.</w:t>
+      </w:r>
+    </w:p>
+    <w:p>
+      <w:pPr>
+        <w:numPr>
+          <w:ilvl w:val="0"/>
+          <w:numId w:val="1019"/>
+        </w:numPr>
+        <w:pStyle w:val="Compact"/>
+      </w:pPr>
+      <w:r>
+        <w:rPr>
+          <w:bCs/>
+          <w:b/>
+        </w:rPr>
+        <w:t xml:space="preserve">Cost:</w:t>
+      </w:r>
+      <w:r>
+        <w:t xml:space="preserve"> </w:t>
+      </w:r>
+      <w:r>
+        <w:t xml:space="preserve">a failed ritual marks a box of Strain. A natural 18 means something answered that shouldn’t have.</w:t>
+      </w:r>
+    </w:p>
+    <w:p>
+      <w:pPr>
+        <w:numPr>
+          <w:ilvl w:val="0"/>
+          <w:numId w:val="1019"/>
         </w:numPr>
         <w:pStyle w:val="Compact"/>
       </w:pPr>
@@ -22630,8 +23613,8 @@
         <w:t xml:space="preserve">Without fuel, a ritual fails before it begins. Fuel taken from an unwilling person works, and is exactly how the Foundation and Raster Zero do it; for player characters it’s a crime under the EPA, and a black mark on any Adept.</w:t>
       </w:r>
     </w:p>
-    <w:bookmarkEnd w:id="93"/>
-    <w:bookmarkStart w:id="94" w:name="aegis-suits"/>
+    <w:bookmarkEnd w:id="94"/>
+    <w:bookmarkStart w:id="95" w:name="aegis-suits"/>
     <w:p>
       <w:pPr>
         <w:pStyle w:val="Heading2"/>
@@ -22709,8 +23692,8 @@
         <w:t xml:space="preserve">fired with Firearms. Suiting up takes a minute. A shot at the power pack (−2 to aim) that gets through shuts the suit down until it’s repaired with Engineering. The suits belong to ExLAW, or to whoever stole one.</w:t>
       </w:r>
     </w:p>
-    <w:bookmarkEnd w:id="94"/>
-    <w:bookmarkStart w:id="95" w:name="the-labs-want-you"/>
+    <w:bookmarkEnd w:id="95"/>
+    <w:bookmarkStart w:id="96" w:name="the-labs-want-you"/>
     <w:p>
       <w:pPr>
         <w:pStyle w:val="Heading2"/>
@@ -22727,9 +23710,9 @@
         <w:t xml:space="preserve">A character with a Class III power, or any (GM) power, draws interest from the Foundation and Raster Zero. That interest is a story hook, not a rule.</w:t>
       </w:r>
     </w:p>
-    <w:bookmarkEnd w:id="95"/>
     <w:bookmarkEnd w:id="96"/>
-    <w:bookmarkStart w:id="97" w:name="factions"/>
+    <w:bookmarkEnd w:id="97"/>
+    <w:bookmarkStart w:id="98" w:name="factions"/>
     <w:p>
       <w:pPr>
         <w:pStyle w:val="Heading1"/>
@@ -22748,128 +23731,6 @@
           <w:b/>
         </w:rPr>
         <w:t xml:space="preserve">Law and government</w:t>
-      </w:r>
-    </w:p>
-    <w:p>
-      <w:pPr>
-        <w:numPr>
-          <w:ilvl w:val="0"/>
-          <w:numId w:val="1019"/>
-        </w:numPr>
-        <w:pStyle w:val="Compact"/>
-      </w:pPr>
-      <w:r>
-        <w:rPr>
-          <w:bCs/>
-          <w:b/>
-        </w:rPr>
-        <w:t xml:space="preserve">ExLAW.</w:t>
-      </w:r>
-      <w:r>
-        <w:t xml:space="preserve"> </w:t>
-      </w:r>
-      <w:r>
-        <w:t xml:space="preserve">The federal Operant agency, under Director Steven Humbacht: six regional commands, Operant agents, Reserve Agents and Aegis wings, and a public-relations office as busy as any of them.</w:t>
-      </w:r>
-    </w:p>
-    <w:p>
-      <w:pPr>
-        <w:numPr>
-          <w:ilvl w:val="0"/>
-          <w:numId w:val="1019"/>
-        </w:numPr>
-        <w:pStyle w:val="Compact"/>
-      </w:pPr>
-      <w:r>
-        <w:rPr>
-          <w:bCs/>
-          <w:b/>
-        </w:rPr>
-        <w:t xml:space="preserve">The EPAOC.</w:t>
-      </w:r>
-      <w:r>
-        <w:t xml:space="preserve"> </w:t>
-      </w:r>
-      <w:r>
-        <w:t xml:space="preserve">The congressional watchdog, always looking for a scandal; a hearing can end a career.</w:t>
-      </w:r>
-    </w:p>
-    <w:p>
-      <w:pPr>
-        <w:numPr>
-          <w:ilvl w:val="0"/>
-          <w:numId w:val="1019"/>
-        </w:numPr>
-        <w:pStyle w:val="Compact"/>
-      </w:pPr>
-      <w:r>
-        <w:rPr>
-          <w:bCs/>
-          <w:b/>
-        </w:rPr>
-        <w:t xml:space="preserve">DIRE.</w:t>
-      </w:r>
-      <w:r>
-        <w:t xml:space="preserve"> </w:t>
-      </w:r>
-      <w:r>
-        <w:t xml:space="preserve">The Army’s Defense Intelligence and Research Enterprise, founded after 2012. It made Helios with a modified Ambrosia, and wants more like him.</w:t>
-      </w:r>
-    </w:p>
-    <w:p>
-      <w:pPr>
-        <w:numPr>
-          <w:ilvl w:val="0"/>
-          <w:numId w:val="1019"/>
-        </w:numPr>
-        <w:pStyle w:val="Compact"/>
-      </w:pPr>
-      <w:r>
-        <w:rPr>
-          <w:bCs/>
-          <w:b/>
-        </w:rPr>
-        <w:t xml:space="preserve">UNILED.</w:t>
-      </w:r>
-      <w:r>
-        <w:t xml:space="preserve"> </w:t>
-      </w:r>
-      <w:r>
-        <w:t xml:space="preserve">The UN’s international enforcement directorate, which runs Raster Eight.</w:t>
-      </w:r>
-    </w:p>
-    <w:p>
-      <w:pPr>
-        <w:numPr>
-          <w:ilvl w:val="0"/>
-          <w:numId w:val="1019"/>
-        </w:numPr>
-        <w:pStyle w:val="Compact"/>
-      </w:pPr>
-      <w:r>
-        <w:rPr>
-          <w:bCs/>
-          <w:b/>
-        </w:rPr>
-        <w:t xml:space="preserve">Affaires spéciales.</w:t>
-      </w:r>
-      <w:r>
-        <w:t xml:space="preserve"> </w:t>
-      </w:r>
-      <w:r>
-        <w:t xml:space="preserve">France’s special affairs branch, home to Chat Roux.</w:t>
-      </w:r>
-    </w:p>
-    <w:p>
-      <w:pPr>
-        <w:pStyle w:val="FirstParagraph"/>
-      </w:pPr>
-      <w:r>
-        <w:rPr>
-          <w:bCs/>
-          <w:b/>
-        </w:rPr>
-        <w:t xml:space="preserve">Heroes and orders</w:t>
       </w:r>
     </w:p>
     <w:p>
@@ -22885,13 +23746,13 @@
           <w:bCs/>
           <w:b/>
         </w:rPr>
-        <w:t xml:space="preserve">The New Power Legion.</w:t>
-      </w:r>
-      <w:r>
-        <w:t xml:space="preserve"> </w:t>
-      </w:r>
-      <w:r>
-        <w:t xml:space="preserve">Sponsored, televised heroes; Mr. Marvel’s old team reborn, with Sanders Communication’s money and cameras behind it.</w:t>
+        <w:t xml:space="preserve">ExLAW.</w:t>
+      </w:r>
+      <w:r>
+        <w:t xml:space="preserve"> </w:t>
+      </w:r>
+      <w:r>
+        <w:t xml:space="preserve">The federal Operant agency, under Director Steven Humbacht: six regional commands, Operant agents, Reserve Agents and Aegis wings, and a public-relations office as busy as any of them.</w:t>
       </w:r>
     </w:p>
     <w:p>
@@ -22907,41 +23768,13 @@
           <w:bCs/>
           <w:b/>
         </w:rPr>
-        <w:t xml:space="preserve">The Shadow Knights.</w:t>
-      </w:r>
-      <w:r>
-        <w:t xml:space="preserve"> </w:t>
-      </w:r>
-      <w:r>
-        <w:t xml:space="preserve">The</w:t>
-      </w:r>
-      <w:r>
-        <w:t xml:space="preserve"> </w:t>
-      </w:r>
-      <w:r>
-        <w:rPr>
-          <w:iCs/>
-          <w:i/>
-        </w:rPr>
-        <w:t xml:space="preserve">Ordo Viarum Lucidarum</w:t>
-      </w:r>
-      <w:r>
-        <w:t xml:space="preserve">,</w:t>
-      </w:r>
-      <w:r>
-        <w:t xml:space="preserve"> </w:t>
-      </w:r>
-      <w:r>
-        <w:t xml:space="preserve">“</w:t>
-      </w:r>
-      <w:r>
-        <w:t xml:space="preserve">to bring the light of Christ into the shadows</w:t>
-      </w:r>
-      <w:r>
-        <w:t xml:space="preserve">”</w:t>
-      </w:r>
-      <w:r>
-        <w:t xml:space="preserve">, founded (its members say) by a 12th-century knight who defied a corrupt king. A few Knights on each continent, each supported by a cell of five to twenty doctors, magicians, technicians and administrators. Grant Douglas is the Shadow Knight of North America.</w:t>
+        <w:t xml:space="preserve">The EPAOC.</w:t>
+      </w:r>
+      <w:r>
+        <w:t xml:space="preserve"> </w:t>
+      </w:r>
+      <w:r>
+        <w:t xml:space="preserve">The congressional watchdog, always looking for a scandal; a hearing can end a career.</w:t>
       </w:r>
     </w:p>
     <w:p>
@@ -22957,29 +23790,13 @@
           <w:bCs/>
           <w:b/>
         </w:rPr>
-        <w:t xml:space="preserve">The Earth Wardens.</w:t>
-      </w:r>
-      <w:r>
-        <w:t xml:space="preserve"> </w:t>
-      </w:r>
-      <w:r>
-        <w:t xml:space="preserve">A worldwide network of Adepts gathered by a reawakened Merlin after Lord Colslo opened the Celtic Gate in 1952. They guard the re-energized</w:t>
-      </w:r>
-      <w:r>
-        <w:t xml:space="preserve"> </w:t>
-      </w:r>
-      <w:r>
-        <w:rPr>
-          <w:bCs/>
-          <w:b/>
-        </w:rPr>
-        <w:t xml:space="preserve">Earth Gates</w:t>
-      </w:r>
-      <w:r>
-        <w:t xml:space="preserve"> </w:t>
-      </w:r>
-      <w:r>
-        <w:t xml:space="preserve">against demons, faeries and malcontent gods.</w:t>
+        <w:t xml:space="preserve">DIRE.</w:t>
+      </w:r>
+      <w:r>
+        <w:t xml:space="preserve"> </w:t>
+      </w:r>
+      <w:r>
+        <w:t xml:space="preserve">The Army’s Defense Intelligence and Research Enterprise, founded after 2012. It made Helios with a modified Ambrosia, and wants more like him.</w:t>
       </w:r>
     </w:p>
     <w:p>
@@ -22995,13 +23812,35 @@
           <w:bCs/>
           <w:b/>
         </w:rPr>
-        <w:t xml:space="preserve">The Haven.</w:t>
-      </w:r>
-      <w:r>
-        <w:t xml:space="preserve"> </w:t>
-      </w:r>
-      <w:r>
-        <w:t xml:space="preserve">The Green Man’s refuge in the Mad Forest, defended by Celerity.</w:t>
+        <w:t xml:space="preserve">UNILED.</w:t>
+      </w:r>
+      <w:r>
+        <w:t xml:space="preserve"> </w:t>
+      </w:r>
+      <w:r>
+        <w:t xml:space="preserve">The UN’s international enforcement directorate, which runs Raster Eight.</w:t>
+      </w:r>
+    </w:p>
+    <w:p>
+      <w:pPr>
+        <w:numPr>
+          <w:ilvl w:val="0"/>
+          <w:numId w:val="1020"/>
+        </w:numPr>
+        <w:pStyle w:val="Compact"/>
+      </w:pPr>
+      <w:r>
+        <w:rPr>
+          <w:bCs/>
+          <w:b/>
+        </w:rPr>
+        <w:t xml:space="preserve">Affaires spéciales.</w:t>
+      </w:r>
+      <w:r>
+        <w:t xml:space="preserve"> </w:t>
+      </w:r>
+      <w:r>
+        <w:t xml:space="preserve">France’s special affairs branch, home to Chat Roux.</w:t>
       </w:r>
     </w:p>
     <w:p>
@@ -23013,7 +23852,7 @@
           <w:bCs/>
           <w:b/>
         </w:rPr>
-        <w:t xml:space="preserve">Criminals and secrets</w:t>
+        <w:t xml:space="preserve">Heroes and orders</w:t>
       </w:r>
     </w:p>
     <w:p>
@@ -23029,26 +23868,13 @@
           <w:bCs/>
           <w:b/>
         </w:rPr>
-        <w:t xml:space="preserve">The Morcain.</w:t>
-      </w:r>
-      <w:r>
-        <w:t xml:space="preserve"> </w:t>
-      </w:r>
-      <w:r>
-        <w:t xml:space="preserve">A global crime syndicate ruled by</w:t>
-      </w:r>
-      <w:r>
-        <w:t xml:space="preserve"> </w:t>
-      </w:r>
-      <w:r>
-        <w:rPr>
-          <w:bCs/>
-          <w:b/>
-        </w:rPr>
-        <w:t xml:space="preserve">the 12</w:t>
-      </w:r>
-      <w:r>
-        <w:t xml:space="preserve">, Hyun Wang among them; employer of Lord Marrow and Steel Hawk, and of anyone else who sells power.</w:t>
+        <w:t xml:space="preserve">The New Power Legion.</w:t>
+      </w:r>
+      <w:r>
+        <w:t xml:space="preserve"> </w:t>
+      </w:r>
+      <w:r>
+        <w:t xml:space="preserve">Sponsored, televised heroes; Mr. Marvel’s old team reborn, with Sanders Communication’s money and cameras behind it.</w:t>
       </w:r>
     </w:p>
     <w:p>
@@ -23064,13 +23890,41 @@
           <w:bCs/>
           <w:b/>
         </w:rPr>
-        <w:t xml:space="preserve">The White Hand.</w:t>
-      </w:r>
-      <w:r>
-        <w:t xml:space="preserve"> </w:t>
-      </w:r>
-      <w:r>
-        <w:t xml:space="preserve">Autuarch’s Operant army in Argentina, responsible for Chicago 2001.</w:t>
+        <w:t xml:space="preserve">The Shadow Knights.</w:t>
+      </w:r>
+      <w:r>
+        <w:t xml:space="preserve"> </w:t>
+      </w:r>
+      <w:r>
+        <w:t xml:space="preserve">The</w:t>
+      </w:r>
+      <w:r>
+        <w:t xml:space="preserve"> </w:t>
+      </w:r>
+      <w:r>
+        <w:rPr>
+          <w:iCs/>
+          <w:i/>
+        </w:rPr>
+        <w:t xml:space="preserve">Ordo Viarum Lucidarum</w:t>
+      </w:r>
+      <w:r>
+        <w:t xml:space="preserve">,</w:t>
+      </w:r>
+      <w:r>
+        <w:t xml:space="preserve"> </w:t>
+      </w:r>
+      <w:r>
+        <w:t xml:space="preserve">“</w:t>
+      </w:r>
+      <w:r>
+        <w:t xml:space="preserve">to bring the light of Christ into the shadows</w:t>
+      </w:r>
+      <w:r>
+        <w:t xml:space="preserve">”</w:t>
+      </w:r>
+      <w:r>
+        <w:t xml:space="preserve">, founded (its members say) by a 12th-century knight who defied a corrupt king. A few Knights on each continent, each supported by a cell of five to twenty doctors, magicians, technicians and administrators. Grant Douglas is the Shadow Knight of North America.</w:t>
       </w:r>
     </w:p>
     <w:p>
@@ -23086,13 +23940,29 @@
           <w:bCs/>
           <w:b/>
         </w:rPr>
-        <w:t xml:space="preserve">The Foundation.</w:t>
-      </w:r>
-      <w:r>
-        <w:t xml:space="preserve"> </w:t>
-      </w:r>
-      <w:r>
-        <w:t xml:space="preserve">The black labs that kidnap people, make Operants and hunt down those who escape. Sergei Grachyov is their troubleshooter. Nobody knows who runs it.</w:t>
+        <w:t xml:space="preserve">The Earth Wardens.</w:t>
+      </w:r>
+      <w:r>
+        <w:t xml:space="preserve"> </w:t>
+      </w:r>
+      <w:r>
+        <w:t xml:space="preserve">A worldwide network of Adepts gathered by a reawakened Merlin after Lord Colslo opened the Celtic Gate in 1952. They guard the re-energized</w:t>
+      </w:r>
+      <w:r>
+        <w:t xml:space="preserve"> </w:t>
+      </w:r>
+      <w:r>
+        <w:rPr>
+          <w:bCs/>
+          <w:b/>
+        </w:rPr>
+        <w:t xml:space="preserve">Earth Gates</w:t>
+      </w:r>
+      <w:r>
+        <w:t xml:space="preserve"> </w:t>
+      </w:r>
+      <w:r>
+        <w:t xml:space="preserve">against demons, faeries and malcontent gods.</w:t>
       </w:r>
     </w:p>
     <w:p>
@@ -23108,20 +23978,32 @@
           <w:bCs/>
           <w:b/>
         </w:rPr>
-        <w:t xml:space="preserve">The Proteus Group.</w:t>
-      </w:r>
-      <w:r>
-        <w:t xml:space="preserve"> </w:t>
-      </w:r>
-      <w:r>
-        <w:t xml:space="preserve">A criminal consortium the EMD tracks but can’t map.</w:t>
+        <w:t xml:space="preserve">The Haven.</w:t>
+      </w:r>
+      <w:r>
+        <w:t xml:space="preserve"> </w:t>
+      </w:r>
+      <w:r>
+        <w:t xml:space="preserve">The Green Man’s refuge in the Mad Forest, defended by Celerity.</w:t>
+      </w:r>
+    </w:p>
+    <w:p>
+      <w:pPr>
+        <w:pStyle w:val="FirstParagraph"/>
+      </w:pPr>
+      <w:r>
+        <w:rPr>
+          <w:bCs/>
+          <w:b/>
+        </w:rPr>
+        <w:t xml:space="preserve">Criminals and secrets</w:t>
       </w:r>
     </w:p>
     <w:p>
       <w:pPr>
         <w:numPr>
           <w:ilvl w:val="0"/>
-          <w:numId w:val="1021"/>
+          <w:numId w:val="1022"/>
         </w:numPr>
         <w:pStyle w:val="Compact"/>
       </w:pPr>
@@ -23130,6 +24012,107 @@
           <w:bCs/>
           <w:b/>
         </w:rPr>
+        <w:t xml:space="preserve">The Morcain.</w:t>
+      </w:r>
+      <w:r>
+        <w:t xml:space="preserve"> </w:t>
+      </w:r>
+      <w:r>
+        <w:t xml:space="preserve">A global crime syndicate ruled by</w:t>
+      </w:r>
+      <w:r>
+        <w:t xml:space="preserve"> </w:t>
+      </w:r>
+      <w:r>
+        <w:rPr>
+          <w:bCs/>
+          <w:b/>
+        </w:rPr>
+        <w:t xml:space="preserve">the 12</w:t>
+      </w:r>
+      <w:r>
+        <w:t xml:space="preserve">, Hyun Wang among them; employer of Lord Marrow and Steel Hawk, and of anyone else who sells power.</w:t>
+      </w:r>
+    </w:p>
+    <w:p>
+      <w:pPr>
+        <w:numPr>
+          <w:ilvl w:val="0"/>
+          <w:numId w:val="1022"/>
+        </w:numPr>
+        <w:pStyle w:val="Compact"/>
+      </w:pPr>
+      <w:r>
+        <w:rPr>
+          <w:bCs/>
+          <w:b/>
+        </w:rPr>
+        <w:t xml:space="preserve">The White Hand.</w:t>
+      </w:r>
+      <w:r>
+        <w:t xml:space="preserve"> </w:t>
+      </w:r>
+      <w:r>
+        <w:t xml:space="preserve">Autuarch’s Operant army in Argentina, responsible for Chicago 2001.</w:t>
+      </w:r>
+    </w:p>
+    <w:p>
+      <w:pPr>
+        <w:numPr>
+          <w:ilvl w:val="0"/>
+          <w:numId w:val="1022"/>
+        </w:numPr>
+        <w:pStyle w:val="Compact"/>
+      </w:pPr>
+      <w:r>
+        <w:rPr>
+          <w:bCs/>
+          <w:b/>
+        </w:rPr>
+        <w:t xml:space="preserve">The Foundation.</w:t>
+      </w:r>
+      <w:r>
+        <w:t xml:space="preserve"> </w:t>
+      </w:r>
+      <w:r>
+        <w:t xml:space="preserve">The black labs that kidnap people, make Operants and hunt down those who escape. Sergei Grachyov is their troubleshooter. Nobody knows who runs it.</w:t>
+      </w:r>
+    </w:p>
+    <w:p>
+      <w:pPr>
+        <w:numPr>
+          <w:ilvl w:val="0"/>
+          <w:numId w:val="1022"/>
+        </w:numPr>
+        <w:pStyle w:val="Compact"/>
+      </w:pPr>
+      <w:r>
+        <w:rPr>
+          <w:bCs/>
+          <w:b/>
+        </w:rPr>
+        <w:t xml:space="preserve">The Proteus Group.</w:t>
+      </w:r>
+      <w:r>
+        <w:t xml:space="preserve"> </w:t>
+      </w:r>
+      <w:r>
+        <w:t xml:space="preserve">A criminal consortium the EMD tracks but can’t map.</w:t>
+      </w:r>
+    </w:p>
+    <w:p>
+      <w:pPr>
+        <w:numPr>
+          <w:ilvl w:val="0"/>
+          <w:numId w:val="1022"/>
+        </w:numPr>
+        <w:pStyle w:val="Compact"/>
+      </w:pPr>
+      <w:r>
+        <w:rPr>
+          <w:bCs/>
+          <w:b/>
+        </w:rPr>
         <w:t xml:space="preserve">Raster Zero.</w:t>
       </w:r>
       <w:r>
@@ -23153,7 +24136,7 @@
       <w:pPr>
         <w:numPr>
           <w:ilvl w:val="0"/>
-          <w:numId w:val="1021"/>
+          <w:numId w:val="1022"/>
         </w:numPr>
         <w:pStyle w:val="Compact"/>
       </w:pPr>
@@ -23181,8 +24164,8 @@
         <w:t xml:space="preserve">The dark reflection of our world, sending duplicates through the thinning walls.</w:t>
       </w:r>
     </w:p>
-    <w:bookmarkEnd w:id="97"/>
-    <w:bookmarkStart w:id="98" w:name="otherworld-and-shadow-earth"/>
+    <w:bookmarkEnd w:id="98"/>
+    <w:bookmarkStart w:id="99" w:name="otherworld-and-shadow-earth"/>
     <w:p>
       <w:pPr>
         <w:pStyle w:val="Heading1"/>
@@ -23359,8 +24342,8 @@
         <w:t xml:space="preserve">of our own people, who serve as the rulers’ minions. Since 2012 the walls have been thin, and more of them get through every year.</w:t>
       </w:r>
     </w:p>
-    <w:bookmarkEnd w:id="98"/>
-    <w:bookmarkStart w:id="99" w:name="notable-operants"/>
+    <w:bookmarkEnd w:id="99"/>
+    <w:bookmarkStart w:id="100" w:name="notable-operants"/>
     <w:p>
       <w:pPr>
         <w:pStyle w:val="Heading1"/>
@@ -23930,8 +24913,8 @@
         <w:t xml:space="preserve">Once an adjunct professor of comparative folklore in New York, obsessed with a single current of power he believed older than civilization. In a university archive he found untranslated manuscripts in a 19th-century occultist’s papers: a ritual encoded in language itself. He spoke the words aloud, and his mind opened for a few burning moments to the raw currents of Otherworld. It shattered him. He lost his job and his name, and wanders New York’s alleys and subway tunnels muttering. Yet his chalk sigils ward whole stations by accident, his ramblings predict murders and market crashes, pigeons land on his shoulders as if awaiting orders, and children sometimes see a crown of burning letters over his head. He is part prophet, part lunatic, part guardian and part danger.</w:t>
       </w:r>
     </w:p>
-    <w:bookmarkEnd w:id="99"/>
-    <w:bookmarkStart w:id="100" w:name="threats"/>
+    <w:bookmarkEnd w:id="100"/>
+    <w:bookmarkStart w:id="101" w:name="threats"/>
     <w:p>
       <w:pPr>
         <w:pStyle w:val="Heading1"/>
@@ -26169,8 +27152,8 @@
         <w:t xml:space="preserve">For a tougher version, add +1 to its targets and one box, or raise a power one Class; for a weaker one, subtract.</w:t>
       </w:r>
     </w:p>
-    <w:bookmarkEnd w:id="100"/>
-    <w:bookmarkStart w:id="108" w:name="ready-made-characters"/>
+    <w:bookmarkEnd w:id="101"/>
+    <w:bookmarkStart w:id="109" w:name="ready-made-characters"/>
     <w:p>
       <w:pPr>
         <w:pStyle w:val="Heading1"/>
@@ -26187,7 +27170,7 @@
         <w:t xml:space="preserve">Characters ready to play, for one-shots, new players, or a group in a hurry. Each follows the creation rules exactly, and their connections tie them together. In the creator, choose one from the ready-made list to open it and make it your own.</w:t>
       </w:r>
     </w:p>
-    <w:bookmarkStart w:id="101" w:name="rachel-kwan"/>
+    <w:bookmarkStart w:id="102" w:name="rachel-kwan"/>
     <w:p>
       <w:pPr>
         <w:pStyle w:val="Heading2"/>
@@ -26212,254 +27195,6 @@
       </w:r>
       <w:r>
         <w:t xml:space="preserve">Carries a jade seal that holds a guardian spirit, inherited from her grandmother. Her partner vanished on a case Director Humbacht closed personally.</w:t>
-      </w:r>
-    </w:p>
-    <w:p>
-      <w:pPr>
-        <w:numPr>
-          <w:ilvl w:val="0"/>
-          <w:numId w:val="1022"/>
-        </w:numPr>
-        <w:pStyle w:val="Compact"/>
-      </w:pPr>
-      <w:r>
-        <w:rPr>
-          <w:bCs/>
-          <w:b/>
-        </w:rPr>
-        <w:t xml:space="preserve">Attributes:</w:t>
-      </w:r>
-      <w:r>
-        <w:t xml:space="preserve"> </w:t>
-      </w:r>
-      <w:r>
-        <w:t xml:space="preserve">Body 10, Agility 10, Intellect 13, Presence 9, Will 13.</w:t>
-      </w:r>
-      <w:r>
-        <w:t xml:space="preserve"> </w:t>
-      </w:r>
-      <w:r>
-        <w:rPr>
-          <w:bCs/>
-          <w:b/>
-        </w:rPr>
-        <w:t xml:space="preserve">Dodge</w:t>
-      </w:r>
-      <w:r>
-        <w:t xml:space="preserve"> </w:t>
-      </w:r>
-      <w:r>
-        <w:t xml:space="preserve">9.</w:t>
-      </w:r>
-    </w:p>
-    <w:p>
-      <w:pPr>
-        <w:numPr>
-          <w:ilvl w:val="0"/>
-          <w:numId w:val="1022"/>
-        </w:numPr>
-        <w:pStyle w:val="Compact"/>
-      </w:pPr>
-      <w:r>
-        <w:rPr>
-          <w:bCs/>
-          <w:b/>
-        </w:rPr>
-        <w:t xml:space="preserve">Skills:</w:t>
-      </w:r>
-      <w:r>
-        <w:t xml:space="preserve"> </w:t>
-      </w:r>
-      <w:r>
-        <w:t xml:space="preserve">Investigation 16 (Specialty). Trained: Computers 14, Law 14, Occult 14, Powers 14, Read People 14, Athletics 11, Brawling 11, Firearms 11, Persuasion 10.</w:t>
-      </w:r>
-    </w:p>
-    <w:p>
-      <w:pPr>
-        <w:numPr>
-          <w:ilvl w:val="0"/>
-          <w:numId w:val="1022"/>
-        </w:numPr>
-        <w:pStyle w:val="Compact"/>
-      </w:pPr>
-      <w:r>
-        <w:rPr>
-          <w:bCs/>
-          <w:b/>
-        </w:rPr>
-        <w:t xml:space="preserve">Edges:</w:t>
-      </w:r>
-      <w:r>
-        <w:t xml:space="preserve"> </w:t>
-      </w:r>
-      <w:r>
-        <w:t xml:space="preserve">Extra Spark, A friend; a friend: her missing partner’s last informant, who only talks to her.</w:t>
-      </w:r>
-    </w:p>
-    <w:p>
-      <w:pPr>
-        <w:numPr>
-          <w:ilvl w:val="0"/>
-          <w:numId w:val="1022"/>
-        </w:numPr>
-        <w:pStyle w:val="Compact"/>
-      </w:pPr>
-      <w:r>
-        <w:rPr>
-          <w:bCs/>
-          <w:b/>
-        </w:rPr>
-        <w:t xml:space="preserve">Advantage:</w:t>
-      </w:r>
-      <w:r>
-        <w:t xml:space="preserve"> </w:t>
-      </w:r>
-      <w:r>
-        <w:t xml:space="preserve">The Voice Within (origin; companion: Two Minds).</w:t>
-      </w:r>
-      <w:r>
-        <w:t xml:space="preserve"> </w:t>
-      </w:r>
-      <w:r>
-        <w:rPr>
-          <w:bCs/>
-          <w:b/>
-        </w:rPr>
-        <w:t xml:space="preserve">Complication:</w:t>
-      </w:r>
-      <w:r>
-        <w:t xml:space="preserve"> </w:t>
-      </w:r>
-      <w:r>
-        <w:t xml:space="preserve">Can’t Leave It Alone; trigger: a file that shouldn’t exist.</w:t>
-      </w:r>
-    </w:p>
-    <w:p>
-      <w:pPr>
-        <w:numPr>
-          <w:ilvl w:val="0"/>
-          <w:numId w:val="1022"/>
-        </w:numPr>
-        <w:pStyle w:val="Compact"/>
-      </w:pPr>
-      <w:r>
-        <w:rPr>
-          <w:bCs/>
-          <w:b/>
-        </w:rPr>
-        <w:t xml:space="preserve">Powers:</w:t>
-      </w:r>
-      <w:r>
-        <w:t xml:space="preserve"> </w:t>
-      </w:r>
-      <w:r>
-        <w:t xml:space="preserve">Force Field II, Mystic Sight I, Telepathy I.</w:t>
-      </w:r>
-    </w:p>
-    <w:p>
-      <w:pPr>
-        <w:numPr>
-          <w:ilvl w:val="0"/>
-          <w:numId w:val="1022"/>
-        </w:numPr>
-        <w:pStyle w:val="Compact"/>
-      </w:pPr>
-      <w:r>
-        <w:rPr>
-          <w:bCs/>
-          <w:b/>
-        </w:rPr>
-        <w:t xml:space="preserve">Legal status:</w:t>
-      </w:r>
-      <w:r>
-        <w:t xml:space="preserve"> </w:t>
-      </w:r>
-      <w:r>
-        <w:t xml:space="preserve">Full Agent.</w:t>
-      </w:r>
-    </w:p>
-    <w:p>
-      <w:pPr>
-        <w:numPr>
-          <w:ilvl w:val="0"/>
-          <w:numId w:val="1022"/>
-        </w:numPr>
-        <w:pStyle w:val="Compact"/>
-      </w:pPr>
-      <w:r>
-        <w:rPr>
-          <w:bCs/>
-          <w:b/>
-        </w:rPr>
-        <w:t xml:space="preserve">Why I do this:</w:t>
-      </w:r>
-      <w:r>
-        <w:t xml:space="preserve"> </w:t>
-      </w:r>
-      <w:r>
-        <w:t xml:space="preserve">The law should mean something, for Operants and everyone else.</w:t>
-      </w:r>
-      <w:r>
-        <w:t xml:space="preserve"> </w:t>
-      </w:r>
-      <w:r>
-        <w:rPr>
-          <w:bCs/>
-          <w:b/>
-        </w:rPr>
-        <w:t xml:space="preserve">Connection:</w:t>
-      </w:r>
-      <w:r>
-        <w:t xml:space="preserve"> </w:t>
-      </w:r>
-      <w:r>
-        <w:t xml:space="preserve">Jess Calloway is the only reporter who asked about her missing partner. Kwan hasn’t decided whether to trust her.</w:t>
-      </w:r>
-    </w:p>
-    <w:bookmarkEnd w:id="101"/>
-    <w:bookmarkStart w:id="102" w:name="luis-bulldog-ortega"/>
-    <w:p>
-      <w:pPr>
-        <w:pStyle w:val="Heading2"/>
-      </w:pPr>
-      <w:r>
-        <w:t xml:space="preserve">Luis</w:t>
-      </w:r>
-      <w:r>
-        <w:t xml:space="preserve"> </w:t>
-      </w:r>
-      <w:r>
-        <w:t xml:space="preserve">“</w:t>
-      </w:r>
-      <w:r>
-        <w:t xml:space="preserve">Bulldog</w:t>
-      </w:r>
-      <w:r>
-        <w:t xml:space="preserve">”</w:t>
-      </w:r>
-      <w:r>
-        <w:t xml:space="preserve"> </w:t>
-      </w:r>
-      <w:r>
-        <w:t xml:space="preserve">Ortega</w:t>
-      </w:r>
-    </w:p>
-    <w:p>
-      <w:pPr>
-        <w:pStyle w:val="FirstParagraph"/>
-      </w:pPr>
-      <w:r>
-        <w:rPr>
-          <w:iCs/>
-          <w:i/>
-        </w:rPr>
-        <w:t xml:space="preserve">Aegis pilot, Chicago wing, Aegis Pilot. Non-Operant (tier 0); Specialist.</w:t>
-      </w:r>
-      <w:r>
-        <w:t xml:space="preserve"> </w:t>
-      </w:r>
-      <w:r>
-        <w:t xml:space="preserve">Twelve years in the suit, three of them in Iraq. The AS-6’s new firmware came from a contractor nobody can trace, and lately the suit hesitates when he doesn’t.</w:t>
       </w:r>
     </w:p>
     <w:p>
@@ -26481,7 +27216,7 @@
         <w:t xml:space="preserve"> </w:t>
       </w:r>
       <w:r>
-        <w:t xml:space="preserve">Body 12, Agility 13, Intellect 11, Presence 10, Will 10.</w:t>
+        <w:t xml:space="preserve">Body 10, Agility 10, Intellect 13, Presence 9, Will 13.</w:t>
       </w:r>
       <w:r>
         <w:t xml:space="preserve"> </w:t>
@@ -26497,7 +27232,7 @@
         <w:t xml:space="preserve"> </w:t>
       </w:r>
       <w:r>
-        <w:t xml:space="preserve">12.</w:t>
+        <w:t xml:space="preserve">9.</w:t>
       </w:r>
     </w:p>
     <w:p>
@@ -26519,7 +27254,7 @@
         <w:t xml:space="preserve"> </w:t>
       </w:r>
       <w:r>
-        <w:t xml:space="preserve">Piloting 18 (Expert). Trained: Firearms 14, Athletics 13, Brawling 13, Computers 12, Engineering 12, Law 12, Leadership 11, Read People 11.</w:t>
+        <w:t xml:space="preserve">Investigation 16 (Specialty). Trained: Computers 14, Law 14, Occult 14, Powers 14, Read People 14, Athletics 11, Brawling 11, Firearms 11, Persuasion 10.</w:t>
       </w:r>
     </w:p>
     <w:p>
@@ -26541,7 +27276,7 @@
         <w:t xml:space="preserve"> </w:t>
       </w:r>
       <w:r>
-        <w:t xml:space="preserve">+1 attribute point, Extra Trained skill, A friend, Extra Spark; a friend: a DIRE engineer who still owes him for Basra.</w:t>
+        <w:t xml:space="preserve">Extra Spark, A friend; a friend: her missing partner’s last informant, who only talks to her.</w:t>
       </w:r>
     </w:p>
     <w:p>
@@ -26563,7 +27298,7 @@
         <w:t xml:space="preserve"> </w:t>
       </w:r>
       <w:r>
-        <w:t xml:space="preserve">Nerves of Steel (origin; companion: Ordinary Body).</w:t>
+        <w:t xml:space="preserve">The Voice Within (origin; companion: Two Minds).</w:t>
       </w:r>
       <w:r>
         <w:t xml:space="preserve"> </w:t>
@@ -26579,7 +27314,7 @@
         <w:t xml:space="preserve"> </w:t>
       </w:r>
       <w:r>
-        <w:t xml:space="preserve">Orders; trigger: orders to stand down.</w:t>
+        <w:t xml:space="preserve">Can’t Leave It Alone; trigger: a file that shouldn’t exist.</w:t>
       </w:r>
     </w:p>
     <w:p>
@@ -26595,13 +27330,13 @@
           <w:bCs/>
           <w:b/>
         </w:rPr>
-        <w:t xml:space="preserve">Legal status:</w:t>
-      </w:r>
-      <w:r>
-        <w:t xml:space="preserve"> </w:t>
-      </w:r>
-      <w:r>
-        <w:t xml:space="preserve">Full Agent.</w:t>
+        <w:t xml:space="preserve">Powers:</w:t>
+      </w:r>
+      <w:r>
+        <w:t xml:space="preserve"> </w:t>
+      </w:r>
+      <w:r>
+        <w:t xml:space="preserve">Force Field II, Mystic Sight I, Telepathy I.</w:t>
       </w:r>
     </w:p>
     <w:p>
@@ -26617,13 +27352,35 @@
           <w:bCs/>
           <w:b/>
         </w:rPr>
+        <w:t xml:space="preserve">Legal status:</w:t>
+      </w:r>
+      <w:r>
+        <w:t xml:space="preserve"> </w:t>
+      </w:r>
+      <w:r>
+        <w:t xml:space="preserve">Full Agent.</w:t>
+      </w:r>
+    </w:p>
+    <w:p>
+      <w:pPr>
+        <w:numPr>
+          <w:ilvl w:val="0"/>
+          <w:numId w:val="1023"/>
+        </w:numPr>
+        <w:pStyle w:val="Compact"/>
+      </w:pPr>
+      <w:r>
+        <w:rPr>
+          <w:bCs/>
+          <w:b/>
+        </w:rPr>
         <w:t xml:space="preserve">Why I do this:</w:t>
       </w:r>
       <w:r>
         <w:t xml:space="preserve"> </w:t>
       </w:r>
       <w:r>
-        <w:t xml:space="preserve">Someone has to stand between ordinary people and what’s out there.</w:t>
+        <w:t xml:space="preserve">The law should mean something, for Operants and everyone else.</w:t>
       </w:r>
       <w:r>
         <w:t xml:space="preserve"> </w:t>
@@ -26639,17 +27396,35 @@
         <w:t xml:space="preserve"> </w:t>
       </w:r>
       <w:r>
-        <w:t xml:space="preserve">He flew cover for Rachel Kwan the night her partner vanished, and saw something he never put in the report.</w:t>
+        <w:t xml:space="preserve">Jess Calloway is the only reporter who asked about her missing partner. Kwan hasn’t decided whether to trust her.</w:t>
       </w:r>
     </w:p>
     <w:bookmarkEnd w:id="102"/>
-    <w:bookmarkStart w:id="103" w:name="naomi-price"/>
+    <w:bookmarkStart w:id="103" w:name="luis-bulldog-ortega"/>
     <w:p>
       <w:pPr>
         <w:pStyle w:val="Heading2"/>
       </w:pPr>
       <w:r>
-        <w:t xml:space="preserve">Naomi Price</w:t>
+        <w:t xml:space="preserve">Luis</w:t>
+      </w:r>
+      <w:r>
+        <w:t xml:space="preserve"> </w:t>
+      </w:r>
+      <w:r>
+        <w:t xml:space="preserve">“</w:t>
+      </w:r>
+      <w:r>
+        <w:t xml:space="preserve">Bulldog</w:t>
+      </w:r>
+      <w:r>
+        <w:t xml:space="preserve">”</w:t>
+      </w:r>
+      <w:r>
+        <w:t xml:space="preserve"> </w:t>
+      </w:r>
+      <w:r>
+        <w:t xml:space="preserve">Ortega</w:t>
       </w:r>
     </w:p>
     <w:p>
@@ -26661,13 +27436,13 @@
           <w:iCs/>
           <w:i/>
         </w:rPr>
-        <w:t xml:space="preserve">Daybreak, New Power Legion, Public Hero. Ambrosia (tier 3).</w:t>
-      </w:r>
-      <w:r>
-        <w:t xml:space="preserve"> </w:t>
-      </w:r>
-      <w:r>
-        <w:t xml:space="preserve">The Legion’s rising star, dosed with Ambrosia in a sponsor’s clinic at nineteen. Her sponsor owns her image, her schedule and, she’s starting to suspect, her secrets.</w:t>
+        <w:t xml:space="preserve">Aegis pilot, Chicago wing, Aegis Pilot. Non-Operant (tier 0); Specialist.</w:t>
+      </w:r>
+      <w:r>
+        <w:t xml:space="preserve"> </w:t>
+      </w:r>
+      <w:r>
+        <w:t xml:space="preserve">Twelve years in the suit, three of them in Iraq. The AS-6’s new firmware came from a contractor nobody can trace, and lately the suit hesitates when he doesn’t.</w:t>
       </w:r>
     </w:p>
     <w:p>
@@ -26689,7 +27464,7 @@
         <w:t xml:space="preserve"> </w:t>
       </w:r>
       <w:r>
-        <w:t xml:space="preserve">Body 13, Agility 9, Intellect 9, Presence 14, Will 10.</w:t>
+        <w:t xml:space="preserve">Body 12, Agility 13, Intellect 11, Presence 10, Will 10.</w:t>
       </w:r>
       <w:r>
         <w:t xml:space="preserve"> </w:t>
@@ -26705,7 +27480,7 @@
         <w:t xml:space="preserve"> </w:t>
       </w:r>
       <w:r>
-        <w:t xml:space="preserve">8.</w:t>
+        <w:t xml:space="preserve">12.</w:t>
       </w:r>
     </w:p>
     <w:p>
@@ -26727,7 +27502,7 @@
         <w:t xml:space="preserve"> </w:t>
       </w:r>
       <w:r>
-        <w:t xml:space="preserve">Media 17 (Specialty). Trained: Deception 15, Leadership 15, Persuasion 15, Athletics 14, Brawling 14, Powers 11, Read People 11, Law 10, Piloting 10.</w:t>
+        <w:t xml:space="preserve">Piloting 18 (Expert). Trained: Firearms 14, Athletics 13, Brawling 13, Computers 12, Engineering 12, Law 12, Leadership 11, Read People 11.</w:t>
       </w:r>
     </w:p>
     <w:p>
@@ -26749,7 +27524,7 @@
         <w:t xml:space="preserve"> </w:t>
       </w:r>
       <w:r>
-        <w:t xml:space="preserve">Stronger Power.</w:t>
+        <w:t xml:space="preserve">+1 attribute point, Extra Trained skill, A friend, Extra Spark; a friend: a DIRE engineer who still owes him for Basra.</w:t>
       </w:r>
     </w:p>
     <w:p>
@@ -26771,7 +27546,7 @@
         <w:t xml:space="preserve"> </w:t>
       </w:r>
       <w:r>
-        <w:t xml:space="preserve">Golden Ideal (origin; companion: The Anger).</w:t>
+        <w:t xml:space="preserve">Nerves of Steel (origin; companion: Ordinary Body).</w:t>
       </w:r>
       <w:r>
         <w:t xml:space="preserve"> </w:t>
@@ -26787,7 +27562,7 @@
         <w:t xml:space="preserve"> </w:t>
       </w:r>
       <w:r>
-        <w:t xml:space="preserve">Media Darling; trigger: a crowd with phones out.</w:t>
+        <w:t xml:space="preserve">Orders; trigger: orders to stand down.</w:t>
       </w:r>
     </w:p>
     <w:p>
@@ -26803,13 +27578,13 @@
           <w:bCs/>
           <w:b/>
         </w:rPr>
-        <w:t xml:space="preserve">Powers:</w:t>
-      </w:r>
-      <w:r>
-        <w:t xml:space="preserve"> </w:t>
-      </w:r>
-      <w:r>
-        <w:t xml:space="preserve">Strength IV, Flight II, Toughness I.</w:t>
+        <w:t xml:space="preserve">Legal status:</w:t>
+      </w:r>
+      <w:r>
+        <w:t xml:space="preserve"> </w:t>
+      </w:r>
+      <w:r>
+        <w:t xml:space="preserve">Full Agent.</w:t>
       </w:r>
     </w:p>
     <w:p>
@@ -26825,35 +27600,13 @@
           <w:bCs/>
           <w:b/>
         </w:rPr>
-        <w:t xml:space="preserve">Legal status:</w:t>
-      </w:r>
-      <w:r>
-        <w:t xml:space="preserve"> </w:t>
-      </w:r>
-      <w:r>
-        <w:t xml:space="preserve">Registered.</w:t>
-      </w:r>
-    </w:p>
-    <w:p>
-      <w:pPr>
-        <w:numPr>
-          <w:ilvl w:val="0"/>
-          <w:numId w:val="1024"/>
-        </w:numPr>
-        <w:pStyle w:val="Compact"/>
-      </w:pPr>
-      <w:r>
-        <w:rPr>
-          <w:bCs/>
-          <w:b/>
-        </w:rPr>
         <w:t xml:space="preserve">Why I do this:</w:t>
       </w:r>
       <w:r>
         <w:t xml:space="preserve"> </w:t>
       </w:r>
       <w:r>
-        <w:t xml:space="preserve">The cameras love an Operant, and I love the cameras.</w:t>
+        <w:t xml:space="preserve">Someone has to stand between ordinary people and what’s out there.</w:t>
       </w:r>
       <w:r>
         <w:t xml:space="preserve"> </w:t>
@@ -26869,17 +27622,17 @@
         <w:t xml:space="preserve"> </w:t>
       </w:r>
       <w:r>
-        <w:t xml:space="preserve">Static saved her from a Foundation snatch team on live TV, and vanished before the cameras turned.</w:t>
+        <w:t xml:space="preserve">He flew cover for Rachel Kwan the night her partner vanished, and saw something he never put in the report.</w:t>
       </w:r>
     </w:p>
     <w:bookmarkEnd w:id="103"/>
-    <w:bookmarkStart w:id="104" w:name="dr.-tobias-wren"/>
+    <w:bookmarkStart w:id="104" w:name="naomi-price"/>
     <w:p>
       <w:pPr>
         <w:pStyle w:val="Heading2"/>
       </w:pPr>
       <w:r>
-        <w:t xml:space="preserve">Dr. Tobias Wren</w:t>
+        <w:t xml:space="preserve">Naomi Price</w:t>
       </w:r>
     </w:p>
     <w:p>
@@ -26891,13 +27644,13 @@
           <w:iCs/>
           <w:i/>
         </w:rPr>
-        <w:t xml:space="preserve">Professor of comparative religion; Earth Warden, Occultist. Adept (tier 1); Specialist.</w:t>
-      </w:r>
-      <w:r>
-        <w:t xml:space="preserve"> </w:t>
-      </w:r>
-      <w:r>
-        <w:t xml:space="preserve">A collector of forbidden books who once traded a year of his life to something in Avalon for a translation. The year is coming due.</w:t>
+        <w:t xml:space="preserve">Daybreak, New Power Legion, Public Hero. Ambrosia (tier 3).</w:t>
+      </w:r>
+      <w:r>
+        <w:t xml:space="preserve"> </w:t>
+      </w:r>
+      <w:r>
+        <w:t xml:space="preserve">The Legion’s rising star, dosed with Ambrosia in a sponsor’s clinic at nineteen. Her sponsor owns her image, her schedule and, she’s starting to suspect, her secrets.</w:t>
       </w:r>
     </w:p>
     <w:p>
@@ -26919,7 +27672,7 @@
         <w:t xml:space="preserve"> </w:t>
       </w:r>
       <w:r>
-        <w:t xml:space="preserve">Body 9, Agility 10, Intellect 14, Presence 10, Will 13.</w:t>
+        <w:t xml:space="preserve">Body 13, Agility 9, Intellect 9, Presence 14, Will 10.</w:t>
       </w:r>
       <w:r>
         <w:t xml:space="preserve"> </w:t>
@@ -26957,7 +27710,7 @@
         <w:t xml:space="preserve"> </w:t>
       </w:r>
       <w:r>
-        <w:t xml:space="preserve">Powers 18 (Expert). Trained: Investigation 15, Law 15, Medicine 15, Occult 15, Science 15, Read People 14, Persuasion 11.</w:t>
+        <w:t xml:space="preserve">Media 17 (Specialty). Trained: Deception 15, Leadership 15, Persuasion 15, Athletics 14, Brawling 14, Powers 11, Read People 11, Law 10, Piloting 10.</w:t>
       </w:r>
     </w:p>
     <w:p>
@@ -26979,7 +27732,7 @@
         <w:t xml:space="preserve"> </w:t>
       </w:r>
       <w:r>
-        <w:t xml:space="preserve">+1 attribute point, A fine weapon or tool, Stronger Power; a fine tool: the Lammas Grimoire, annotated in four hands (+2 Occult).</w:t>
+        <w:t xml:space="preserve">Stronger Power.</w:t>
       </w:r>
     </w:p>
     <w:p>
@@ -27001,7 +27754,7 @@
         <w:t xml:space="preserve"> </w:t>
       </w:r>
       <w:r>
-        <w:t xml:space="preserve">Ritualist (origin; companion: Obsessed).</w:t>
+        <w:t xml:space="preserve">Golden Ideal (origin; companion: The Anger).</w:t>
       </w:r>
       <w:r>
         <w:t xml:space="preserve"> </w:t>
@@ -27017,7 +27770,7 @@
         <w:t xml:space="preserve"> </w:t>
       </w:r>
       <w:r>
-        <w:t xml:space="preserve">Haunted; trigger: your bond demands something.</w:t>
+        <w:t xml:space="preserve">Media Darling; trigger: a crowd with phones out.</w:t>
       </w:r>
     </w:p>
     <w:p>
@@ -27039,7 +27792,7 @@
         <w:t xml:space="preserve"> </w:t>
       </w:r>
       <w:r>
-        <w:t xml:space="preserve">Warding III, Mystic Sight I.</w:t>
+        <w:t xml:space="preserve">Strength IV, Flight II, Toughness I.</w:t>
       </w:r>
     </w:p>
     <w:p>
@@ -27083,7 +27836,7 @@
         <w:t xml:space="preserve"> </w:t>
       </w:r>
       <w:r>
-        <w:t xml:space="preserve">Someone has to stand between ordinary people and what’s out there.</w:t>
+        <w:t xml:space="preserve">The cameras love an Operant, and I love the cameras.</w:t>
       </w:r>
       <w:r>
         <w:t xml:space="preserve"> </w:t>
@@ -27099,17 +27852,17 @@
         <w:t xml:space="preserve"> </w:t>
       </w:r>
       <w:r>
-        <w:t xml:space="preserve">He taught Maeve Ashgrove’s handler, and was the one who recognized what Maeve really is.</w:t>
+        <w:t xml:space="preserve">Static saved her from a Foundation snatch team on live TV, and vanished before the cameras turned.</w:t>
       </w:r>
     </w:p>
     <w:bookmarkEnd w:id="104"/>
-    <w:bookmarkStart w:id="105" w:name="jess-calloway"/>
+    <w:bookmarkStart w:id="105" w:name="dr.-tobias-wren"/>
     <w:p>
       <w:pPr>
         <w:pStyle w:val="Heading2"/>
       </w:pPr>
       <w:r>
-        <w:t xml:space="preserve">Jess Calloway</w:t>
+        <w:t xml:space="preserve">Dr. Tobias Wren</w:t>
       </w:r>
     </w:p>
     <w:p>
@@ -27121,13 +27874,13 @@
           <w:iCs/>
           <w:i/>
         </w:rPr>
-        <w:t xml:space="preserve">Freelance investigative reporter, Journalist. Touched (tier 2).</w:t>
-      </w:r>
-      <w:r>
-        <w:t xml:space="preserve"> </w:t>
-      </w:r>
-      <w:r>
-        <w:t xml:space="preserve">Touched a Raster Zero file in 2024 and saw the room it came from. Nobody knows she’s an Operant; she’s been pulling the thread ever since.</w:t>
+        <w:t xml:space="preserve">Professor of comparative religion; Earth Warden, Occultist. Adept (tier 1); Specialist.</w:t>
+      </w:r>
+      <w:r>
+        <w:t xml:space="preserve"> </w:t>
+      </w:r>
+      <w:r>
+        <w:t xml:space="preserve">A collector of forbidden books who once traded a year of his life to something in Avalon for a translation. The year is coming due.</w:t>
       </w:r>
     </w:p>
     <w:p>
@@ -27149,7 +27902,7 @@
         <w:t xml:space="preserve"> </w:t>
       </w:r>
       <w:r>
-        <w:t xml:space="preserve">Body 10, Agility 11, Intellect 11, Presence 12, Will 12.</w:t>
+        <w:t xml:space="preserve">Body 9, Agility 10, Intellect 14, Presence 10, Will 13.</w:t>
       </w:r>
       <w:r>
         <w:t xml:space="preserve"> </w:t>
@@ -27165,7 +27918,7 @@
         <w:t xml:space="preserve"> </w:t>
       </w:r>
       <w:r>
-        <w:t xml:space="preserve">9.</w:t>
+        <w:t xml:space="preserve">8.</w:t>
       </w:r>
     </w:p>
     <w:p>
@@ -27187,7 +27940,7 @@
         <w:t xml:space="preserve"> </w:t>
       </w:r>
       <w:r>
-        <w:t xml:space="preserve">Investigation 14 (Specialty). Trained: Deception 13, Media 13, Persuasion 13, Powers 13, Read People 13, Streetwise 13, Computers 12, Law 12, Stealth 12.</w:t>
+        <w:t xml:space="preserve">Powers 18 (Expert). Trained: Investigation 15, Law 15, Medicine 15, Occult 15, Science 15, Read People 14, Persuasion 11.</w:t>
       </w:r>
     </w:p>
     <w:p>
@@ -27209,7 +27962,7 @@
         <w:t xml:space="preserve"> </w:t>
       </w:r>
       <w:r>
-        <w:t xml:space="preserve">+1 attribute point, Extra Power.</w:t>
+        <w:t xml:space="preserve">+1 attribute point, A fine weapon or tool, Stronger Power; a fine tool: the Lammas Grimoire, annotated in four hands (+2 Occult).</w:t>
       </w:r>
     </w:p>
     <w:p>
@@ -27231,7 +27984,7 @@
         <w:t xml:space="preserve"> </w:t>
       </w:r>
       <w:r>
-        <w:t xml:space="preserve">The Glimpse (origin; companion: Cracked).</w:t>
+        <w:t xml:space="preserve">Ritualist (origin; companion: Obsessed).</w:t>
       </w:r>
       <w:r>
         <w:t xml:space="preserve"> </w:t>
@@ -27247,7 +28000,7 @@
         <w:t xml:space="preserve"> </w:t>
       </w:r>
       <w:r>
-        <w:t xml:space="preserve">Secret Identity; trigger: someone close asks where you were.</w:t>
+        <w:t xml:space="preserve">Haunted; trigger: your bond demands something.</w:t>
       </w:r>
     </w:p>
     <w:p>
@@ -27269,7 +28022,7 @@
         <w:t xml:space="preserve"> </w:t>
       </w:r>
       <w:r>
-        <w:t xml:space="preserve">Psychometry II, Precognition I, Empathy I, Enhanced Senses I.</w:t>
+        <w:t xml:space="preserve">Warding III, Mystic Sight I.</w:t>
       </w:r>
     </w:p>
     <w:p>
@@ -27291,7 +28044,7 @@
         <w:t xml:space="preserve"> </w:t>
       </w:r>
       <w:r>
-        <w:t xml:space="preserve">Non-registered.</w:t>
+        <w:t xml:space="preserve">Registered.</w:t>
       </w:r>
     </w:p>
     <w:p>
@@ -27313,7 +28066,7 @@
         <w:t xml:space="preserve"> </w:t>
       </w:r>
       <w:r>
-        <w:t xml:space="preserve">There’s a story nobody’s telling. I’m going to tell it.</w:t>
+        <w:t xml:space="preserve">Someone has to stand between ordinary people and what’s out there.</w:t>
       </w:r>
       <w:r>
         <w:t xml:space="preserve"> </w:t>
@@ -27329,17 +28082,17 @@
         <w:t xml:space="preserve"> </w:t>
       </w:r>
       <w:r>
-        <w:t xml:space="preserve">Rachel Kwan’s missing partner was her source. She hasn’t told Kwan yet.</w:t>
+        <w:t xml:space="preserve">He taught Maeve Ashgrove’s handler, and was the one who recognized what Maeve really is.</w:t>
       </w:r>
     </w:p>
     <w:bookmarkEnd w:id="105"/>
-    <w:bookmarkStart w:id="106" w:name="subject-19"/>
+    <w:bookmarkStart w:id="106" w:name="jess-calloway"/>
     <w:p>
       <w:pPr>
         <w:pStyle w:val="Heading2"/>
       </w:pPr>
       <w:r>
-        <w:t xml:space="preserve">Subject 19</w:t>
+        <w:t xml:space="preserve">Jess Calloway</w:t>
       </w:r>
     </w:p>
     <w:p>
@@ -27351,34 +28104,13 @@
           <w:iCs/>
           <w:i/>
         </w:rPr>
-        <w:t xml:space="preserve">“</w:t>
-      </w:r>
-      <w:r>
-        <w:rPr>
-          <w:iCs/>
-          <w:i/>
-        </w:rPr>
-        <w:t xml:space="preserve">Static</w:t>
-      </w:r>
-      <w:r>
-        <w:rPr>
-          <w:iCs/>
-          <w:i/>
-        </w:rPr>
-        <w:t xml:space="preserve">”</w:t>
-      </w:r>
-      <w:r>
-        <w:rPr>
-          <w:iCs/>
-          <w:i/>
-        </w:rPr>
-        <w:t xml:space="preserve">, escaped Foundation subject, Fugitive. Lab-made (tier 2).</w:t>
-      </w:r>
-      <w:r>
-        <w:t xml:space="preserve"> </w:t>
-      </w:r>
-      <w:r>
-        <w:t xml:space="preserve">Escaped a Foundation black lab a year ago with electric powers, no memory of a name, and a number tattooed on one wrist. Grachyov’s retrieval team is still looking.</w:t>
+        <w:t xml:space="preserve">Freelance investigative reporter, Journalist. Touched (tier 2).</w:t>
+      </w:r>
+      <w:r>
+        <w:t xml:space="preserve"> </w:t>
+      </w:r>
+      <w:r>
+        <w:t xml:space="preserve">Touched a Raster Zero file in 2024 and saw the room it came from. Nobody knows she’s an Operant; she’s been pulling the thread ever since.</w:t>
       </w:r>
     </w:p>
     <w:p>
@@ -27400,7 +28132,7 @@
         <w:t xml:space="preserve"> </w:t>
       </w:r>
       <w:r>
-        <w:t xml:space="preserve">Body 12, Agility 13, Intellect 11, Presence 9, Will 10.</w:t>
+        <w:t xml:space="preserve">Body 10, Agility 11, Intellect 11, Presence 12, Will 12.</w:t>
       </w:r>
       <w:r>
         <w:t xml:space="preserve"> </w:t>
@@ -27416,7 +28148,7 @@
         <w:t xml:space="preserve"> </w:t>
       </w:r>
       <w:r>
-        <w:t xml:space="preserve">12.</w:t>
+        <w:t xml:space="preserve">9.</w:t>
       </w:r>
     </w:p>
     <w:p>
@@ -27438,7 +28170,7 @@
         <w:t xml:space="preserve"> </w:t>
       </w:r>
       <w:r>
-        <w:t xml:space="preserve">Powers 13 (Specialty). Trained: Piloting 14, Stealth 14, Athletics 13, Brawling 13, Computers 12, Engineering 12, Read People 11, Deception 10, Streetwise 10.</w:t>
+        <w:t xml:space="preserve">Investigation 14 (Specialty). Trained: Deception 13, Media 13, Persuasion 13, Powers 13, Read People 13, Streetwise 13, Computers 12, Law 12, Stealth 12.</w:t>
       </w:r>
     </w:p>
     <w:p>
@@ -27460,7 +28192,7 @@
         <w:t xml:space="preserve"> </w:t>
       </w:r>
       <w:r>
-        <w:t xml:space="preserve">Extra Spark, Stronger Power.</w:t>
+        <w:t xml:space="preserve">+1 attribute point, Extra Power.</w:t>
       </w:r>
     </w:p>
     <w:p>
@@ -27482,7 +28214,7 @@
         <w:t xml:space="preserve"> </w:t>
       </w:r>
       <w:r>
-        <w:t xml:space="preserve">Lab Instincts (origin; companion: Test Subject).</w:t>
+        <w:t xml:space="preserve">The Glimpse (origin; companion: Cracked).</w:t>
       </w:r>
       <w:r>
         <w:t xml:space="preserve"> </w:t>
@@ -27498,7 +28230,7 @@
         <w:t xml:space="preserve"> </w:t>
       </w:r>
       <w:r>
-        <w:t xml:space="preserve">Hunted by a Lab; trigger: a van with no plates outside.</w:t>
+        <w:t xml:space="preserve">Secret Identity; trigger: someone close asks where you were.</w:t>
       </w:r>
     </w:p>
     <w:p>
@@ -27520,7 +28252,7 @@
         <w:t xml:space="preserve"> </w:t>
       </w:r>
       <w:r>
-        <w:t xml:space="preserve">Blast III, Speed I, Technopathy I.</w:t>
+        <w:t xml:space="preserve">Psychometry II, Precognition I, Empathy I, Enhanced Senses I.</w:t>
       </w:r>
     </w:p>
     <w:p>
@@ -27564,7 +28296,7 @@
         <w:t xml:space="preserve"> </w:t>
       </w:r>
       <w:r>
-        <w:t xml:space="preserve">No lab, no registry and no government owns me.</w:t>
+        <w:t xml:space="preserve">There’s a story nobody’s telling. I’m going to tell it.</w:t>
       </w:r>
       <w:r>
         <w:t xml:space="preserve"> </w:t>
@@ -27580,17 +28312,17 @@
         <w:t xml:space="preserve"> </w:t>
       </w:r>
       <w:r>
-        <w:t xml:space="preserve">Saved Daybreak from a Foundation snatch team on live TV, and ran before the cameras turned.</w:t>
+        <w:t xml:space="preserve">Rachel Kwan’s missing partner was her source. She hasn’t told Kwan yet.</w:t>
       </w:r>
     </w:p>
     <w:bookmarkEnd w:id="106"/>
-    <w:bookmarkStart w:id="107" w:name="maeve-ashgrove"/>
+    <w:bookmarkStart w:id="107" w:name="subject-19"/>
     <w:p>
       <w:pPr>
         <w:pStyle w:val="Heading2"/>
       </w:pPr>
       <w:r>
-        <w:t xml:space="preserve">Maeve Ashgrove</w:t>
+        <w:t xml:space="preserve">Subject 19</w:t>
       </w:r>
     </w:p>
     <w:p>
@@ -27602,13 +28334,34 @@
           <w:iCs/>
           <w:i/>
         </w:rPr>
-        <w:t xml:space="preserve">Cat burglar, on an ExLAW deal, Thief. Otherworlder (tier 2).</w:t>
-      </w:r>
-      <w:r>
-        <w:t xml:space="preserve"> </w:t>
-      </w:r>
-      <w:r>
-        <w:t xml:space="preserve">A fey-born thief from Avalon, caught stealing from a Morcain vault and handed to ExLAW. She works off her sentence; her handler is the only one who knows where she came from.</w:t>
+        <w:t xml:space="preserve">“</w:t>
+      </w:r>
+      <w:r>
+        <w:rPr>
+          <w:iCs/>
+          <w:i/>
+        </w:rPr>
+        <w:t xml:space="preserve">Static</w:t>
+      </w:r>
+      <w:r>
+        <w:rPr>
+          <w:iCs/>
+          <w:i/>
+        </w:rPr>
+        <w:t xml:space="preserve">”</w:t>
+      </w:r>
+      <w:r>
+        <w:rPr>
+          <w:iCs/>
+          <w:i/>
+        </w:rPr>
+        <w:t xml:space="preserve">, escaped Foundation subject, Fugitive. Lab-made (tier 2).</w:t>
+      </w:r>
+      <w:r>
+        <w:t xml:space="preserve"> </w:t>
+      </w:r>
+      <w:r>
+        <w:t xml:space="preserve">Escaped a Foundation black lab a year ago with electric powers, no memory of a name, and a number tattooed on one wrist. Grachyov’s retrieval team is still looking.</w:t>
       </w:r>
     </w:p>
     <w:p>
@@ -27630,7 +28383,7 @@
         <w:t xml:space="preserve"> </w:t>
       </w:r>
       <w:r>
-        <w:t xml:space="preserve">Body 10, Agility 14, Intellect 11, Presence 11, Will 9.</w:t>
+        <w:t xml:space="preserve">Body 12, Agility 13, Intellect 11, Presence 9, Will 10.</w:t>
       </w:r>
       <w:r>
         <w:t xml:space="preserve"> </w:t>
@@ -27646,7 +28399,7 @@
         <w:t xml:space="preserve"> </w:t>
       </w:r>
       <w:r>
-        <w:t xml:space="preserve">13.</w:t>
+        <w:t xml:space="preserve">12.</w:t>
       </w:r>
     </w:p>
     <w:p>
@@ -27668,7 +28421,7 @@
         <w:t xml:space="preserve"> </w:t>
       </w:r>
       <w:r>
-        <w:t xml:space="preserve">Stealth 17 (Specialty). Trained: Melee 15, Deception 12, Engineering 12, Occult 12, Persuasion 12, Streetwise 12, Athletics 11, Powers 10, Read People 10.</w:t>
+        <w:t xml:space="preserve">Powers 13 (Specialty). Trained: Piloting 14, Stealth 14, Athletics 13, Brawling 13, Computers 12, Engineering 12, Read People 11, Deception 10, Streetwise 10.</w:t>
       </w:r>
     </w:p>
     <w:p>
@@ -27690,7 +28443,7 @@
         <w:t xml:space="preserve"> </w:t>
       </w:r>
       <w:r>
-        <w:t xml:space="preserve">A friend, Extra Spark; a friend: her ExLAW handler, Agent Dorsey, who covers for her more than he should.</w:t>
+        <w:t xml:space="preserve">Extra Spark, Stronger Power.</w:t>
       </w:r>
     </w:p>
     <w:p>
@@ -27712,7 +28465,7 @@
         <w:t xml:space="preserve"> </w:t>
       </w:r>
       <w:r>
-        <w:t xml:space="preserve">Inhuman Grace (origin; companion: Exile).</w:t>
+        <w:t xml:space="preserve">Lab Instincts (origin; companion: Test Subject).</w:t>
       </w:r>
       <w:r>
         <w:t xml:space="preserve"> </w:t>
@@ -27728,7 +28481,7 @@
         <w:t xml:space="preserve"> </w:t>
       </w:r>
       <w:r>
-        <w:t xml:space="preserve">Outsider; trigger: a form that asks for papers you don’t have.</w:t>
+        <w:t xml:space="preserve">Hunted by a Lab; trigger: a van with no plates outside.</w:t>
       </w:r>
     </w:p>
     <w:p>
@@ -27750,7 +28503,7 @@
         <w:t xml:space="preserve"> </w:t>
       </w:r>
       <w:r>
-        <w:t xml:space="preserve">Invisibility II, Phasing I, Illusion I.</w:t>
+        <w:t xml:space="preserve">Blast III, Speed I, Technopathy I.</w:t>
       </w:r>
     </w:p>
     <w:p>
@@ -27772,7 +28525,7 @@
         <w:t xml:space="preserve"> </w:t>
       </w:r>
       <w:r>
-        <w:t xml:space="preserve">Convict.</w:t>
+        <w:t xml:space="preserve">Non-registered.</w:t>
       </w:r>
     </w:p>
     <w:p>
@@ -27810,12 +28563,242 @@
         <w:t xml:space="preserve"> </w:t>
       </w:r>
       <w:r>
+        <w:t xml:space="preserve">Saved Daybreak from a Foundation snatch team on live TV, and ran before the cameras turned.</w:t>
+      </w:r>
+    </w:p>
+    <w:bookmarkEnd w:id="107"/>
+    <w:bookmarkStart w:id="108" w:name="maeve-ashgrove"/>
+    <w:p>
+      <w:pPr>
+        <w:pStyle w:val="Heading2"/>
+      </w:pPr>
+      <w:r>
+        <w:t xml:space="preserve">Maeve Ashgrove</w:t>
+      </w:r>
+    </w:p>
+    <w:p>
+      <w:pPr>
+        <w:pStyle w:val="FirstParagraph"/>
+      </w:pPr>
+      <w:r>
+        <w:rPr>
+          <w:iCs/>
+          <w:i/>
+        </w:rPr>
+        <w:t xml:space="preserve">Cat burglar, on an ExLAW deal, Thief. Otherworlder (tier 2).</w:t>
+      </w:r>
+      <w:r>
+        <w:t xml:space="preserve"> </w:t>
+      </w:r>
+      <w:r>
+        <w:t xml:space="preserve">A fey-born thief from Avalon, caught stealing from a Morcain vault and handed to ExLAW. She works off her sentence; her handler is the only one who knows where she came from.</w:t>
+      </w:r>
+    </w:p>
+    <w:p>
+      <w:pPr>
+        <w:numPr>
+          <w:ilvl w:val="0"/>
+          <w:numId w:val="1029"/>
+        </w:numPr>
+        <w:pStyle w:val="Compact"/>
+      </w:pPr>
+      <w:r>
+        <w:rPr>
+          <w:bCs/>
+          <w:b/>
+        </w:rPr>
+        <w:t xml:space="preserve">Attributes:</w:t>
+      </w:r>
+      <w:r>
+        <w:t xml:space="preserve"> </w:t>
+      </w:r>
+      <w:r>
+        <w:t xml:space="preserve">Body 10, Agility 14, Intellect 11, Presence 11, Will 9.</w:t>
+      </w:r>
+      <w:r>
+        <w:t xml:space="preserve"> </w:t>
+      </w:r>
+      <w:r>
+        <w:rPr>
+          <w:bCs/>
+          <w:b/>
+        </w:rPr>
+        <w:t xml:space="preserve">Dodge</w:t>
+      </w:r>
+      <w:r>
+        <w:t xml:space="preserve"> </w:t>
+      </w:r>
+      <w:r>
+        <w:t xml:space="preserve">13.</w:t>
+      </w:r>
+    </w:p>
+    <w:p>
+      <w:pPr>
+        <w:numPr>
+          <w:ilvl w:val="0"/>
+          <w:numId w:val="1029"/>
+        </w:numPr>
+        <w:pStyle w:val="Compact"/>
+      </w:pPr>
+      <w:r>
+        <w:rPr>
+          <w:bCs/>
+          <w:b/>
+        </w:rPr>
+        <w:t xml:space="preserve">Skills:</w:t>
+      </w:r>
+      <w:r>
+        <w:t xml:space="preserve"> </w:t>
+      </w:r>
+      <w:r>
+        <w:t xml:space="preserve">Stealth 17 (Specialty). Trained: Melee 15, Deception 12, Engineering 12, Occult 12, Persuasion 12, Streetwise 12, Athletics 11, Powers 10, Read People 10.</w:t>
+      </w:r>
+    </w:p>
+    <w:p>
+      <w:pPr>
+        <w:numPr>
+          <w:ilvl w:val="0"/>
+          <w:numId w:val="1029"/>
+        </w:numPr>
+        <w:pStyle w:val="Compact"/>
+      </w:pPr>
+      <w:r>
+        <w:rPr>
+          <w:bCs/>
+          <w:b/>
+        </w:rPr>
+        <w:t xml:space="preserve">Edges:</w:t>
+      </w:r>
+      <w:r>
+        <w:t xml:space="preserve"> </w:t>
+      </w:r>
+      <w:r>
+        <w:t xml:space="preserve">A friend, Extra Spark; a friend: her ExLAW handler, Agent Dorsey, who covers for her more than he should.</w:t>
+      </w:r>
+    </w:p>
+    <w:p>
+      <w:pPr>
+        <w:numPr>
+          <w:ilvl w:val="0"/>
+          <w:numId w:val="1029"/>
+        </w:numPr>
+        <w:pStyle w:val="Compact"/>
+      </w:pPr>
+      <w:r>
+        <w:rPr>
+          <w:bCs/>
+          <w:b/>
+        </w:rPr>
+        <w:t xml:space="preserve">Advantage:</w:t>
+      </w:r>
+      <w:r>
+        <w:t xml:space="preserve"> </w:t>
+      </w:r>
+      <w:r>
+        <w:t xml:space="preserve">Inhuman Grace (origin; companion: Exile).</w:t>
+      </w:r>
+      <w:r>
+        <w:t xml:space="preserve"> </w:t>
+      </w:r>
+      <w:r>
+        <w:rPr>
+          <w:bCs/>
+          <w:b/>
+        </w:rPr>
+        <w:t xml:space="preserve">Complication:</w:t>
+      </w:r>
+      <w:r>
+        <w:t xml:space="preserve"> </w:t>
+      </w:r>
+      <w:r>
+        <w:t xml:space="preserve">Outsider; trigger: a form that asks for papers you don’t have.</w:t>
+      </w:r>
+    </w:p>
+    <w:p>
+      <w:pPr>
+        <w:numPr>
+          <w:ilvl w:val="0"/>
+          <w:numId w:val="1029"/>
+        </w:numPr>
+        <w:pStyle w:val="Compact"/>
+      </w:pPr>
+      <w:r>
+        <w:rPr>
+          <w:bCs/>
+          <w:b/>
+        </w:rPr>
+        <w:t xml:space="preserve">Powers:</w:t>
+      </w:r>
+      <w:r>
+        <w:t xml:space="preserve"> </w:t>
+      </w:r>
+      <w:r>
+        <w:t xml:space="preserve">Invisibility II, Phasing I, Illusion I.</w:t>
+      </w:r>
+    </w:p>
+    <w:p>
+      <w:pPr>
+        <w:numPr>
+          <w:ilvl w:val="0"/>
+          <w:numId w:val="1029"/>
+        </w:numPr>
+        <w:pStyle w:val="Compact"/>
+      </w:pPr>
+      <w:r>
+        <w:rPr>
+          <w:bCs/>
+          <w:b/>
+        </w:rPr>
+        <w:t xml:space="preserve">Legal status:</w:t>
+      </w:r>
+      <w:r>
+        <w:t xml:space="preserve"> </w:t>
+      </w:r>
+      <w:r>
+        <w:t xml:space="preserve">Convict.</w:t>
+      </w:r>
+    </w:p>
+    <w:p>
+      <w:pPr>
+        <w:numPr>
+          <w:ilvl w:val="0"/>
+          <w:numId w:val="1029"/>
+        </w:numPr>
+        <w:pStyle w:val="Compact"/>
+      </w:pPr>
+      <w:r>
+        <w:rPr>
+          <w:bCs/>
+          <w:b/>
+        </w:rPr>
+        <w:t xml:space="preserve">Why I do this:</w:t>
+      </w:r>
+      <w:r>
+        <w:t xml:space="preserve"> </w:t>
+      </w:r>
+      <w:r>
+        <w:t xml:space="preserve">No lab, no registry and no government owns me.</w:t>
+      </w:r>
+      <w:r>
+        <w:t xml:space="preserve"> </w:t>
+      </w:r>
+      <w:r>
+        <w:rPr>
+          <w:bCs/>
+          <w:b/>
+        </w:rPr>
+        <w:t xml:space="preserve">Connection:</w:t>
+      </w:r>
+      <w:r>
+        <w:t xml:space="preserve"> </w:t>
+      </w:r>
+      <w:r>
         <w:t xml:space="preserve">Dr. Tobias Wren saw through her glamour the first day. He’s kept her secret; she wonders what it’ll cost.</w:t>
       </w:r>
     </w:p>
-    <w:bookmarkEnd w:id="107"/>
     <w:bookmarkEnd w:id="108"/>
-    <w:bookmarkStart w:id="109" w:name="advantages"/>
+    <w:bookmarkEnd w:id="109"/>
+    <w:bookmarkStart w:id="110" w:name="advantages"/>
     <w:p>
       <w:pPr>
         <w:pStyle w:val="Heading1"/>
@@ -28669,8 +29652,8 @@
         <w:t xml:space="preserve">complication unless the GM agrees otherwise. Origin advantages (in each origin’s entry) are often the most flavorful choice for an Operant.</w:t>
       </w:r>
     </w:p>
-    <w:bookmarkEnd w:id="109"/>
-    <w:bookmarkStart w:id="120" w:name="origins"/>
+    <w:bookmarkEnd w:id="110"/>
+    <w:bookmarkStart w:id="121" w:name="origins"/>
     <w:p>
       <w:pPr>
         <w:pStyle w:val="Heading1"/>
@@ -29408,7 +30391,7 @@
         </w:tc>
       </w:tr>
     </w:tbl>
-    <w:bookmarkStart w:id="110" w:name="non-operant"/>
+    <w:bookmarkStart w:id="111" w:name="non-operant"/>
     <w:p>
       <w:pPr>
         <w:pStyle w:val="Heading2"/>
@@ -29453,7 +30436,7 @@
       <w:pPr>
         <w:numPr>
           <w:ilvl w:val="0"/>
-          <w:numId w:val="1029"/>
+          <w:numId w:val="1030"/>
         </w:numPr>
         <w:pStyle w:val="Compact"/>
       </w:pPr>
@@ -29465,7 +30448,7 @@
       <w:pPr>
         <w:numPr>
           <w:ilvl w:val="0"/>
-          <w:numId w:val="1029"/>
+          <w:numId w:val="1030"/>
         </w:numPr>
         <w:pStyle w:val="Compact"/>
       </w:pPr>
@@ -29757,8 +30740,8 @@
         </w:tc>
       </w:tr>
     </w:tbl>
-    <w:bookmarkEnd w:id="110"/>
-    <w:bookmarkStart w:id="111" w:name="adept"/>
+    <w:bookmarkEnd w:id="111"/>
+    <w:bookmarkStart w:id="112" w:name="adept"/>
     <w:p>
       <w:pPr>
         <w:pStyle w:val="Heading2"/>
@@ -29803,19 +30786,19 @@
       <w:pPr>
         <w:numPr>
           <w:ilvl w:val="0"/>
-          <w:numId w:val="1030"/>
+          <w:numId w:val="1031"/>
         </w:numPr>
         <w:pStyle w:val="Compact"/>
       </w:pPr>
       <w:r>
-        <w:t xml:space="preserve">Mystic powers: your own powers come from the mystic list (Warding, Summoning, Mystic Sight, Illusion, Blast, Portals, Astral Projection, Elemental Control, Teleport, Healing).</w:t>
+        <w:t xml:space="preserve">Mystic powers: your own powers come from the mystic list (Cantrips, Warding, Summoning, Mystic Sight, Illusion, Blast, Portals, Astral Projection, Elemental Control, Teleport, Healing).</w:t>
       </w:r>
     </w:p>
     <w:p>
       <w:pPr>
         <w:numPr>
           <w:ilvl w:val="0"/>
-          <w:numId w:val="1030"/>
+          <w:numId w:val="1031"/>
         </w:numPr>
         <w:pStyle w:val="Compact"/>
       </w:pPr>
@@ -29827,7 +30810,7 @@
       <w:pPr>
         <w:numPr>
           <w:ilvl w:val="0"/>
-          <w:numId w:val="1030"/>
+          <w:numId w:val="1031"/>
         </w:numPr>
         <w:pStyle w:val="Compact"/>
       </w:pPr>
@@ -30119,8 +31102,8 @@
         </w:tc>
       </w:tr>
     </w:tbl>
-    <w:bookmarkEnd w:id="111"/>
-    <w:bookmarkStart w:id="112" w:name="aurora-born"/>
+    <w:bookmarkEnd w:id="112"/>
+    <w:bookmarkStart w:id="113" w:name="aurora-born"/>
     <w:p>
       <w:pPr>
         <w:pStyle w:val="Heading2"/>
@@ -30165,7 +31148,7 @@
       <w:pPr>
         <w:numPr>
           <w:ilvl w:val="0"/>
-          <w:numId w:val="1031"/>
+          <w:numId w:val="1032"/>
         </w:numPr>
         <w:pStyle w:val="Compact"/>
       </w:pPr>
@@ -30177,7 +31160,7 @@
       <w:pPr>
         <w:numPr>
           <w:ilvl w:val="0"/>
-          <w:numId w:val="1031"/>
+          <w:numId w:val="1032"/>
         </w:numPr>
         <w:pStyle w:val="Compact"/>
       </w:pPr>
@@ -30469,8 +31452,8 @@
         </w:tc>
       </w:tr>
     </w:tbl>
-    <w:bookmarkEnd w:id="112"/>
-    <w:bookmarkStart w:id="113" w:name="bonded"/>
+    <w:bookmarkEnd w:id="113"/>
+    <w:bookmarkStart w:id="114" w:name="bonded"/>
     <w:p>
       <w:pPr>
         <w:pStyle w:val="Heading2"/>
@@ -30515,7 +31498,7 @@
       <w:pPr>
         <w:numPr>
           <w:ilvl w:val="0"/>
-          <w:numId w:val="1032"/>
+          <w:numId w:val="1033"/>
         </w:numPr>
         <w:pStyle w:val="Compact"/>
       </w:pPr>
@@ -30527,7 +31510,7 @@
       <w:pPr>
         <w:numPr>
           <w:ilvl w:val="0"/>
-          <w:numId w:val="1032"/>
+          <w:numId w:val="1033"/>
         </w:numPr>
         <w:pStyle w:val="Compact"/>
       </w:pPr>
@@ -30539,7 +31522,7 @@
       <w:pPr>
         <w:numPr>
           <w:ilvl w:val="0"/>
-          <w:numId w:val="1032"/>
+          <w:numId w:val="1033"/>
         </w:numPr>
         <w:pStyle w:val="Compact"/>
       </w:pPr>
@@ -30831,8 +31814,8 @@
         </w:tc>
       </w:tr>
     </w:tbl>
-    <w:bookmarkEnd w:id="113"/>
-    <w:bookmarkStart w:id="114" w:name="lab-made"/>
+    <w:bookmarkEnd w:id="114"/>
+    <w:bookmarkStart w:id="115" w:name="lab-made"/>
     <w:p>
       <w:pPr>
         <w:pStyle w:val="Heading2"/>
@@ -30877,7 +31860,7 @@
       <w:pPr>
         <w:numPr>
           <w:ilvl w:val="0"/>
-          <w:numId w:val="1033"/>
+          <w:numId w:val="1034"/>
         </w:numPr>
         <w:pStyle w:val="Compact"/>
       </w:pPr>
@@ -30889,7 +31872,7 @@
       <w:pPr>
         <w:numPr>
           <w:ilvl w:val="0"/>
-          <w:numId w:val="1033"/>
+          <w:numId w:val="1034"/>
         </w:numPr>
         <w:pStyle w:val="Compact"/>
       </w:pPr>
@@ -31181,8 +32164,8 @@
         </w:tc>
       </w:tr>
     </w:tbl>
-    <w:bookmarkEnd w:id="114"/>
-    <w:bookmarkStart w:id="115" w:name="otherworlder"/>
+    <w:bookmarkEnd w:id="115"/>
+    <w:bookmarkStart w:id="116" w:name="otherworlder"/>
     <w:p>
       <w:pPr>
         <w:pStyle w:val="Heading2"/>
@@ -31227,7 +32210,7 @@
       <w:pPr>
         <w:numPr>
           <w:ilvl w:val="0"/>
-          <w:numId w:val="1034"/>
+          <w:numId w:val="1035"/>
         </w:numPr>
         <w:pStyle w:val="Compact"/>
       </w:pPr>
@@ -31239,7 +32222,7 @@
       <w:pPr>
         <w:numPr>
           <w:ilvl w:val="0"/>
-          <w:numId w:val="1034"/>
+          <w:numId w:val="1035"/>
         </w:numPr>
         <w:pStyle w:val="Compact"/>
       </w:pPr>
@@ -31531,8 +32514,8 @@
         </w:tc>
       </w:tr>
     </w:tbl>
-    <w:bookmarkEnd w:id="115"/>
-    <w:bookmarkStart w:id="116" w:name="shadow-earth-defector"/>
+    <w:bookmarkEnd w:id="116"/>
+    <w:bookmarkStart w:id="117" w:name="shadow-earth-defector"/>
     <w:p>
       <w:pPr>
         <w:pStyle w:val="Heading2"/>
@@ -31577,7 +32560,7 @@
       <w:pPr>
         <w:numPr>
           <w:ilvl w:val="0"/>
-          <w:numId w:val="1035"/>
+          <w:numId w:val="1036"/>
         </w:numPr>
         <w:pStyle w:val="Compact"/>
       </w:pPr>
@@ -31589,7 +32572,7 @@
       <w:pPr>
         <w:numPr>
           <w:ilvl w:val="0"/>
-          <w:numId w:val="1035"/>
+          <w:numId w:val="1036"/>
         </w:numPr>
         <w:pStyle w:val="Compact"/>
       </w:pPr>
@@ -31601,7 +32584,7 @@
       <w:pPr>
         <w:numPr>
           <w:ilvl w:val="0"/>
-          <w:numId w:val="1035"/>
+          <w:numId w:val="1036"/>
         </w:numPr>
         <w:pStyle w:val="Compact"/>
       </w:pPr>
@@ -31893,8 +32876,8 @@
         </w:tc>
       </w:tr>
     </w:tbl>
-    <w:bookmarkEnd w:id="116"/>
-    <w:bookmarkStart w:id="117" w:name="touched"/>
+    <w:bookmarkEnd w:id="117"/>
+    <w:bookmarkStart w:id="118" w:name="touched"/>
     <w:p>
       <w:pPr>
         <w:pStyle w:val="Heading2"/>
@@ -31954,7 +32937,7 @@
       <w:pPr>
         <w:numPr>
           <w:ilvl w:val="0"/>
-          <w:numId w:val="1036"/>
+          <w:numId w:val="1037"/>
         </w:numPr>
         <w:pStyle w:val="Compact"/>
       </w:pPr>
@@ -31966,7 +32949,7 @@
       <w:pPr>
         <w:numPr>
           <w:ilvl w:val="0"/>
-          <w:numId w:val="1036"/>
+          <w:numId w:val="1037"/>
         </w:numPr>
         <w:pStyle w:val="Compact"/>
       </w:pPr>
@@ -32258,8 +33241,8 @@
         </w:tc>
       </w:tr>
     </w:tbl>
-    <w:bookmarkEnd w:id="117"/>
-    <w:bookmarkStart w:id="118" w:name="ambrosia"/>
+    <w:bookmarkEnd w:id="118"/>
+    <w:bookmarkStart w:id="119" w:name="ambrosia"/>
     <w:p>
       <w:pPr>
         <w:pStyle w:val="Heading2"/>
@@ -32304,7 +33287,7 @@
       <w:pPr>
         <w:numPr>
           <w:ilvl w:val="0"/>
-          <w:numId w:val="1037"/>
+          <w:numId w:val="1038"/>
         </w:numPr>
         <w:pStyle w:val="Compact"/>
       </w:pPr>
@@ -32316,7 +33299,7 @@
       <w:pPr>
         <w:numPr>
           <w:ilvl w:val="0"/>
-          <w:numId w:val="1037"/>
+          <w:numId w:val="1038"/>
         </w:numPr>
         <w:pStyle w:val="Compact"/>
       </w:pPr>
@@ -32328,7 +33311,7 @@
       <w:pPr>
         <w:numPr>
           <w:ilvl w:val="0"/>
-          <w:numId w:val="1037"/>
+          <w:numId w:val="1038"/>
         </w:numPr>
         <w:pStyle w:val="Compact"/>
       </w:pPr>
@@ -32620,8 +33603,8 @@
         </w:tc>
       </w:tr>
     </w:tbl>
-    <w:bookmarkEnd w:id="118"/>
-    <w:bookmarkStart w:id="119" w:name="mythic"/>
+    <w:bookmarkEnd w:id="119"/>
+    <w:bookmarkStart w:id="120" w:name="mythic"/>
     <w:p>
       <w:pPr>
         <w:pStyle w:val="Heading2"/>
@@ -32666,7 +33649,7 @@
       <w:pPr>
         <w:numPr>
           <w:ilvl w:val="0"/>
-          <w:numId w:val="1038"/>
+          <w:numId w:val="1039"/>
         </w:numPr>
         <w:pStyle w:val="Compact"/>
       </w:pPr>
@@ -32678,7 +33661,7 @@
       <w:pPr>
         <w:numPr>
           <w:ilvl w:val="0"/>
-          <w:numId w:val="1038"/>
+          <w:numId w:val="1039"/>
         </w:numPr>
         <w:pStyle w:val="Compact"/>
       </w:pPr>
@@ -32690,7 +33673,7 @@
       <w:pPr>
         <w:numPr>
           <w:ilvl w:val="0"/>
-          <w:numId w:val="1038"/>
+          <w:numId w:val="1039"/>
         </w:numPr>
         <w:pStyle w:val="Compact"/>
       </w:pPr>
@@ -32982,9 +33965,9 @@
         </w:tc>
       </w:tr>
     </w:tbl>
-    <w:bookmarkEnd w:id="119"/>
     <w:bookmarkEnd w:id="120"/>
-    <w:bookmarkStart w:id="131" w:name="making-your-own"/>
+    <w:bookmarkEnd w:id="121"/>
+    <w:bookmarkStart w:id="132" w:name="making-your-own"/>
     <w:p>
       <w:pPr>
         <w:pStyle w:val="Heading1"/>
@@ -33017,7 +34000,7 @@
         <w:t xml:space="preserve">option at the end of each list, and its checklist holds a custom choice to the same rules as everything else.</w:t>
       </w:r>
     </w:p>
-    <w:bookmarkStart w:id="121" w:name="a-custom-calling"/>
+    <w:bookmarkStart w:id="122" w:name="a-custom-calling"/>
     <w:p>
       <w:pPr>
         <w:pStyle w:val="Heading2"/>
@@ -33038,7 +34021,7 @@
       <w:pPr>
         <w:numPr>
           <w:ilvl w:val="0"/>
-          <w:numId w:val="1039"/>
+          <w:numId w:val="1040"/>
         </w:numPr>
         <w:pStyle w:val="Compact"/>
       </w:pPr>
@@ -33084,7 +34067,7 @@
       <w:pPr>
         <w:numPr>
           <w:ilvl w:val="0"/>
-          <w:numId w:val="1039"/>
+          <w:numId w:val="1040"/>
         </w:numPr>
         <w:pStyle w:val="Compact"/>
       </w:pPr>
@@ -33106,7 +34089,7 @@
       <w:pPr>
         <w:numPr>
           <w:ilvl w:val="0"/>
-          <w:numId w:val="1039"/>
+          <w:numId w:val="1040"/>
         </w:numPr>
         <w:pStyle w:val="Compact"/>
       </w:pPr>
@@ -33128,7 +34111,7 @@
       <w:pPr>
         <w:numPr>
           <w:ilvl w:val="0"/>
-          <w:numId w:val="1039"/>
+          <w:numId w:val="1040"/>
         </w:numPr>
         <w:pStyle w:val="Compact"/>
       </w:pPr>
@@ -33193,8 +34176,8 @@
         <w:t xml:space="preserve">.</w:t>
       </w:r>
     </w:p>
-    <w:bookmarkEnd w:id="121"/>
-    <w:bookmarkStart w:id="130" w:name="a-custom-origin"/>
+    <w:bookmarkEnd w:id="122"/>
+    <w:bookmarkStart w:id="131" w:name="a-custom-origin"/>
     <w:p>
       <w:pPr>
         <w:pStyle w:val="Heading2"/>
@@ -33211,7 +34194,7 @@
         <w:t xml:space="preserve">Build it with the GM, one step at a time.</w:t>
       </w:r>
     </w:p>
-    <w:bookmarkStart w:id="122" w:name="the-concept"/>
+    <w:bookmarkStart w:id="123" w:name="the-concept"/>
     <w:p>
       <w:pPr>
         <w:pStyle w:val="Heading3"/>
@@ -33228,8 +34211,8 @@
         <w:t xml:space="preserve">Two or three sentences: where they come from, what sets them apart, and how others see them. It should be something the origins in this book don’t already cover.</w:t>
       </w:r>
     </w:p>
-    <w:bookmarkEnd w:id="122"/>
-    <w:bookmarkStart w:id="123" w:name="the-tier"/>
+    <w:bookmarkEnd w:id="123"/>
+    <w:bookmarkStart w:id="124" w:name="the-tier"/>
     <w:p>
       <w:pPr>
         <w:pStyle w:val="Heading3"/>
@@ -33526,8 +34509,8 @@
         <w:t xml:space="preserve">When in doubt, choose the higher tier.</w:t>
       </w:r>
     </w:p>
-    <w:bookmarkEnd w:id="123"/>
-    <w:bookmarkStart w:id="124" w:name="attribute-adjustments"/>
+    <w:bookmarkEnd w:id="124"/>
+    <w:bookmarkStart w:id="125" w:name="attribute-adjustments"/>
     <w:p>
       <w:pPr>
         <w:pStyle w:val="Heading3"/>
@@ -33573,8 +34556,8 @@
         <w:t xml:space="preserve">: a +2 needs a −2 or two −1s. The adjustments move the attribute’s base (+1 starts it at 11) and raise its starting maximum (13 plus the bonus). Most origins change two to four attributes.</w:t>
       </w:r>
     </w:p>
-    <w:bookmarkEnd w:id="124"/>
-    <w:bookmarkStart w:id="125" w:name="core-rules-tier-1-and-up"/>
+    <w:bookmarkEnd w:id="125"/>
+    <w:bookmarkStart w:id="126" w:name="core-rules-tier-1-and-up"/>
     <w:p>
       <w:pPr>
         <w:pStyle w:val="Heading3"/>
@@ -33591,8 +34574,8 @@
         <w:t xml:space="preserve">One to three short rules that always apply: what they can do (see in the dark, resist cold, a free Trained skill) and what it costs (a weakness, a people’s distrust, a hazard they can’t abide). A strength with no drawback is worth more than it looks, so price it a tier higher.</w:t>
       </w:r>
     </w:p>
-    <w:bookmarkEnd w:id="125"/>
-    <w:bookmarkStart w:id="126" w:name="origin-advantages"/>
+    <w:bookmarkEnd w:id="126"/>
+    <w:bookmarkStart w:id="127" w:name="origin-advantages"/>
     <w:p>
       <w:pPr>
         <w:pStyle w:val="Heading3"/>
@@ -33647,8 +34630,8 @@
         <w:t xml:space="preserve">: a problem the trait causes, with a clear trigger and a real consequence, which earns a Spark point when it bites, like any complication. A character takes one advantage, general or origin, so make them distinct choices.</w:t>
       </w:r>
     </w:p>
-    <w:bookmarkEnd w:id="126"/>
-    <w:bookmarkStart w:id="127" w:name="an-alternate-form-optional-tier-2-or-3"/>
+    <w:bookmarkEnd w:id="127"/>
+    <w:bookmarkStart w:id="128" w:name="an-alternate-form-optional-tier-2-or-3"/>
     <w:p>
       <w:pPr>
         <w:pStyle w:val="Heading3"/>
@@ -33681,8 +34664,8 @@
         <w:t xml:space="preserve">apply.</w:t>
       </w:r>
     </w:p>
-    <w:bookmarkEnd w:id="127"/>
-    <w:bookmarkStart w:id="128" w:name="in-the-creator"/>
+    <w:bookmarkEnd w:id="128"/>
+    <w:bookmarkStart w:id="129" w:name="in-the-creator"/>
     <w:p>
       <w:pPr>
         <w:pStyle w:val="Heading3"/>
@@ -33695,7 +34678,7 @@
       <w:pPr>
         <w:numPr>
           <w:ilvl w:val="0"/>
-          <w:numId w:val="1040"/>
+          <w:numId w:val="1041"/>
         </w:numPr>
         <w:pStyle w:val="Compact"/>
       </w:pPr>
@@ -33723,7 +34706,7 @@
       <w:pPr>
         <w:numPr>
           <w:ilvl w:val="0"/>
-          <w:numId w:val="1040"/>
+          <w:numId w:val="1041"/>
         </w:numPr>
         <w:pStyle w:val="Compact"/>
       </w:pPr>
@@ -33735,7 +34718,7 @@
       <w:pPr>
         <w:numPr>
           <w:ilvl w:val="0"/>
-          <w:numId w:val="1040"/>
+          <w:numId w:val="1041"/>
         </w:numPr>
         <w:pStyle w:val="Compact"/>
       </w:pPr>
@@ -33763,7 +34746,7 @@
       <w:pPr>
         <w:numPr>
           <w:ilvl w:val="0"/>
-          <w:numId w:val="1040"/>
+          <w:numId w:val="1041"/>
         </w:numPr>
         <w:pStyle w:val="Compact"/>
       </w:pPr>
@@ -33787,8 +34770,8 @@
         <w:t xml:space="preserve">and enter the advantage and its companion complication.</w:t>
       </w:r>
     </w:p>
-    <w:bookmarkEnd w:id="128"/>
-    <w:bookmarkStart w:id="129" w:name="example"/>
+    <w:bookmarkEnd w:id="129"/>
+    <w:bookmarkStart w:id="130" w:name="example"/>
     <w:p>
       <w:pPr>
         <w:pStyle w:val="Heading3"/>
@@ -33909,10 +34892,10 @@
         <w:t xml:space="preserve">one at Class II, two at Class I.</w:t>
       </w:r>
     </w:p>
-    <w:bookmarkEnd w:id="129"/>
     <w:bookmarkEnd w:id="130"/>
     <w:bookmarkEnd w:id="131"/>
-    <w:bookmarkStart w:id="132" w:name="complications"/>
+    <w:bookmarkEnd w:id="132"/>
+    <w:bookmarkStart w:id="133" w:name="complications"/>
     <w:p>
       <w:pPr>
         <w:pStyle w:val="Heading1"/>
@@ -34617,8 +35600,8 @@
         </w:tc>
       </w:tr>
     </w:tbl>
-    <w:bookmarkEnd w:id="132"/>
-    <w:bookmarkStart w:id="134" w:name="quick-reference"/>
+    <w:bookmarkEnd w:id="133"/>
+    <w:bookmarkStart w:id="135" w:name="quick-reference"/>
     <w:p>
       <w:pPr>
         <w:pStyle w:val="Heading1"/>
@@ -34809,7 +35792,7 @@
       <w:r>
         <w:t xml:space="preserve"> </w:t>
       </w:r>
-      <w:hyperlink r:id="rId133">
+      <w:hyperlink r:id="rId134">
         <w:r>
           <w:rPr>
             <w:rStyle w:val="Hyperlink"/>
@@ -34821,7 +35804,7 @@
         <w:t xml:space="preserve">. You may share, adapt, and use it for any purpose, including commercially, as long as you give appropriate credit to the author.</w:t>
       </w:r>
     </w:p>
-    <w:bookmarkEnd w:id="134"/>
+    <w:bookmarkEnd w:id="135"/>
     <w:sectPr/>
   </w:body>
 </w:document>
@@ -35288,6 +36271,9 @@
     <w:abstractNumId w:val="991"/>
   </w:num>
   <w:num w:numId="1039">
+    <w:abstractNumId w:val="991"/>
+  </w:num>
+  <w:num w:numId="1040">
     <w:abstractNumId w:val="99411"/>
     <w:lvlOverride w:ilvl="0">
       <w:startOverride w:val="1"/>
@@ -35317,7 +36303,7 @@
       <w:startOverride w:val="1"/>
     </w:lvlOverride>
   </w:num>
-  <w:num w:numId="1040">
+  <w:num w:numId="1041">
     <w:abstractNumId w:val="99411"/>
     <w:lvlOverride w:ilvl="0">
       <w:startOverride w:val="1"/>

</xml_diff>

<commit_message>
Aurora: every power defines Classes IV to VI (Regeneration included)
Co-Authored-By: Claude Opus 5.5 <noreply@anthropic.com>
Claude-Session: https://claude.ai/code/session_015SADCFzhKijkC2foUmXrpC
</commit_message>
<xml_diff>
--- a/legend-dynamics/aurora/Aurora_Players_Guide.docx
+++ b/legend-dynamics/aurora/Aurora_Players_Guide.docx
@@ -21386,7 +21386,7 @@
         <w:pStyle w:val="FirstParagraph"/>
       </w:pPr>
       <w:r>
-        <w:t xml:space="preserve">Most powers simply go further at Classes IV to VI. Speed, Flight, Super Leaping, Cantrips and Teleport have set limits at every Class: speeds in multiples of the speed of sound (Mach 1 is about 760 mph), and distances in feet and miles. Player characters reach these Classes only by pushing (one action, one box of Strain); the GM’s characters may have them outright.</w:t>
+        <w:t xml:space="preserve">Every power keeps going at Classes IV to VI. Player characters reach Class IV only by pushing (one action, one box of Strain), with the Stronger Power Edge and the GM’s approval, or at a campaign milestone; Class V is an end-of-campaign capstone, and Class VI belongs to the GM’s characters. Speeds are in multiples of the speed of sound (Mach 1 is about 760 mph).</w:t>
       </w:r>
     </w:p>
     <w:tbl>
@@ -21501,6 +21501,710 @@
                 <w:b/>
                 <w:sz w:val="19"/>
               </w:rPr>
+              <w:t xml:space="preserve">Blast</w:t>
+            </w:r>
+          </w:p>
+        </w:tc>
+        <w:tc>
+          <w:tcPr/>
+          <w:p>
+            <w:pPr>
+              <w:pStyle w:val="Compact"/>
+              <w:jc w:val="left"/>
+            </w:pPr>
+            <w:r>
+              <w:rPr>
+                <w:sz w:val="19"/>
+              </w:rPr>
+              <w:t xml:space="preserve">Class IV attack, effective for miles; or Class III across a small area.</w:t>
+            </w:r>
+          </w:p>
+        </w:tc>
+        <w:tc>
+          <w:tcPr/>
+          <w:p>
+            <w:pPr>
+              <w:pStyle w:val="Compact"/>
+              <w:jc w:val="left"/>
+            </w:pPr>
+            <w:r>
+              <w:rPr>
+                <w:sz w:val="19"/>
+              </w:rPr>
+              <w:t xml:space="preserve">Class V attack that can level a building; or Class IV across a city block.</w:t>
+            </w:r>
+          </w:p>
+        </w:tc>
+        <w:tc>
+          <w:tcPr/>
+          <w:p>
+            <w:pPr>
+              <w:pStyle w:val="Compact"/>
+              <w:jc w:val="left"/>
+            </w:pPr>
+            <w:r>
+              <w:rPr>
+                <w:sz w:val="19"/>
+              </w:rPr>
+              <w:t xml:space="preserve">Class VI attack; or Class V across a district.</w:t>
+            </w:r>
+          </w:p>
+        </w:tc>
+      </w:tr>
+      <w:tr>
+        <w:tc>
+          <w:tcPr/>
+          <w:p>
+            <w:pPr>
+              <w:pStyle w:val="Compact"/>
+              <w:jc w:val="left"/>
+            </w:pPr>
+            <w:r>
+              <w:rPr>
+                <w:bCs/>
+                <w:b/>
+                <w:sz w:val="19"/>
+              </w:rPr>
+              <w:t xml:space="preserve">Elemental Control</w:t>
+            </w:r>
+          </w:p>
+        </w:tc>
+        <w:tc>
+          <w:tcPr/>
+          <w:p>
+            <w:pPr>
+              <w:pStyle w:val="Compact"/>
+              <w:jc w:val="left"/>
+            </w:pPr>
+            <w:r>
+              <w:rPr>
+                <w:sz w:val="19"/>
+              </w:rPr>
+              <w:t xml:space="preserve">Shape a neighborhood’s worth: a sinkhole, a river turned aside, a forest in an hour.</w:t>
+            </w:r>
+          </w:p>
+        </w:tc>
+        <w:tc>
+          <w:tcPr/>
+          <w:p>
+            <w:pPr>
+              <w:pStyle w:val="Compact"/>
+              <w:jc w:val="left"/>
+            </w:pPr>
+            <w:r>
+              <w:rPr>
+                <w:sz w:val="19"/>
+              </w:rPr>
+              <w:t xml:space="preserve">Shape a city’s worth: an earthquake, a flood, a storm surge.</w:t>
+            </w:r>
+          </w:p>
+        </w:tc>
+        <w:tc>
+          <w:tcPr/>
+          <w:p>
+            <w:pPr>
+              <w:pStyle w:val="Compact"/>
+              <w:jc w:val="left"/>
+            </w:pPr>
+            <w:r>
+              <w:rPr>
+                <w:sz w:val="19"/>
+              </w:rPr>
+              <w:t xml:space="preserve">Shape a region: raise hills, redraw a coastline.</w:t>
+            </w:r>
+          </w:p>
+        </w:tc>
+      </w:tr>
+      <w:tr>
+        <w:tc>
+          <w:tcPr/>
+          <w:p>
+            <w:pPr>
+              <w:pStyle w:val="Compact"/>
+              <w:jc w:val="left"/>
+            </w:pPr>
+            <w:r>
+              <w:rPr>
+                <w:bCs/>
+                <w:b/>
+                <w:sz w:val="19"/>
+              </w:rPr>
+              <w:t xml:space="preserve">Weather Control</w:t>
+            </w:r>
+          </w:p>
+        </w:tc>
+        <w:tc>
+          <w:tcPr/>
+          <w:p>
+            <w:pPr>
+              <w:pStyle w:val="Compact"/>
+              <w:jc w:val="left"/>
+            </w:pPr>
+            <w:r>
+              <w:rPr>
+                <w:sz w:val="19"/>
+              </w:rPr>
+              <w:t xml:space="preserve">A storm over a region: tornadoes, Class IV lightning.</w:t>
+            </w:r>
+          </w:p>
+        </w:tc>
+        <w:tc>
+          <w:tcPr/>
+          <w:p>
+            <w:pPr>
+              <w:pStyle w:val="Compact"/>
+              <w:jc w:val="left"/>
+            </w:pPr>
+            <w:r>
+              <w:rPr>
+                <w:sz w:val="19"/>
+              </w:rPr>
+              <w:t xml:space="preserve">A hurricane, and you steer it.</w:t>
+            </w:r>
+          </w:p>
+        </w:tc>
+        <w:tc>
+          <w:tcPr/>
+          <w:p>
+            <w:pPr>
+              <w:pStyle w:val="Compact"/>
+              <w:jc w:val="left"/>
+            </w:pPr>
+            <w:r>
+              <w:rPr>
+                <w:sz w:val="19"/>
+              </w:rPr>
+              <w:t xml:space="preserve">Change a continent’s weather for a season.</w:t>
+            </w:r>
+          </w:p>
+        </w:tc>
+      </w:tr>
+      <w:tr>
+        <w:tc>
+          <w:tcPr/>
+          <w:p>
+            <w:pPr>
+              <w:pStyle w:val="Compact"/>
+              <w:jc w:val="left"/>
+            </w:pPr>
+            <w:r>
+              <w:rPr>
+                <w:bCs/>
+                <w:b/>
+                <w:sz w:val="19"/>
+              </w:rPr>
+              <w:t xml:space="preserve">Darkness / Shadow</w:t>
+            </w:r>
+          </w:p>
+        </w:tc>
+        <w:tc>
+          <w:tcPr/>
+          <w:p>
+            <w:pPr>
+              <w:pStyle w:val="Compact"/>
+              <w:jc w:val="left"/>
+            </w:pPr>
+            <w:r>
+              <w:rPr>
+                <w:sz w:val="19"/>
+              </w:rPr>
+              <w:t xml:space="preserve">Plunge a neighborhood into night; constructs make Class III attacks.</w:t>
+            </w:r>
+          </w:p>
+        </w:tc>
+        <w:tc>
+          <w:tcPr/>
+          <w:p>
+            <w:pPr>
+              <w:pStyle w:val="Compact"/>
+              <w:jc w:val="left"/>
+            </w:pPr>
+            <w:r>
+              <w:rPr>
+                <w:sz w:val="19"/>
+              </w:rPr>
+              <w:t xml:space="preserve">Night over a city; step through shadows anywhere in it.</w:t>
+            </w:r>
+          </w:p>
+        </w:tc>
+        <w:tc>
+          <w:tcPr/>
+          <w:p>
+            <w:pPr>
+              <w:pStyle w:val="Compact"/>
+              <w:jc w:val="left"/>
+            </w:pPr>
+            <w:r>
+              <w:rPr>
+                <w:sz w:val="19"/>
+              </w:rPr>
+              <w:t xml:space="preserve">Open a road through shadow to anywhere, even Shadow Earth.</w:t>
+            </w:r>
+          </w:p>
+        </w:tc>
+      </w:tr>
+      <w:tr>
+        <w:tc>
+          <w:tcPr/>
+          <w:p>
+            <w:pPr>
+              <w:pStyle w:val="Compact"/>
+              <w:jc w:val="left"/>
+            </w:pPr>
+            <w:r>
+              <w:rPr>
+                <w:bCs/>
+                <w:b/>
+                <w:sz w:val="19"/>
+              </w:rPr>
+              <w:t xml:space="preserve">Gravity / Density</w:t>
+            </w:r>
+          </w:p>
+        </w:tc>
+        <w:tc>
+          <w:tcPr/>
+          <w:p>
+            <w:pPr>
+              <w:pStyle w:val="Compact"/>
+              <w:jc w:val="left"/>
+            </w:pPr>
+            <w:r>
+              <w:rPr>
+                <w:sz w:val="19"/>
+              </w:rPr>
+              <w:t xml:space="preserve">Crush a building’s frame; Defense IV; hurl a truck as a Class IV attack.</w:t>
+            </w:r>
+          </w:p>
+        </w:tc>
+        <w:tc>
+          <w:tcPr/>
+          <w:p>
+            <w:pPr>
+              <w:pStyle w:val="Compact"/>
+              <w:jc w:val="left"/>
+            </w:pPr>
+            <w:r>
+              <w:rPr>
+                <w:sz w:val="19"/>
+              </w:rPr>
+              <w:t xml:space="preserve">Pull an aircraft out of the sky; Defense V.</w:t>
+            </w:r>
+          </w:p>
+        </w:tc>
+        <w:tc>
+          <w:tcPr/>
+          <w:p>
+            <w:pPr>
+              <w:pStyle w:val="Compact"/>
+              <w:jc w:val="left"/>
+            </w:pPr>
+            <w:r>
+              <w:rPr>
+                <w:sz w:val="19"/>
+              </w:rPr>
+              <w:t xml:space="preserve">Bend gravity over a city; Defense VI.</w:t>
+            </w:r>
+          </w:p>
+        </w:tc>
+      </w:tr>
+      <w:tr>
+        <w:tc>
+          <w:tcPr/>
+          <w:p>
+            <w:pPr>
+              <w:pStyle w:val="Compact"/>
+              <w:jc w:val="left"/>
+            </w:pPr>
+            <w:r>
+              <w:rPr>
+                <w:bCs/>
+                <w:b/>
+                <w:sz w:val="19"/>
+              </w:rPr>
+              <w:t xml:space="preserve">Energy Absorption</w:t>
+            </w:r>
+          </w:p>
+        </w:tc>
+        <w:tc>
+          <w:tcPr/>
+          <w:p>
+            <w:pPr>
+              <w:pStyle w:val="Compact"/>
+              <w:jc w:val="left"/>
+            </w:pPr>
+            <w:r>
+              <w:rPr>
+                <w:sz w:val="19"/>
+              </w:rPr>
+              <w:t xml:space="preserve">Ignore your type up to Class IV; absorbed energy fuels a Class IV Blast.</w:t>
+            </w:r>
+          </w:p>
+        </w:tc>
+        <w:tc>
+          <w:tcPr/>
+          <w:p>
+            <w:pPr>
+              <w:pStyle w:val="Compact"/>
+              <w:jc w:val="left"/>
+            </w:pPr>
+            <w:r>
+              <w:rPr>
+                <w:sz w:val="19"/>
+              </w:rPr>
+              <w:t xml:space="preserve">Ignore your type up to Class V.</w:t>
+            </w:r>
+          </w:p>
+        </w:tc>
+        <w:tc>
+          <w:tcPr/>
+          <w:p>
+            <w:pPr>
+              <w:pStyle w:val="Compact"/>
+              <w:jc w:val="left"/>
+            </w:pPr>
+            <w:r>
+              <w:rPr>
+                <w:sz w:val="19"/>
+              </w:rPr>
+              <w:t xml:space="preserve">Drink anything of your type, even a nuclear blast.</w:t>
+            </w:r>
+          </w:p>
+        </w:tc>
+      </w:tr>
+      <w:tr>
+        <w:tc>
+          <w:tcPr/>
+          <w:p>
+            <w:pPr>
+              <w:pStyle w:val="Compact"/>
+              <w:jc w:val="left"/>
+            </w:pPr>
+            <w:r>
+              <w:rPr>
+                <w:bCs/>
+                <w:b/>
+                <w:sz w:val="19"/>
+              </w:rPr>
+              <w:t xml:space="preserve">Natural Weapons</w:t>
+            </w:r>
+          </w:p>
+        </w:tc>
+        <w:tc>
+          <w:tcPr/>
+          <w:p>
+            <w:pPr>
+              <w:pStyle w:val="Compact"/>
+              <w:jc w:val="left"/>
+            </w:pPr>
+            <w:r>
+              <w:rPr>
+                <w:sz w:val="19"/>
+              </w:rPr>
+              <w:t xml:space="preserve">Unarmed hits are Class IV; they carve through tank armor.</w:t>
+            </w:r>
+          </w:p>
+        </w:tc>
+        <w:tc>
+          <w:tcPr/>
+          <w:p>
+            <w:pPr>
+              <w:pStyle w:val="Compact"/>
+              <w:jc w:val="left"/>
+            </w:pPr>
+            <w:r>
+              <w:rPr>
+                <w:sz w:val="19"/>
+              </w:rPr>
+              <w:t xml:space="preserve">Class V; they cut through a bank vault.</w:t>
+            </w:r>
+          </w:p>
+        </w:tc>
+        <w:tc>
+          <w:tcPr/>
+          <w:p>
+            <w:pPr>
+              <w:pStyle w:val="Compact"/>
+              <w:jc w:val="left"/>
+            </w:pPr>
+            <w:r>
+              <w:rPr>
+                <w:sz w:val="19"/>
+              </w:rPr>
+              <w:t xml:space="preserve">Class VI; nothing made can stop them.</w:t>
+            </w:r>
+          </w:p>
+        </w:tc>
+      </w:tr>
+      <w:tr>
+        <w:tc>
+          <w:tcPr/>
+          <w:p>
+            <w:pPr>
+              <w:pStyle w:val="Compact"/>
+              <w:jc w:val="left"/>
+            </w:pPr>
+            <w:r>
+              <w:rPr>
+                <w:bCs/>
+                <w:b/>
+                <w:sz w:val="19"/>
+              </w:rPr>
+              <w:t xml:space="preserve">Manifest</w:t>
+            </w:r>
+          </w:p>
+        </w:tc>
+        <w:tc>
+          <w:tcPr/>
+          <w:p>
+            <w:pPr>
+              <w:pStyle w:val="Compact"/>
+              <w:jc w:val="left"/>
+            </w:pPr>
+            <w:r>
+              <w:rPr>
+                <w:sz w:val="19"/>
+              </w:rPr>
+              <w:t xml:space="preserve">Military hardware, a tank’s main gun: Class IV attacks.</w:t>
+            </w:r>
+          </w:p>
+        </w:tc>
+        <w:tc>
+          <w:tcPr/>
+          <w:p>
+            <w:pPr>
+              <w:pStyle w:val="Compact"/>
+              <w:jc w:val="left"/>
+            </w:pPr>
+            <w:r>
+              <w:rPr>
+                <w:sz w:val="19"/>
+              </w:rPr>
+              <w:t xml:space="preserve">A warship’s worth of matter; Class V attacks.</w:t>
+            </w:r>
+          </w:p>
+        </w:tc>
+        <w:tc>
+          <w:tcPr/>
+          <w:p>
+            <w:pPr>
+              <w:pStyle w:val="Compact"/>
+              <w:jc w:val="left"/>
+            </w:pPr>
+            <w:r>
+              <w:rPr>
+                <w:sz w:val="19"/>
+              </w:rPr>
+              <w:t xml:space="preserve">Raise a fortress from nothing.</w:t>
+            </w:r>
+          </w:p>
+        </w:tc>
+      </w:tr>
+      <w:tr>
+        <w:tc>
+          <w:tcPr/>
+          <w:p>
+            <w:pPr>
+              <w:pStyle w:val="Compact"/>
+              <w:jc w:val="left"/>
+            </w:pPr>
+            <w:r>
+              <w:rPr>
+                <w:bCs/>
+                <w:b/>
+                <w:sz w:val="19"/>
+              </w:rPr>
+              <w:t xml:space="preserve">Strength</w:t>
+            </w:r>
+          </w:p>
+        </w:tc>
+        <w:tc>
+          <w:tcPr/>
+          <w:p>
+            <w:pPr>
+              <w:pStyle w:val="Compact"/>
+              <w:jc w:val="left"/>
+            </w:pPr>
+            <w:r>
+              <w:rPr>
+                <w:sz w:val="19"/>
+              </w:rPr>
+              <w:t xml:space="preserve">Lift a tank or a jet; unarmed hits are Class IV.</w:t>
+            </w:r>
+          </w:p>
+        </w:tc>
+        <w:tc>
+          <w:tcPr/>
+          <w:p>
+            <w:pPr>
+              <w:pStyle w:val="Compact"/>
+              <w:jc w:val="left"/>
+            </w:pPr>
+            <w:r>
+              <w:rPr>
+                <w:sz w:val="19"/>
+              </w:rPr>
+              <w:t xml:space="preserve">Lift a ship or a building’s floor; Class V.</w:t>
+            </w:r>
+          </w:p>
+        </w:tc>
+        <w:tc>
+          <w:tcPr/>
+          <w:p>
+            <w:pPr>
+              <w:pStyle w:val="Compact"/>
+              <w:jc w:val="left"/>
+            </w:pPr>
+            <w:r>
+              <w:rPr>
+                <w:sz w:val="19"/>
+              </w:rPr>
+              <w:t xml:space="preserve">Move a mountain’s worth; Class VI.</w:t>
+            </w:r>
+          </w:p>
+        </w:tc>
+      </w:tr>
+      <w:tr>
+        <w:tc>
+          <w:tcPr/>
+          <w:p>
+            <w:pPr>
+              <w:pStyle w:val="Compact"/>
+              <w:jc w:val="left"/>
+            </w:pPr>
+            <w:r>
+              <w:rPr>
+                <w:bCs/>
+                <w:b/>
+                <w:sz w:val="19"/>
+              </w:rPr>
+              <w:t xml:space="preserve">Toughness</w:t>
+            </w:r>
+          </w:p>
+        </w:tc>
+        <w:tc>
+          <w:tcPr/>
+          <w:p>
+            <w:pPr>
+              <w:pStyle w:val="Compact"/>
+              <w:jc w:val="left"/>
+            </w:pPr>
+            <w:r>
+              <w:rPr>
+                <w:sz w:val="19"/>
+              </w:rPr>
+              <w:t xml:space="preserve">Defense IV.</w:t>
+            </w:r>
+          </w:p>
+        </w:tc>
+        <w:tc>
+          <w:tcPr/>
+          <w:p>
+            <w:pPr>
+              <w:pStyle w:val="Compact"/>
+              <w:jc w:val="left"/>
+            </w:pPr>
+            <w:r>
+              <w:rPr>
+                <w:sz w:val="19"/>
+              </w:rPr>
+              <w:t xml:space="preserve">Defense V.</w:t>
+            </w:r>
+          </w:p>
+        </w:tc>
+        <w:tc>
+          <w:tcPr/>
+          <w:p>
+            <w:pPr>
+              <w:pStyle w:val="Compact"/>
+              <w:jc w:val="left"/>
+            </w:pPr>
+            <w:r>
+              <w:rPr>
+                <w:sz w:val="19"/>
+              </w:rPr>
+              <w:t xml:space="preserve">Defense VI.</w:t>
+            </w:r>
+          </w:p>
+        </w:tc>
+      </w:tr>
+      <w:tr>
+        <w:tc>
+          <w:tcPr/>
+          <w:p>
+            <w:pPr>
+              <w:pStyle w:val="Compact"/>
+              <w:jc w:val="left"/>
+            </w:pPr>
+            <w:r>
+              <w:rPr>
+                <w:bCs/>
+                <w:b/>
+                <w:sz w:val="19"/>
+              </w:rPr>
+              <w:t xml:space="preserve">Force Field</w:t>
+            </w:r>
+          </w:p>
+        </w:tc>
+        <w:tc>
+          <w:tcPr/>
+          <w:p>
+            <w:pPr>
+              <w:pStyle w:val="Compact"/>
+              <w:jc w:val="left"/>
+            </w:pPr>
+            <w:r>
+              <w:rPr>
+                <w:sz w:val="19"/>
+              </w:rPr>
+              <w:t xml:space="preserve">Defense IV, or Defense III around a building.</w:t>
+            </w:r>
+          </w:p>
+        </w:tc>
+        <w:tc>
+          <w:tcPr/>
+          <w:p>
+            <w:pPr>
+              <w:pStyle w:val="Compact"/>
+              <w:jc w:val="left"/>
+            </w:pPr>
+            <w:r>
+              <w:rPr>
+                <w:sz w:val="19"/>
+              </w:rPr>
+              <w:t xml:space="preserve">Defense V, or Defense IV around a city block.</w:t>
+            </w:r>
+          </w:p>
+        </w:tc>
+        <w:tc>
+          <w:tcPr/>
+          <w:p>
+            <w:pPr>
+              <w:pStyle w:val="Compact"/>
+              <w:jc w:val="left"/>
+            </w:pPr>
+            <w:r>
+              <w:rPr>
+                <w:sz w:val="19"/>
+              </w:rPr>
+              <w:t xml:space="preserve">Defense VI, or shield a city.</w:t>
+            </w:r>
+          </w:p>
+        </w:tc>
+      </w:tr>
+      <w:tr>
+        <w:tc>
+          <w:tcPr/>
+          <w:p>
+            <w:pPr>
+              <w:pStyle w:val="Compact"/>
+              <w:jc w:val="left"/>
+            </w:pPr>
+            <w:r>
+              <w:rPr>
+                <w:bCs/>
+                <w:b/>
+                <w:sz w:val="19"/>
+              </w:rPr>
               <w:t xml:space="preserve">Speed</w:t>
             </w:r>
           </w:p>
@@ -21693,6 +22397,1478 @@
                 <w:b/>
                 <w:sz w:val="19"/>
               </w:rPr>
+              <w:t xml:space="preserve">Wall-Crawling</w:t>
+            </w:r>
+          </w:p>
+        </w:tc>
+        <w:tc>
+          <w:tcPr/>
+          <w:p>
+            <w:pPr>
+              <w:pStyle w:val="Compact"/>
+              <w:jc w:val="left"/>
+            </w:pPr>
+            <w:r>
+              <w:rPr>
+                <w:sz w:val="19"/>
+              </w:rPr>
+              <w:t xml:space="preserve">Cling to anything, even glass in a hurricane or a spaceship’s hull.</w:t>
+            </w:r>
+          </w:p>
+        </w:tc>
+        <w:tc>
+          <w:tcPr/>
+          <w:p>
+            <w:pPr>
+              <w:pStyle w:val="Compact"/>
+              <w:jc w:val="left"/>
+            </w:pPr>
+            <w:r>
+              <w:rPr>
+                <w:sz w:val="19"/>
+              </w:rPr>
+              <w:t xml:space="preserve">Walk on water, smoke or any surface.</w:t>
+            </w:r>
+          </w:p>
+        </w:tc>
+        <w:tc>
+          <w:tcPr/>
+          <w:p>
+            <w:pPr>
+              <w:pStyle w:val="Compact"/>
+              <w:jc w:val="left"/>
+            </w:pPr>
+            <w:r>
+              <w:rPr>
+                <w:sz w:val="19"/>
+              </w:rPr>
+              <w:t xml:space="preserve">Stand on the air as if it were ground.</w:t>
+            </w:r>
+          </w:p>
+        </w:tc>
+      </w:tr>
+      <w:tr>
+        <w:tc>
+          <w:tcPr/>
+          <w:p>
+            <w:pPr>
+              <w:pStyle w:val="Compact"/>
+              <w:jc w:val="left"/>
+            </w:pPr>
+            <w:r>
+              <w:rPr>
+                <w:bCs/>
+                <w:b/>
+                <w:sz w:val="19"/>
+              </w:rPr>
+              <w:t xml:space="preserve">Regeneration</w:t>
+            </w:r>
+          </w:p>
+        </w:tc>
+        <w:tc>
+          <w:tcPr/>
+          <w:p>
+            <w:pPr>
+              <w:pStyle w:val="Compact"/>
+              <w:jc w:val="left"/>
+            </w:pPr>
+            <w:r>
+              <w:rPr>
+                <w:sz w:val="19"/>
+              </w:rPr>
+              <w:t xml:space="preserve">Clear one box at the start of each of your turns. A hit that would leave you Dying leaves you Incapacitated instead, and you’re back up in a round.</w:t>
+            </w:r>
+          </w:p>
+        </w:tc>
+        <w:tc>
+          <w:tcPr/>
+          <w:p>
+            <w:pPr>
+              <w:pStyle w:val="Compact"/>
+              <w:jc w:val="left"/>
+            </w:pPr>
+            <w:r>
+              <w:rPr>
+                <w:sz w:val="19"/>
+              </w:rPr>
+              <w:t xml:space="preserve">Clear one box each turn, two after a hit that marks 3 or more. Only certain death stops you, and even then you recover within the hour unless your body is destroyed outright.</w:t>
+            </w:r>
+          </w:p>
+        </w:tc>
+        <w:tc>
+          <w:tcPr/>
+          <w:p>
+            <w:pPr>
+              <w:pStyle w:val="Compact"/>
+              <w:jc w:val="left"/>
+            </w:pPr>
+            <w:r>
+              <w:rPr>
+                <w:sz w:val="19"/>
+              </w:rPr>
+              <w:t xml:space="preserve">Nothing short of total annihilation keeps you down.</w:t>
+            </w:r>
+          </w:p>
+        </w:tc>
+      </w:tr>
+      <w:tr>
+        <w:tc>
+          <w:tcPr/>
+          <w:p>
+            <w:pPr>
+              <w:pStyle w:val="Compact"/>
+              <w:jc w:val="left"/>
+            </w:pPr>
+            <w:r>
+              <w:rPr>
+                <w:bCs/>
+                <w:b/>
+                <w:sz w:val="19"/>
+              </w:rPr>
+              <w:t xml:space="preserve">Adaptation</w:t>
+            </w:r>
+          </w:p>
+        </w:tc>
+        <w:tc>
+          <w:tcPr/>
+          <w:p>
+            <w:pPr>
+              <w:pStyle w:val="Compact"/>
+              <w:jc w:val="left"/>
+            </w:pPr>
+            <w:r>
+              <w:rPr>
+                <w:sz w:val="19"/>
+              </w:rPr>
+              <w:t xml:space="preserve">Survive vacuum, lava or the ocean floor indefinitely.</w:t>
+            </w:r>
+          </w:p>
+        </w:tc>
+        <w:tc>
+          <w:tcPr/>
+          <w:p>
+            <w:pPr>
+              <w:pStyle w:val="Compact"/>
+              <w:jc w:val="left"/>
+            </w:pPr>
+            <w:r>
+              <w:rPr>
+                <w:sz w:val="19"/>
+              </w:rPr>
+              <w:t xml:space="preserve">Survive on other worlds and in other dimensions.</w:t>
+            </w:r>
+          </w:p>
+        </w:tc>
+        <w:tc>
+          <w:tcPr/>
+          <w:p>
+            <w:pPr>
+              <w:pStyle w:val="Compact"/>
+              <w:jc w:val="left"/>
+            </w:pPr>
+            <w:r>
+              <w:rPr>
+                <w:sz w:val="19"/>
+              </w:rPr>
+              <w:t xml:space="preserve">Survive anything that doesn’t destroy you outright, even a star’s surface for a while.</w:t>
+            </w:r>
+          </w:p>
+        </w:tc>
+      </w:tr>
+      <w:tr>
+        <w:tc>
+          <w:tcPr/>
+          <w:p>
+            <w:pPr>
+              <w:pStyle w:val="Compact"/>
+              <w:jc w:val="left"/>
+            </w:pPr>
+            <w:r>
+              <w:rPr>
+                <w:bCs/>
+                <w:b/>
+                <w:sz w:val="19"/>
+              </w:rPr>
+              <w:t xml:space="preserve">Size Change</w:t>
+            </w:r>
+          </w:p>
+        </w:tc>
+        <w:tc>
+          <w:tcPr/>
+          <w:p>
+            <w:pPr>
+              <w:pStyle w:val="Compact"/>
+              <w:jc w:val="left"/>
+            </w:pPr>
+            <w:r>
+              <w:rPr>
+                <w:sz w:val="19"/>
+              </w:rPr>
+              <w:t xml:space="preserve">Grow to 100 feet (Strength III and Toughness III while big), or shrink to dust.</w:t>
+            </w:r>
+          </w:p>
+        </w:tc>
+        <w:tc>
+          <w:tcPr/>
+          <w:p>
+            <w:pPr>
+              <w:pStyle w:val="Compact"/>
+              <w:jc w:val="left"/>
+            </w:pPr>
+            <w:r>
+              <w:rPr>
+                <w:sz w:val="19"/>
+              </w:rPr>
+              <w:t xml:space="preserve">300 feet (Strength IV and Toughness IV), or subatomic.</w:t>
+            </w:r>
+          </w:p>
+        </w:tc>
+        <w:tc>
+          <w:tcPr/>
+          <w:p>
+            <w:pPr>
+              <w:pStyle w:val="Compact"/>
+              <w:jc w:val="left"/>
+            </w:pPr>
+            <w:r>
+              <w:rPr>
+                <w:sz w:val="19"/>
+              </w:rPr>
+              <w:t xml:space="preserve">Kaiju-sized (Strength V and Toughness V), or small enough to slip between worlds.</w:t>
+            </w:r>
+          </w:p>
+        </w:tc>
+      </w:tr>
+      <w:tr>
+        <w:tc>
+          <w:tcPr/>
+          <w:p>
+            <w:pPr>
+              <w:pStyle w:val="Compact"/>
+              <w:jc w:val="left"/>
+            </w:pPr>
+            <w:r>
+              <w:rPr>
+                <w:bCs/>
+                <w:b/>
+                <w:sz w:val="19"/>
+              </w:rPr>
+              <w:t xml:space="preserve">Stretching</w:t>
+            </w:r>
+          </w:p>
+        </w:tc>
+        <w:tc>
+          <w:tcPr/>
+          <w:p>
+            <w:pPr>
+              <w:pStyle w:val="Compact"/>
+              <w:jc w:val="left"/>
+            </w:pPr>
+            <w:r>
+              <w:rPr>
+                <w:sz w:val="19"/>
+              </w:rPr>
+              <w:t xml:space="preserve">Stretch a quarter mile; wrap a building; bounce Class III hits back.</w:t>
+            </w:r>
+          </w:p>
+        </w:tc>
+        <w:tc>
+          <w:tcPr/>
+          <w:p>
+            <w:pPr>
+              <w:pStyle w:val="Compact"/>
+              <w:jc w:val="left"/>
+            </w:pPr>
+            <w:r>
+              <w:rPr>
+                <w:sz w:val="19"/>
+              </w:rPr>
+              <w:t xml:space="preserve">Stretch a mile; bounce Class IV hits back.</w:t>
+            </w:r>
+          </w:p>
+        </w:tc>
+        <w:tc>
+          <w:tcPr/>
+          <w:p>
+            <w:pPr>
+              <w:pStyle w:val="Compact"/>
+              <w:jc w:val="left"/>
+            </w:pPr>
+            <w:r>
+              <w:rPr>
+                <w:sz w:val="19"/>
+              </w:rPr>
+              <w:t xml:space="preserve">Bounce Class V hits back; force can barely harm you.</w:t>
+            </w:r>
+          </w:p>
+        </w:tc>
+      </w:tr>
+      <w:tr>
+        <w:tc>
+          <w:tcPr/>
+          <w:p>
+            <w:pPr>
+              <w:pStyle w:val="Compact"/>
+              <w:jc w:val="left"/>
+            </w:pPr>
+            <w:r>
+              <w:rPr>
+                <w:bCs/>
+                <w:b/>
+                <w:sz w:val="19"/>
+              </w:rPr>
+              <w:t xml:space="preserve">Invisibility</w:t>
+            </w:r>
+          </w:p>
+        </w:tc>
+        <w:tc>
+          <w:tcPr/>
+          <w:p>
+            <w:pPr>
+              <w:pStyle w:val="Compact"/>
+              <w:jc w:val="left"/>
+            </w:pPr>
+            <w:r>
+              <w:rPr>
+                <w:sz w:val="19"/>
+              </w:rPr>
+              <w:t xml:space="preserve">Invisible to every sense, and to powers below Class IV, with a group.</w:t>
+            </w:r>
+          </w:p>
+        </w:tc>
+        <w:tc>
+          <w:tcPr/>
+          <w:p>
+            <w:pPr>
+              <w:pStyle w:val="Compact"/>
+              <w:jc w:val="left"/>
+            </w:pPr>
+            <w:r>
+              <w:rPr>
+                <w:sz w:val="19"/>
+              </w:rPr>
+              <w:t xml:space="preserve">Make a building vanish.</w:t>
+            </w:r>
+          </w:p>
+        </w:tc>
+        <w:tc>
+          <w:tcPr/>
+          <w:p>
+            <w:pPr>
+              <w:pStyle w:val="Compact"/>
+              <w:jc w:val="left"/>
+            </w:pPr>
+            <w:r>
+              <w:rPr>
+                <w:sz w:val="19"/>
+              </w:rPr>
+              <w:t xml:space="preserve">Slip from notice entirely: people forget you were there.</w:t>
+            </w:r>
+          </w:p>
+        </w:tc>
+      </w:tr>
+      <w:tr>
+        <w:tc>
+          <w:tcPr/>
+          <w:p>
+            <w:pPr>
+              <w:pStyle w:val="Compact"/>
+              <w:jc w:val="left"/>
+            </w:pPr>
+            <w:r>
+              <w:rPr>
+                <w:bCs/>
+                <w:b/>
+                <w:sz w:val="19"/>
+              </w:rPr>
+              <w:t xml:space="preserve">Phasing</w:t>
+            </w:r>
+          </w:p>
+        </w:tc>
+        <w:tc>
+          <w:tcPr/>
+          <w:p>
+            <w:pPr>
+              <w:pStyle w:val="Compact"/>
+              <w:jc w:val="left"/>
+            </w:pPr>
+            <w:r>
+              <w:rPr>
+                <w:sz w:val="19"/>
+              </w:rPr>
+              <w:t xml:space="preserve">Attacks below Class IV pass through you; carry others through walls.</w:t>
+            </w:r>
+          </w:p>
+        </w:tc>
+        <w:tc>
+          <w:tcPr/>
+          <w:p>
+            <w:pPr>
+              <w:pStyle w:val="Compact"/>
+              <w:jc w:val="left"/>
+            </w:pPr>
+            <w:r>
+              <w:rPr>
+                <w:sz w:val="19"/>
+              </w:rPr>
+              <w:t xml:space="preserve">Phase a vehicle or a crowd through anything.</w:t>
+            </w:r>
+          </w:p>
+        </w:tc>
+        <w:tc>
+          <w:tcPr/>
+          <w:p>
+            <w:pPr>
+              <w:pStyle w:val="Compact"/>
+              <w:jc w:val="left"/>
+            </w:pPr>
+            <w:r>
+              <w:rPr>
+                <w:sz w:val="19"/>
+              </w:rPr>
+              <w:t xml:space="preserve">Untouchable; phase through realities into Otherworld.</w:t>
+            </w:r>
+          </w:p>
+        </w:tc>
+      </w:tr>
+      <w:tr>
+        <w:tc>
+          <w:tcPr/>
+          <w:p>
+            <w:pPr>
+              <w:pStyle w:val="Compact"/>
+              <w:jc w:val="left"/>
+            </w:pPr>
+            <w:r>
+              <w:rPr>
+                <w:bCs/>
+                <w:b/>
+                <w:sz w:val="19"/>
+              </w:rPr>
+              <w:t xml:space="preserve">Duplication</w:t>
+            </w:r>
+          </w:p>
+        </w:tc>
+        <w:tc>
+          <w:tcPr/>
+          <w:p>
+            <w:pPr>
+              <w:pStyle w:val="Compact"/>
+              <w:jc w:val="left"/>
+            </w:pPr>
+            <w:r>
+              <w:rPr>
+                <w:sz w:val="19"/>
+              </w:rPr>
+              <w:t xml:space="preserve">A hundred copies.</w:t>
+            </w:r>
+          </w:p>
+        </w:tc>
+        <w:tc>
+          <w:tcPr/>
+          <w:p>
+            <w:pPr>
+              <w:pStyle w:val="Compact"/>
+              <w:jc w:val="left"/>
+            </w:pPr>
+            <w:r>
+              <w:rPr>
+                <w:sz w:val="19"/>
+              </w:rPr>
+              <w:t xml:space="preserve">An army of copies across a city.</w:t>
+            </w:r>
+          </w:p>
+        </w:tc>
+        <w:tc>
+          <w:tcPr/>
+          <w:p>
+            <w:pPr>
+              <w:pStyle w:val="Compact"/>
+              <w:jc w:val="left"/>
+            </w:pPr>
+            <w:r>
+              <w:rPr>
+                <w:sz w:val="19"/>
+              </w:rPr>
+              <w:t xml:space="preserve">Copies anywhere you’ve ever been.</w:t>
+            </w:r>
+          </w:p>
+        </w:tc>
+      </w:tr>
+      <w:tr>
+        <w:tc>
+          <w:tcPr/>
+          <w:p>
+            <w:pPr>
+              <w:pStyle w:val="Compact"/>
+              <w:jc w:val="left"/>
+            </w:pPr>
+            <w:r>
+              <w:rPr>
+                <w:bCs/>
+                <w:b/>
+                <w:sz w:val="19"/>
+              </w:rPr>
+              <w:t xml:space="preserve">Transformation</w:t>
+            </w:r>
+          </w:p>
+        </w:tc>
+        <w:tc>
+          <w:tcPr/>
+          <w:p>
+            <w:pPr>
+              <w:pStyle w:val="Compact"/>
+              <w:jc w:val="left"/>
+            </w:pPr>
+            <w:r>
+              <w:rPr>
+                <w:sz w:val="19"/>
+              </w:rPr>
+              <w:t xml:space="preserve">The form’s powers rise to Class IV.</w:t>
+            </w:r>
+          </w:p>
+        </w:tc>
+        <w:tc>
+          <w:tcPr/>
+          <w:p>
+            <w:pPr>
+              <w:pStyle w:val="Compact"/>
+              <w:jc w:val="left"/>
+            </w:pPr>
+            <w:r>
+              <w:rPr>
+                <w:sz w:val="19"/>
+              </w:rPr>
+              <w:t xml:space="preserve">The form’s powers rise to Class V.</w:t>
+            </w:r>
+          </w:p>
+        </w:tc>
+        <w:tc>
+          <w:tcPr/>
+          <w:p>
+            <w:pPr>
+              <w:pStyle w:val="Compact"/>
+              <w:jc w:val="left"/>
+            </w:pPr>
+            <w:r>
+              <w:rPr>
+                <w:sz w:val="19"/>
+              </w:rPr>
+              <w:t xml:space="preserve">The form’s powers rise to Class VI.</w:t>
+            </w:r>
+          </w:p>
+        </w:tc>
+      </w:tr>
+      <w:tr>
+        <w:tc>
+          <w:tcPr/>
+          <w:p>
+            <w:pPr>
+              <w:pStyle w:val="Compact"/>
+              <w:jc w:val="left"/>
+            </w:pPr>
+            <w:r>
+              <w:rPr>
+                <w:bCs/>
+                <w:b/>
+                <w:sz w:val="19"/>
+              </w:rPr>
+              <w:t xml:space="preserve">Immortality</w:t>
+            </w:r>
+          </w:p>
+        </w:tc>
+        <w:tc>
+          <w:tcPr/>
+          <w:p>
+            <w:pPr>
+              <w:pStyle w:val="Compact"/>
+              <w:jc w:val="left"/>
+            </w:pPr>
+            <w:r>
+              <w:rPr>
+                <w:sz w:val="19"/>
+              </w:rPr>
+              <w:t xml:space="preserve">You return within a day, even if your body was destroyed.</w:t>
+            </w:r>
+          </w:p>
+        </w:tc>
+        <w:tc>
+          <w:tcPr/>
+          <w:p>
+            <w:pPr>
+              <w:pStyle w:val="Compact"/>
+              <w:jc w:val="left"/>
+            </w:pPr>
+            <w:r>
+              <w:rPr>
+                <w:sz w:val="19"/>
+              </w:rPr>
+              <w:t xml:space="preserve">You return within an hour, in a body remade.</w:t>
+            </w:r>
+          </w:p>
+        </w:tc>
+        <w:tc>
+          <w:tcPr/>
+          <w:p>
+            <w:pPr>
+              <w:pStyle w:val="Compact"/>
+              <w:jc w:val="left"/>
+            </w:pPr>
+            <w:r>
+              <w:rPr>
+                <w:sz w:val="19"/>
+              </w:rPr>
+              <w:t xml:space="preserve">You can’t be destroyed, only bound or banished.</w:t>
+            </w:r>
+          </w:p>
+        </w:tc>
+      </w:tr>
+      <w:tr>
+        <w:tc>
+          <w:tcPr/>
+          <w:p>
+            <w:pPr>
+              <w:pStyle w:val="Compact"/>
+              <w:jc w:val="left"/>
+            </w:pPr>
+            <w:r>
+              <w:rPr>
+                <w:bCs/>
+                <w:b/>
+                <w:sz w:val="19"/>
+              </w:rPr>
+              <w:t xml:space="preserve">Telepathy</w:t>
+            </w:r>
+          </w:p>
+        </w:tc>
+        <w:tc>
+          <w:tcPr/>
+          <w:p>
+            <w:pPr>
+              <w:pStyle w:val="Compact"/>
+              <w:jc w:val="left"/>
+            </w:pPr>
+            <w:r>
+              <w:rPr>
+                <w:sz w:val="19"/>
+              </w:rPr>
+              <w:t xml:space="preserve">Read a crowd’s thoughts; link minds across a country.</w:t>
+            </w:r>
+          </w:p>
+        </w:tc>
+        <w:tc>
+          <w:tcPr/>
+          <w:p>
+            <w:pPr>
+              <w:pStyle w:val="Compact"/>
+              <w:jc w:val="left"/>
+            </w:pPr>
+            <w:r>
+              <w:rPr>
+                <w:sz w:val="19"/>
+              </w:rPr>
+              <w:t xml:space="preserve">Link minds across the world.</w:t>
+            </w:r>
+          </w:p>
+        </w:tc>
+        <w:tc>
+          <w:tcPr/>
+          <w:p>
+            <w:pPr>
+              <w:pStyle w:val="Compact"/>
+              <w:jc w:val="left"/>
+            </w:pPr>
+            <w:r>
+              <w:rPr>
+                <w:sz w:val="19"/>
+              </w:rPr>
+              <w:t xml:space="preserve">Reach minds across dimensions; read a mind against its will (Will at −4).</w:t>
+            </w:r>
+          </w:p>
+        </w:tc>
+      </w:tr>
+      <w:tr>
+        <w:tc>
+          <w:tcPr/>
+          <w:p>
+            <w:pPr>
+              <w:pStyle w:val="Compact"/>
+              <w:jc w:val="left"/>
+            </w:pPr>
+            <w:r>
+              <w:rPr>
+                <w:bCs/>
+                <w:b/>
+                <w:sz w:val="19"/>
+              </w:rPr>
+              <w:t xml:space="preserve">Mind Control</w:t>
+            </w:r>
+          </w:p>
+        </w:tc>
+        <w:tc>
+          <w:tcPr/>
+          <w:p>
+            <w:pPr>
+              <w:pStyle w:val="Compact"/>
+              <w:jc w:val="left"/>
+            </w:pPr>
+            <w:r>
+              <w:rPr>
+                <w:sz w:val="19"/>
+              </w:rPr>
+              <w:t xml:space="preserve">Control a crowd for a scene.</w:t>
+            </w:r>
+          </w:p>
+        </w:tc>
+        <w:tc>
+          <w:tcPr/>
+          <w:p>
+            <w:pPr>
+              <w:pStyle w:val="Compact"/>
+              <w:jc w:val="left"/>
+            </w:pPr>
+            <w:r>
+              <w:rPr>
+                <w:sz w:val="19"/>
+              </w:rPr>
+              <w:t xml:space="preserve">Control everyone in a city block.</w:t>
+            </w:r>
+          </w:p>
+        </w:tc>
+        <w:tc>
+          <w:tcPr/>
+          <w:p>
+            <w:pPr>
+              <w:pStyle w:val="Compact"/>
+              <w:jc w:val="left"/>
+            </w:pPr>
+            <w:r>
+              <w:rPr>
+                <w:sz w:val="19"/>
+              </w:rPr>
+              <w:t xml:space="preserve">Rule a city’s minds.</w:t>
+            </w:r>
+          </w:p>
+        </w:tc>
+      </w:tr>
+      <w:tr>
+        <w:tc>
+          <w:tcPr/>
+          <w:p>
+            <w:pPr>
+              <w:pStyle w:val="Compact"/>
+              <w:jc w:val="left"/>
+            </w:pPr>
+            <w:r>
+              <w:rPr>
+                <w:bCs/>
+                <w:b/>
+                <w:sz w:val="19"/>
+              </w:rPr>
+              <w:t xml:space="preserve">Emotion Control</w:t>
+            </w:r>
+          </w:p>
+        </w:tc>
+        <w:tc>
+          <w:tcPr/>
+          <w:p>
+            <w:pPr>
+              <w:pStyle w:val="Compact"/>
+              <w:jc w:val="left"/>
+            </w:pPr>
+            <w:r>
+              <w:rPr>
+                <w:sz w:val="19"/>
+              </w:rPr>
+              <w:t xml:space="preserve">Sway a city’s mood for a day.</w:t>
+            </w:r>
+          </w:p>
+        </w:tc>
+        <w:tc>
+          <w:tcPr/>
+          <w:p>
+            <w:pPr>
+              <w:pStyle w:val="Compact"/>
+              <w:jc w:val="left"/>
+            </w:pPr>
+            <w:r>
+              <w:rPr>
+                <w:sz w:val="19"/>
+              </w:rPr>
+              <w:t xml:space="preserve">Hold a city’s emotions for a week.</w:t>
+            </w:r>
+          </w:p>
+        </w:tc>
+        <w:tc>
+          <w:tcPr/>
+          <w:p>
+            <w:pPr>
+              <w:pStyle w:val="Compact"/>
+              <w:jc w:val="left"/>
+            </w:pPr>
+            <w:r>
+              <w:rPr>
+                <w:sz w:val="19"/>
+              </w:rPr>
+              <w:t xml:space="preserve">Panic or peace across a nation.</w:t>
+            </w:r>
+          </w:p>
+        </w:tc>
+      </w:tr>
+      <w:tr>
+        <w:tc>
+          <w:tcPr/>
+          <w:p>
+            <w:pPr>
+              <w:pStyle w:val="Compact"/>
+              <w:jc w:val="left"/>
+            </w:pPr>
+            <w:r>
+              <w:rPr>
+                <w:bCs/>
+                <w:b/>
+                <w:sz w:val="19"/>
+              </w:rPr>
+              <w:t xml:space="preserve">Memory Manipulation</w:t>
+            </w:r>
+          </w:p>
+        </w:tc>
+        <w:tc>
+          <w:tcPr/>
+          <w:p>
+            <w:pPr>
+              <w:pStyle w:val="Compact"/>
+              <w:jc w:val="left"/>
+            </w:pPr>
+            <w:r>
+              <w:rPr>
+                <w:sz w:val="19"/>
+              </w:rPr>
+              <w:t xml:space="preserve">Rewrite a crowd’s memory of an event.</w:t>
+            </w:r>
+          </w:p>
+        </w:tc>
+        <w:tc>
+          <w:tcPr/>
+          <w:p>
+            <w:pPr>
+              <w:pStyle w:val="Compact"/>
+              <w:jc w:val="left"/>
+            </w:pPr>
+            <w:r>
+              <w:rPr>
+                <w:sz w:val="19"/>
+              </w:rPr>
+              <w:t xml:space="preserve">Make a city forget.</w:t>
+            </w:r>
+          </w:p>
+        </w:tc>
+        <w:tc>
+          <w:tcPr/>
+          <w:p>
+            <w:pPr>
+              <w:pStyle w:val="Compact"/>
+              <w:jc w:val="left"/>
+            </w:pPr>
+            <w:r>
+              <w:rPr>
+                <w:sz w:val="19"/>
+              </w:rPr>
+              <w:t xml:space="preserve">Erase a person from the world’s memory.</w:t>
+            </w:r>
+          </w:p>
+        </w:tc>
+      </w:tr>
+      <w:tr>
+        <w:tc>
+          <w:tcPr/>
+          <w:p>
+            <w:pPr>
+              <w:pStyle w:val="Compact"/>
+              <w:jc w:val="left"/>
+            </w:pPr>
+            <w:r>
+              <w:rPr>
+                <w:bCs/>
+                <w:b/>
+                <w:sz w:val="19"/>
+              </w:rPr>
+              <w:t xml:space="preserve">Illusion</w:t>
+            </w:r>
+          </w:p>
+        </w:tc>
+        <w:tc>
+          <w:tcPr/>
+          <w:p>
+            <w:pPr>
+              <w:pStyle w:val="Compact"/>
+              <w:jc w:val="left"/>
+            </w:pPr>
+            <w:r>
+              <w:rPr>
+                <w:sz w:val="19"/>
+              </w:rPr>
+              <w:t xml:space="preserve">Illusions over a city block that even cameras record.</w:t>
+            </w:r>
+          </w:p>
+        </w:tc>
+        <w:tc>
+          <w:tcPr/>
+          <w:p>
+            <w:pPr>
+              <w:pStyle w:val="Compact"/>
+              <w:jc w:val="left"/>
+            </w:pPr>
+            <w:r>
+              <w:rPr>
+                <w:sz w:val="19"/>
+              </w:rPr>
+              <w:t xml:space="preserve">A whole false district.</w:t>
+            </w:r>
+          </w:p>
+        </w:tc>
+        <w:tc>
+          <w:tcPr/>
+          <w:p>
+            <w:pPr>
+              <w:pStyle w:val="Compact"/>
+              <w:jc w:val="left"/>
+            </w:pPr>
+            <w:r>
+              <w:rPr>
+                <w:sz w:val="19"/>
+              </w:rPr>
+              <w:t xml:space="preserve">Illusions that become real for those who believe them.</w:t>
+            </w:r>
+          </w:p>
+        </w:tc>
+      </w:tr>
+      <w:tr>
+        <w:tc>
+          <w:tcPr/>
+          <w:p>
+            <w:pPr>
+              <w:pStyle w:val="Compact"/>
+              <w:jc w:val="left"/>
+            </w:pPr>
+            <w:r>
+              <w:rPr>
+                <w:bCs/>
+                <w:b/>
+                <w:sz w:val="19"/>
+              </w:rPr>
+              <w:t xml:space="preserve">Empathy</w:t>
+            </w:r>
+          </w:p>
+        </w:tc>
+        <w:tc>
+          <w:tcPr/>
+          <w:p>
+            <w:pPr>
+              <w:pStyle w:val="Compact"/>
+              <w:jc w:val="left"/>
+            </w:pPr>
+            <w:r>
+              <w:rPr>
+                <w:sz w:val="19"/>
+              </w:rPr>
+              <w:t xml:space="preserve">Feel every emotion in a city; find anyone by what they feel.</w:t>
+            </w:r>
+          </w:p>
+        </w:tc>
+        <w:tc>
+          <w:tcPr/>
+          <w:p>
+            <w:pPr>
+              <w:pStyle w:val="Compact"/>
+              <w:jc w:val="left"/>
+            </w:pPr>
+            <w:r>
+              <w:rPr>
+                <w:sz w:val="19"/>
+              </w:rPr>
+              <w:t xml:space="preserve">Ease or share a crowd’s pain.</w:t>
+            </w:r>
+          </w:p>
+        </w:tc>
+        <w:tc>
+          <w:tcPr/>
+          <w:p>
+            <w:pPr>
+              <w:pStyle w:val="Compact"/>
+              <w:jc w:val="left"/>
+            </w:pPr>
+            <w:r>
+              <w:rPr>
+                <w:sz w:val="19"/>
+              </w:rPr>
+              <w:t xml:space="preserve">Feel the mood of a nation.</w:t>
+            </w:r>
+          </w:p>
+        </w:tc>
+      </w:tr>
+      <w:tr>
+        <w:tc>
+          <w:tcPr/>
+          <w:p>
+            <w:pPr>
+              <w:pStyle w:val="Compact"/>
+              <w:jc w:val="left"/>
+            </w:pPr>
+            <w:r>
+              <w:rPr>
+                <w:bCs/>
+                <w:b/>
+                <w:sz w:val="19"/>
+              </w:rPr>
+              <w:t xml:space="preserve">Precognition</w:t>
+            </w:r>
+          </w:p>
+        </w:tc>
+        <w:tc>
+          <w:tcPr/>
+          <w:p>
+            <w:pPr>
+              <w:pStyle w:val="Compact"/>
+              <w:jc w:val="left"/>
+            </w:pPr>
+            <w:r>
+              <w:rPr>
+                <w:sz w:val="19"/>
+              </w:rPr>
+              <w:t xml:space="preserve">Twice a scene, reroll a failed roll without spending Spark; you’re never ambushed.</w:t>
+            </w:r>
+          </w:p>
+        </w:tc>
+        <w:tc>
+          <w:tcPr/>
+          <w:p>
+            <w:pPr>
+              <w:pStyle w:val="Compact"/>
+              <w:jc w:val="left"/>
+            </w:pPr>
+            <w:r>
+              <w:rPr>
+                <w:sz w:val="19"/>
+              </w:rPr>
+              <w:t xml:space="preserve">Once a scene, know the outcome of a choice before you make it.</w:t>
+            </w:r>
+          </w:p>
+        </w:tc>
+        <w:tc>
+          <w:tcPr/>
+          <w:p>
+            <w:pPr>
+              <w:pStyle w:val="Compact"/>
+              <w:jc w:val="left"/>
+            </w:pPr>
+            <w:r>
+              <w:rPr>
+                <w:sz w:val="19"/>
+              </w:rPr>
+              <w:t xml:space="preserve">See the shape of days to come: the GM answers three questions a session.</w:t>
+            </w:r>
+          </w:p>
+        </w:tc>
+      </w:tr>
+      <w:tr>
+        <w:tc>
+          <w:tcPr/>
+          <w:p>
+            <w:pPr>
+              <w:pStyle w:val="Compact"/>
+              <w:jc w:val="left"/>
+            </w:pPr>
+            <w:r>
+              <w:rPr>
+                <w:bCs/>
+                <w:b/>
+                <w:sz w:val="19"/>
+              </w:rPr>
+              <w:t xml:space="preserve">Enhanced Senses</w:t>
+            </w:r>
+          </w:p>
+        </w:tc>
+        <w:tc>
+          <w:tcPr/>
+          <w:p>
+            <w:pPr>
+              <w:pStyle w:val="Compact"/>
+              <w:jc w:val="left"/>
+            </w:pPr>
+            <w:r>
+              <w:rPr>
+                <w:sz w:val="19"/>
+              </w:rPr>
+              <w:t xml:space="preserve">Hear a conversation across a city; read a license plate a mile away.</w:t>
+            </w:r>
+          </w:p>
+        </w:tc>
+        <w:tc>
+          <w:tcPr/>
+          <w:p>
+            <w:pPr>
+              <w:pStyle w:val="Compact"/>
+              <w:jc w:val="left"/>
+            </w:pPr>
+            <w:r>
+              <w:rPr>
+                <w:sz w:val="19"/>
+              </w:rPr>
+              <w:t xml:space="preserve">Sense through walls for a mile.</w:t>
+            </w:r>
+          </w:p>
+        </w:tc>
+        <w:tc>
+          <w:tcPr/>
+          <w:p>
+            <w:pPr>
+              <w:pStyle w:val="Compact"/>
+              <w:jc w:val="left"/>
+            </w:pPr>
+            <w:r>
+              <w:rPr>
+                <w:sz w:val="19"/>
+              </w:rPr>
+              <w:t xml:space="preserve">Perceive anything happening across a city.</w:t>
+            </w:r>
+          </w:p>
+        </w:tc>
+      </w:tr>
+      <w:tr>
+        <w:tc>
+          <w:tcPr/>
+          <w:p>
+            <w:pPr>
+              <w:pStyle w:val="Compact"/>
+              <w:jc w:val="left"/>
+            </w:pPr>
+            <w:r>
+              <w:rPr>
+                <w:bCs/>
+                <w:b/>
+                <w:sz w:val="19"/>
+              </w:rPr>
+              <w:t xml:space="preserve">Mystic Sight</w:t>
+            </w:r>
+          </w:p>
+        </w:tc>
+        <w:tc>
+          <w:tcPr/>
+          <w:p>
+            <w:pPr>
+              <w:pStyle w:val="Compact"/>
+              <w:jc w:val="left"/>
+            </w:pPr>
+            <w:r>
+              <w:rPr>
+                <w:sz w:val="19"/>
+              </w:rPr>
+              <w:t xml:space="preserve">See through any magical disguise; read spells as they’re cast.</w:t>
+            </w:r>
+          </w:p>
+        </w:tc>
+        <w:tc>
+          <w:tcPr/>
+          <w:p>
+            <w:pPr>
+              <w:pStyle w:val="Compact"/>
+              <w:jc w:val="left"/>
+            </w:pPr>
+            <w:r>
+              <w:rPr>
+                <w:sz w:val="19"/>
+              </w:rPr>
+              <w:t xml:space="preserve">See across Otherworld; find any spirit by name.</w:t>
+            </w:r>
+          </w:p>
+        </w:tc>
+        <w:tc>
+          <w:tcPr/>
+          <w:p>
+            <w:pPr>
+              <w:pStyle w:val="Compact"/>
+              <w:jc w:val="left"/>
+            </w:pPr>
+            <w:r>
+              <w:rPr>
+                <w:sz w:val="19"/>
+              </w:rPr>
+              <w:t xml:space="preserve">See the threads of fate and magic over a whole city.</w:t>
+            </w:r>
+          </w:p>
+        </w:tc>
+      </w:tr>
+      <w:tr>
+        <w:tc>
+          <w:tcPr/>
+          <w:p>
+            <w:pPr>
+              <w:pStyle w:val="Compact"/>
+              <w:jc w:val="left"/>
+            </w:pPr>
+            <w:r>
+              <w:rPr>
+                <w:bCs/>
+                <w:b/>
+                <w:sz w:val="19"/>
+              </w:rPr>
+              <w:t xml:space="preserve">Psychometry</w:t>
+            </w:r>
+          </w:p>
+        </w:tc>
+        <w:tc>
+          <w:tcPr/>
+          <w:p>
+            <w:pPr>
+              <w:pStyle w:val="Compact"/>
+              <w:jc w:val="left"/>
+            </w:pPr>
+            <w:r>
+              <w:rPr>
+                <w:sz w:val="19"/>
+              </w:rPr>
+              <w:t xml:space="preserve">Read the history of a building or a street.</w:t>
+            </w:r>
+          </w:p>
+        </w:tc>
+        <w:tc>
+          <w:tcPr/>
+          <w:p>
+            <w:pPr>
+              <w:pStyle w:val="Compact"/>
+              <w:jc w:val="left"/>
+            </w:pPr>
+            <w:r>
+              <w:rPr>
+                <w:sz w:val="19"/>
+              </w:rPr>
+              <w:t xml:space="preserve">Read a city’s history; find anyone who ever touched an object.</w:t>
+            </w:r>
+          </w:p>
+        </w:tc>
+        <w:tc>
+          <w:tcPr/>
+          <w:p>
+            <w:pPr>
+              <w:pStyle w:val="Compact"/>
+              <w:jc w:val="left"/>
+            </w:pPr>
+            <w:r>
+              <w:rPr>
+                <w:sz w:val="19"/>
+              </w:rPr>
+              <w:t xml:space="preserve">Read the past of a place across centuries.</w:t>
+            </w:r>
+          </w:p>
+        </w:tc>
+      </w:tr>
+      <w:tr>
+        <w:tc>
+          <w:tcPr/>
+          <w:p>
+            <w:pPr>
+              <w:pStyle w:val="Compact"/>
+              <w:jc w:val="left"/>
+            </w:pPr>
+            <w:r>
+              <w:rPr>
+                <w:bCs/>
+                <w:b/>
+                <w:sz w:val="19"/>
+              </w:rPr>
+              <w:t xml:space="preserve">Astral Projection</w:t>
+            </w:r>
+          </w:p>
+        </w:tc>
+        <w:tc>
+          <w:tcPr/>
+          <w:p>
+            <w:pPr>
+              <w:pStyle w:val="Compact"/>
+              <w:jc w:val="left"/>
+            </w:pPr>
+            <w:r>
+              <w:rPr>
+                <w:sz w:val="19"/>
+              </w:rPr>
+              <w:t xml:space="preserve">Travel anywhere on Earth in spirit within moments.</w:t>
+            </w:r>
+          </w:p>
+        </w:tc>
+        <w:tc>
+          <w:tcPr/>
+          <w:p>
+            <w:pPr>
+              <w:pStyle w:val="Compact"/>
+              <w:jc w:val="left"/>
+            </w:pPr>
+            <w:r>
+              <w:rPr>
+                <w:sz w:val="19"/>
+              </w:rPr>
+              <w:t xml:space="preserve">Act physically as a spirit, with Class III attacks.</w:t>
+            </w:r>
+          </w:p>
+        </w:tc>
+        <w:tc>
+          <w:tcPr/>
+          <w:p>
+            <w:pPr>
+              <w:pStyle w:val="Compact"/>
+              <w:jc w:val="left"/>
+            </w:pPr>
+            <w:r>
+              <w:rPr>
+                <w:sz w:val="19"/>
+              </w:rPr>
+              <w:t xml:space="preserve">Walk between worlds in body as well as spirit.</w:t>
+            </w:r>
+          </w:p>
+        </w:tc>
+      </w:tr>
+      <w:tr>
+        <w:tc>
+          <w:tcPr/>
+          <w:p>
+            <w:pPr>
+              <w:pStyle w:val="Compact"/>
+              <w:jc w:val="left"/>
+            </w:pPr>
+            <w:r>
+              <w:rPr>
+                <w:bCs/>
+                <w:b/>
+                <w:sz w:val="19"/>
+              </w:rPr>
+              <w:t xml:space="preserve">Super Intellect</w:t>
+            </w:r>
+          </w:p>
+        </w:tc>
+        <w:tc>
+          <w:tcPr/>
+          <w:p>
+            <w:pPr>
+              <w:pStyle w:val="Compact"/>
+              <w:jc w:val="left"/>
+            </w:pPr>
+            <w:r>
+              <w:rPr>
+                <w:sz w:val="19"/>
+              </w:rPr>
+              <w:t xml:space="preserve">Out-think supercomputers; invent the impossible in an hour.</w:t>
+            </w:r>
+          </w:p>
+        </w:tc>
+        <w:tc>
+          <w:tcPr/>
+          <w:p>
+            <w:pPr>
+              <w:pStyle w:val="Compact"/>
+              <w:jc w:val="left"/>
+            </w:pPr>
+            <w:r>
+              <w:rPr>
+                <w:sz w:val="19"/>
+              </w:rPr>
+              <w:t xml:space="preserve">Understand any science, alien or arcane, at a glance.</w:t>
+            </w:r>
+          </w:p>
+        </w:tc>
+        <w:tc>
+          <w:tcPr/>
+          <w:p>
+            <w:pPr>
+              <w:pStyle w:val="Compact"/>
+              <w:jc w:val="left"/>
+            </w:pPr>
+            <w:r>
+              <w:rPr>
+                <w:sz w:val="19"/>
+              </w:rPr>
+              <w:t xml:space="preserve">Tesla’s level: build doors between worlds.</w:t>
+            </w:r>
+          </w:p>
+        </w:tc>
+      </w:tr>
+      <w:tr>
+        <w:tc>
+          <w:tcPr/>
+          <w:p>
+            <w:pPr>
+              <w:pStyle w:val="Compact"/>
+              <w:jc w:val="left"/>
+            </w:pPr>
+            <w:r>
+              <w:rPr>
+                <w:bCs/>
+                <w:b/>
+                <w:sz w:val="19"/>
+              </w:rPr>
+              <w:t xml:space="preserve">Telekinesis</w:t>
+            </w:r>
+          </w:p>
+        </w:tc>
+        <w:tc>
+          <w:tcPr/>
+          <w:p>
+            <w:pPr>
+              <w:pStyle w:val="Compact"/>
+              <w:jc w:val="left"/>
+            </w:pPr>
+            <w:r>
+              <w:rPr>
+                <w:sz w:val="19"/>
+              </w:rPr>
+              <w:t xml:space="preserve">Lift a jet or a building’s floor; Class IV attacks.</w:t>
+            </w:r>
+          </w:p>
+        </w:tc>
+        <w:tc>
+          <w:tcPr/>
+          <w:p>
+            <w:pPr>
+              <w:pStyle w:val="Compact"/>
+              <w:jc w:val="left"/>
+            </w:pPr>
+            <w:r>
+              <w:rPr>
+                <w:sz w:val="19"/>
+              </w:rPr>
+              <w:t xml:space="preserve">Lift a ship; Class V attacks.</w:t>
+            </w:r>
+          </w:p>
+        </w:tc>
+        <w:tc>
+          <w:tcPr/>
+          <w:p>
+            <w:pPr>
+              <w:pStyle w:val="Compact"/>
+              <w:jc w:val="left"/>
+            </w:pPr>
+            <w:r>
+              <w:rPr>
+                <w:sz w:val="19"/>
+              </w:rPr>
+              <w:t xml:space="preserve">Move a mountain; Class VI attacks.</w:t>
+            </w:r>
+          </w:p>
+        </w:tc>
+      </w:tr>
+      <w:tr>
+        <w:tc>
+          <w:tcPr/>
+          <w:p>
+            <w:pPr>
+              <w:pStyle w:val="Compact"/>
+              <w:jc w:val="left"/>
+            </w:pPr>
+            <w:r>
+              <w:rPr>
+                <w:bCs/>
+                <w:b/>
+                <w:sz w:val="19"/>
+              </w:rPr>
               <w:t xml:space="preserve">Cantrips</w:t>
             </w:r>
           </w:p>
@@ -21803,6 +23979,774 @@
                 <w:sz w:val="19"/>
               </w:rPr>
               <w:t xml:space="preserve">Another world or dimension, without a door.</w:t>
+            </w:r>
+          </w:p>
+        </w:tc>
+      </w:tr>
+      <w:tr>
+        <w:tc>
+          <w:tcPr/>
+          <w:p>
+            <w:pPr>
+              <w:pStyle w:val="Compact"/>
+              <w:jc w:val="left"/>
+            </w:pPr>
+            <w:r>
+              <w:rPr>
+                <w:bCs/>
+                <w:b/>
+                <w:sz w:val="19"/>
+              </w:rPr>
+              <w:t xml:space="preserve">Portals</w:t>
+            </w:r>
+          </w:p>
+        </w:tc>
+        <w:tc>
+          <w:tcPr/>
+          <w:p>
+            <w:pPr>
+              <w:pStyle w:val="Compact"/>
+              <w:jc w:val="left"/>
+            </w:pPr>
+            <w:r>
+              <w:rPr>
+                <w:sz w:val="19"/>
+              </w:rPr>
+              <w:t xml:space="preserve">Hold a door open for an army or a convoy.</w:t>
+            </w:r>
+          </w:p>
+        </w:tc>
+        <w:tc>
+          <w:tcPr/>
+          <w:p>
+            <w:pPr>
+              <w:pStyle w:val="Compact"/>
+              <w:jc w:val="left"/>
+            </w:pPr>
+            <w:r>
+              <w:rPr>
+                <w:sz w:val="19"/>
+              </w:rPr>
+              <w:t xml:space="preserve">Open many doors at once across a city.</w:t>
+            </w:r>
+          </w:p>
+        </w:tc>
+        <w:tc>
+          <w:tcPr/>
+          <w:p>
+            <w:pPr>
+              <w:pStyle w:val="Compact"/>
+              <w:jc w:val="left"/>
+            </w:pPr>
+            <w:r>
+              <w:rPr>
+                <w:sz w:val="19"/>
+              </w:rPr>
+              <w:t xml:space="preserve">Tear a breach between worlds that stays open.</w:t>
+            </w:r>
+          </w:p>
+        </w:tc>
+      </w:tr>
+      <w:tr>
+        <w:tc>
+          <w:tcPr/>
+          <w:p>
+            <w:pPr>
+              <w:pStyle w:val="Compact"/>
+              <w:jc w:val="left"/>
+            </w:pPr>
+            <w:r>
+              <w:rPr>
+                <w:bCs/>
+                <w:b/>
+                <w:sz w:val="19"/>
+              </w:rPr>
+              <w:t xml:space="preserve">Summoning</w:t>
+            </w:r>
+          </w:p>
+        </w:tc>
+        <w:tc>
+          <w:tcPr/>
+          <w:p>
+            <w:pPr>
+              <w:pStyle w:val="Compact"/>
+              <w:jc w:val="left"/>
+            </w:pPr>
+            <w:r>
+              <w:rPr>
+                <w:sz w:val="19"/>
+              </w:rPr>
+              <w:t xml:space="preserve">Call something that fights with Class IV attacks.</w:t>
+            </w:r>
+          </w:p>
+        </w:tc>
+        <w:tc>
+          <w:tcPr/>
+          <w:p>
+            <w:pPr>
+              <w:pStyle w:val="Compact"/>
+              <w:jc w:val="left"/>
+            </w:pPr>
+            <w:r>
+              <w:rPr>
+                <w:sz w:val="19"/>
+              </w:rPr>
+              <w:t xml:space="preserve">Call a legion.</w:t>
+            </w:r>
+          </w:p>
+        </w:tc>
+        <w:tc>
+          <w:tcPr/>
+          <w:p>
+            <w:pPr>
+              <w:pStyle w:val="Compact"/>
+              <w:jc w:val="left"/>
+            </w:pPr>
+            <w:r>
+              <w:rPr>
+                <w:sz w:val="19"/>
+              </w:rPr>
+              <w:t xml:space="preserve">Call one of Otherworld’s powers itself.</w:t>
+            </w:r>
+          </w:p>
+        </w:tc>
+      </w:tr>
+      <w:tr>
+        <w:tc>
+          <w:tcPr/>
+          <w:p>
+            <w:pPr>
+              <w:pStyle w:val="Compact"/>
+              <w:jc w:val="left"/>
+            </w:pPr>
+            <w:r>
+              <w:rPr>
+                <w:bCs/>
+                <w:b/>
+                <w:sz w:val="19"/>
+              </w:rPr>
+              <w:t xml:space="preserve">Warding</w:t>
+            </w:r>
+          </w:p>
+        </w:tc>
+        <w:tc>
+          <w:tcPr/>
+          <w:p>
+            <w:pPr>
+              <w:pStyle w:val="Compact"/>
+              <w:jc w:val="left"/>
+            </w:pPr>
+            <w:r>
+              <w:rPr>
+                <w:sz w:val="19"/>
+              </w:rPr>
+              <w:t xml:space="preserve">Protect a district; banish Class IV beings.</w:t>
+            </w:r>
+          </w:p>
+        </w:tc>
+        <w:tc>
+          <w:tcPr/>
+          <w:p>
+            <w:pPr>
+              <w:pStyle w:val="Compact"/>
+              <w:jc w:val="left"/>
+            </w:pPr>
+            <w:r>
+              <w:rPr>
+                <w:sz w:val="19"/>
+              </w:rPr>
+              <w:t xml:space="preserve">Protect a city; banish Class V beings.</w:t>
+            </w:r>
+          </w:p>
+        </w:tc>
+        <w:tc>
+          <w:tcPr/>
+          <w:p>
+            <w:pPr>
+              <w:pStyle w:val="Compact"/>
+              <w:jc w:val="left"/>
+            </w:pPr>
+            <w:r>
+              <w:rPr>
+                <w:sz w:val="19"/>
+              </w:rPr>
+              <w:t xml:space="preserve">Seal an Earth Gate or a breach for good.</w:t>
+            </w:r>
+          </w:p>
+        </w:tc>
+      </w:tr>
+      <w:tr>
+        <w:tc>
+          <w:tcPr/>
+          <w:p>
+            <w:pPr>
+              <w:pStyle w:val="Compact"/>
+              <w:jc w:val="left"/>
+            </w:pPr>
+            <w:r>
+              <w:rPr>
+                <w:bCs/>
+                <w:b/>
+                <w:sz w:val="19"/>
+              </w:rPr>
+              <w:t xml:space="preserve">Healing</w:t>
+            </w:r>
+          </w:p>
+        </w:tc>
+        <w:tc>
+          <w:tcPr/>
+          <w:p>
+            <w:pPr>
+              <w:pStyle w:val="Compact"/>
+              <w:jc w:val="left"/>
+            </w:pPr>
+            <w:r>
+              <w:rPr>
+                <w:sz w:val="19"/>
+              </w:rPr>
+              <w:t xml:space="preserve">Heal a crowd’s ordinary wounds at once; restore lost limbs.</w:t>
+            </w:r>
+          </w:p>
+        </w:tc>
+        <w:tc>
+          <w:tcPr/>
+          <w:p>
+            <w:pPr>
+              <w:pStyle w:val="Compact"/>
+              <w:jc w:val="left"/>
+            </w:pPr>
+            <w:r>
+              <w:rPr>
+                <w:sz w:val="19"/>
+              </w:rPr>
+              <w:t xml:space="preserve">Bring back the newly dead, within minutes (GM’s approval).</w:t>
+            </w:r>
+          </w:p>
+        </w:tc>
+        <w:tc>
+          <w:tcPr/>
+          <w:p>
+            <w:pPr>
+              <w:pStyle w:val="Compact"/>
+              <w:jc w:val="left"/>
+            </w:pPr>
+            <w:r>
+              <w:rPr>
+                <w:sz w:val="19"/>
+              </w:rPr>
+              <w:t xml:space="preserve">Undo death itself (GM’s approval).</w:t>
+            </w:r>
+          </w:p>
+        </w:tc>
+      </w:tr>
+      <w:tr>
+        <w:tc>
+          <w:tcPr/>
+          <w:p>
+            <w:pPr>
+              <w:pStyle w:val="Compact"/>
+              <w:jc w:val="left"/>
+            </w:pPr>
+            <w:r>
+              <w:rPr>
+                <w:bCs/>
+                <w:b/>
+                <w:sz w:val="19"/>
+              </w:rPr>
+              <w:t xml:space="preserve">Power Negation</w:t>
+            </w:r>
+          </w:p>
+        </w:tc>
+        <w:tc>
+          <w:tcPr/>
+          <w:p>
+            <w:pPr>
+              <w:pStyle w:val="Compact"/>
+              <w:jc w:val="left"/>
+            </w:pPr>
+            <w:r>
+              <w:rPr>
+                <w:sz w:val="19"/>
+              </w:rPr>
+              <w:t xml:space="preserve">Suppress Class IV powers across a building.</w:t>
+            </w:r>
+          </w:p>
+        </w:tc>
+        <w:tc>
+          <w:tcPr/>
+          <w:p>
+            <w:pPr>
+              <w:pStyle w:val="Compact"/>
+              <w:jc w:val="left"/>
+            </w:pPr>
+            <w:r>
+              <w:rPr>
+                <w:sz w:val="19"/>
+              </w:rPr>
+              <w:t xml:space="preserve">Suppress Class V powers across a city block.</w:t>
+            </w:r>
+          </w:p>
+        </w:tc>
+        <w:tc>
+          <w:tcPr/>
+          <w:p>
+            <w:pPr>
+              <w:pStyle w:val="Compact"/>
+              <w:jc w:val="left"/>
+            </w:pPr>
+            <w:r>
+              <w:rPr>
+                <w:sz w:val="19"/>
+              </w:rPr>
+              <w:t xml:space="preserve">Shut off powers across a city.</w:t>
+            </w:r>
+          </w:p>
+        </w:tc>
+      </w:tr>
+      <w:tr>
+        <w:tc>
+          <w:tcPr/>
+          <w:p>
+            <w:pPr>
+              <w:pStyle w:val="Compact"/>
+              <w:jc w:val="left"/>
+            </w:pPr>
+            <w:r>
+              <w:rPr>
+                <w:bCs/>
+                <w:b/>
+                <w:sz w:val="19"/>
+              </w:rPr>
+              <w:t xml:space="preserve">Power Mimicry</w:t>
+            </w:r>
+          </w:p>
+        </w:tc>
+        <w:tc>
+          <w:tcPr/>
+          <w:p>
+            <w:pPr>
+              <w:pStyle w:val="Compact"/>
+              <w:jc w:val="left"/>
+            </w:pPr>
+            <w:r>
+              <w:rPr>
+                <w:sz w:val="19"/>
+              </w:rPr>
+              <w:t xml:space="preserve">Copy a power at Class IV.</w:t>
+            </w:r>
+          </w:p>
+        </w:tc>
+        <w:tc>
+          <w:tcPr/>
+          <w:p>
+            <w:pPr>
+              <w:pStyle w:val="Compact"/>
+              <w:jc w:val="left"/>
+            </w:pPr>
+            <w:r>
+              <w:rPr>
+                <w:sz w:val="19"/>
+              </w:rPr>
+              <w:t xml:space="preserve">Copy several powers at Class IV, or one at Class V.</w:t>
+            </w:r>
+          </w:p>
+        </w:tc>
+        <w:tc>
+          <w:tcPr/>
+          <w:p>
+            <w:pPr>
+              <w:pStyle w:val="Compact"/>
+              <w:jc w:val="left"/>
+            </w:pPr>
+            <w:r>
+              <w:rPr>
+                <w:sz w:val="19"/>
+              </w:rPr>
+              <w:t xml:space="preserve">Copy any power at full strength.</w:t>
+            </w:r>
+          </w:p>
+        </w:tc>
+      </w:tr>
+      <w:tr>
+        <w:tc>
+          <w:tcPr/>
+          <w:p>
+            <w:pPr>
+              <w:pStyle w:val="Compact"/>
+              <w:jc w:val="left"/>
+            </w:pPr>
+            <w:r>
+              <w:rPr>
+                <w:bCs/>
+                <w:b/>
+                <w:sz w:val="19"/>
+              </w:rPr>
+              <w:t xml:space="preserve">Technopathy</w:t>
+            </w:r>
+          </w:p>
+        </w:tc>
+        <w:tc>
+          <w:tcPr/>
+          <w:p>
+            <w:pPr>
+              <w:pStyle w:val="Compact"/>
+              <w:jc w:val="left"/>
+            </w:pPr>
+            <w:r>
+              <w:rPr>
+                <w:sz w:val="19"/>
+              </w:rPr>
+              <w:t xml:space="preserve">Command a city’s power grid or a military network.</w:t>
+            </w:r>
+          </w:p>
+        </w:tc>
+        <w:tc>
+          <w:tcPr/>
+          <w:p>
+            <w:pPr>
+              <w:pStyle w:val="Compact"/>
+              <w:jc w:val="left"/>
+            </w:pPr>
+            <w:r>
+              <w:rPr>
+                <w:sz w:val="19"/>
+              </w:rPr>
+              <w:t xml:space="preserve">Command every machine in a region.</w:t>
+            </w:r>
+          </w:p>
+        </w:tc>
+        <w:tc>
+          <w:tcPr/>
+          <w:p>
+            <w:pPr>
+              <w:pStyle w:val="Compact"/>
+              <w:jc w:val="left"/>
+            </w:pPr>
+            <w:r>
+              <w:rPr>
+                <w:sz w:val="19"/>
+              </w:rPr>
+              <w:t xml:space="preserve">Speak to every machine on Earth.</w:t>
+            </w:r>
+          </w:p>
+        </w:tc>
+      </w:tr>
+      <w:tr>
+        <w:tc>
+          <w:tcPr/>
+          <w:p>
+            <w:pPr>
+              <w:pStyle w:val="Compact"/>
+              <w:jc w:val="left"/>
+            </w:pPr>
+            <w:r>
+              <w:rPr>
+                <w:bCs/>
+                <w:b/>
+                <w:sz w:val="19"/>
+              </w:rPr>
+              <w:t xml:space="preserve">Animal Control</w:t>
+            </w:r>
+          </w:p>
+        </w:tc>
+        <w:tc>
+          <w:tcPr/>
+          <w:p>
+            <w:pPr>
+              <w:pStyle w:val="Compact"/>
+              <w:jc w:val="left"/>
+            </w:pPr>
+            <w:r>
+              <w:rPr>
+                <w:sz w:val="19"/>
+              </w:rPr>
+              <w:t xml:space="preserve">Command every animal in a city.</w:t>
+            </w:r>
+          </w:p>
+        </w:tc>
+        <w:tc>
+          <w:tcPr/>
+          <w:p>
+            <w:pPr>
+              <w:pStyle w:val="Compact"/>
+              <w:jc w:val="left"/>
+            </w:pPr>
+            <w:r>
+              <w:rPr>
+                <w:sz w:val="19"/>
+              </w:rPr>
+              <w:t xml:space="preserve">Command a region’s wildlife.</w:t>
+            </w:r>
+          </w:p>
+        </w:tc>
+        <w:tc>
+          <w:tcPr/>
+          <w:p>
+            <w:pPr>
+              <w:pStyle w:val="Compact"/>
+              <w:jc w:val="left"/>
+            </w:pPr>
+            <w:r>
+              <w:rPr>
+                <w:sz w:val="19"/>
+              </w:rPr>
+              <w:t xml:space="preserve">Command every creature that answers to instinct.</w:t>
+            </w:r>
+          </w:p>
+        </w:tc>
+      </w:tr>
+      <w:tr>
+        <w:tc>
+          <w:tcPr/>
+          <w:p>
+            <w:pPr>
+              <w:pStyle w:val="Compact"/>
+              <w:jc w:val="left"/>
+            </w:pPr>
+            <w:r>
+              <w:rPr>
+                <w:bCs/>
+                <w:b/>
+                <w:sz w:val="19"/>
+              </w:rPr>
+              <w:t xml:space="preserve">Probability Control</w:t>
+            </w:r>
+          </w:p>
+        </w:tc>
+        <w:tc>
+          <w:tcPr/>
+          <w:p>
+            <w:pPr>
+              <w:pStyle w:val="Compact"/>
+              <w:jc w:val="left"/>
+            </w:pPr>
+            <w:r>
+              <w:rPr>
+                <w:sz w:val="19"/>
+              </w:rPr>
+              <w:t xml:space="preserve">Twice a scene, choose the result of a roll you can see.</w:t>
+            </w:r>
+          </w:p>
+        </w:tc>
+        <w:tc>
+          <w:tcPr/>
+          <w:p>
+            <w:pPr>
+              <w:pStyle w:val="Compact"/>
+              <w:jc w:val="left"/>
+            </w:pPr>
+            <w:r>
+              <w:rPr>
+                <w:sz w:val="19"/>
+              </w:rPr>
+              <w:t xml:space="preserve">Once a scene, choose the result of any roll.</w:t>
+            </w:r>
+          </w:p>
+        </w:tc>
+        <w:tc>
+          <w:tcPr/>
+          <w:p>
+            <w:pPr>
+              <w:pStyle w:val="Compact"/>
+              <w:jc w:val="left"/>
+            </w:pPr>
+            <w:r>
+              <w:rPr>
+                <w:sz w:val="19"/>
+              </w:rPr>
+              <w:t xml:space="preserve">Rewrite luck itself: a disaster simply doesn’t happen.</w:t>
+            </w:r>
+          </w:p>
+        </w:tc>
+      </w:tr>
+      <w:tr>
+        <w:tc>
+          <w:tcPr/>
+          <w:p>
+            <w:pPr>
+              <w:pStyle w:val="Compact"/>
+              <w:jc w:val="left"/>
+            </w:pPr>
+            <w:r>
+              <w:rPr>
+                <w:bCs/>
+                <w:b/>
+                <w:sz w:val="19"/>
+              </w:rPr>
+              <w:t xml:space="preserve">Time Manipulation</w:t>
+            </w:r>
+          </w:p>
+        </w:tc>
+        <w:tc>
+          <w:tcPr/>
+          <w:p>
+            <w:pPr>
+              <w:pStyle w:val="Compact"/>
+              <w:jc w:val="left"/>
+            </w:pPr>
+            <w:r>
+              <w:rPr>
+                <w:sz w:val="19"/>
+              </w:rPr>
+              <w:t xml:space="preserve">Stop time for a round for everyone but you.</w:t>
+            </w:r>
+          </w:p>
+        </w:tc>
+        <w:tc>
+          <w:tcPr/>
+          <w:p>
+            <w:pPr>
+              <w:pStyle w:val="Compact"/>
+              <w:jc w:val="left"/>
+            </w:pPr>
+            <w:r>
+              <w:rPr>
+                <w:sz w:val="19"/>
+              </w:rPr>
+              <w:t xml:space="preserve">Rewind a whole scene, once a session.</w:t>
+            </w:r>
+          </w:p>
+        </w:tc>
+        <w:tc>
+          <w:tcPr/>
+          <w:p>
+            <w:pPr>
+              <w:pStyle w:val="Compact"/>
+              <w:jc w:val="left"/>
+            </w:pPr>
+            <w:r>
+              <w:rPr>
+                <w:sz w:val="19"/>
+              </w:rPr>
+              <w:t xml:space="preserve">Travel in time (GM’s approval).</w:t>
+            </w:r>
+          </w:p>
+        </w:tc>
+      </w:tr>
+      <w:tr>
+        <w:tc>
+          <w:tcPr/>
+          <w:p>
+            <w:pPr>
+              <w:pStyle w:val="Compact"/>
+              <w:jc w:val="left"/>
+            </w:pPr>
+            <w:r>
+              <w:rPr>
+                <w:bCs/>
+                <w:b/>
+                <w:sz w:val="19"/>
+              </w:rPr>
+              <w:t xml:space="preserve">Possession</w:t>
+            </w:r>
+          </w:p>
+        </w:tc>
+        <w:tc>
+          <w:tcPr/>
+          <w:p>
+            <w:pPr>
+              <w:pStyle w:val="Compact"/>
+              <w:jc w:val="left"/>
+            </w:pPr>
+            <w:r>
+              <w:rPr>
+                <w:sz w:val="19"/>
+              </w:rPr>
+              <w:t xml:space="preserve">Possess and switch bodies at a distance.</w:t>
+            </w:r>
+          </w:p>
+        </w:tc>
+        <w:tc>
+          <w:tcPr/>
+          <w:p>
+            <w:pPr>
+              <w:pStyle w:val="Compact"/>
+              <w:jc w:val="left"/>
+            </w:pPr>
+            <w:r>
+              <w:rPr>
+                <w:sz w:val="19"/>
+              </w:rPr>
+              <w:t xml:space="preserve">Possess several bodies at once.</w:t>
+            </w:r>
+          </w:p>
+        </w:tc>
+        <w:tc>
+          <w:tcPr/>
+          <w:p>
+            <w:pPr>
+              <w:pStyle w:val="Compact"/>
+              <w:jc w:val="left"/>
+            </w:pPr>
+            <w:r>
+              <w:rPr>
+                <w:sz w:val="19"/>
+              </w:rPr>
+              <w:t xml:space="preserve">Possess anyone, even another Operant, against their will.</w:t>
+            </w:r>
+          </w:p>
+        </w:tc>
+      </w:tr>
+      <w:tr>
+        <w:tc>
+          <w:tcPr/>
+          <w:p>
+            <w:pPr>
+              <w:pStyle w:val="Compact"/>
+              <w:jc w:val="left"/>
+            </w:pPr>
+            <w:r>
+              <w:rPr>
+                <w:bCs/>
+                <w:b/>
+                <w:sz w:val="19"/>
+              </w:rPr>
+              <w:t xml:space="preserve">Gadgeteering</w:t>
+            </w:r>
+          </w:p>
+        </w:tc>
+        <w:tc>
+          <w:tcPr/>
+          <w:p>
+            <w:pPr>
+              <w:pStyle w:val="Compact"/>
+              <w:jc w:val="left"/>
+            </w:pPr>
+            <w:r>
+              <w:rPr>
+                <w:sz w:val="19"/>
+              </w:rPr>
+              <w:t xml:space="preserve">Build Class IV devices: a better suit than ExLAW’s Aegis.</w:t>
+            </w:r>
+          </w:p>
+        </w:tc>
+        <w:tc>
+          <w:tcPr/>
+          <w:p>
+            <w:pPr>
+              <w:pStyle w:val="Compact"/>
+              <w:jc w:val="left"/>
+            </w:pPr>
+            <w:r>
+              <w:rPr>
+                <w:sz w:val="19"/>
+              </w:rPr>
+              <w:t xml:space="preserve">Class V devices: an orbital platform.</w:t>
+            </w:r>
+          </w:p>
+        </w:tc>
+        <w:tc>
+          <w:tcPr/>
+          <w:p>
+            <w:pPr>
+              <w:pStyle w:val="Compact"/>
+              <w:jc w:val="left"/>
+            </w:pPr>
+            <w:r>
+              <w:rPr>
+                <w:sz w:val="19"/>
+              </w:rPr>
+              <w:t xml:space="preserve">Tesla-class inventions: doors between worlds.</w:t>
             </w:r>
           </w:p>
         </w:tc>

</xml_diff>

<commit_message>
Aurora: optional Pure sorcery (Cantrips takes every power slot, +2 cantrips per slot given up)
Co-Authored-By: Claude Opus 5.5 <noreply@anthropic.com>
Claude-Session: https://claude.ai/code/session_015SADCFzhKijkC2foUmXrpC
</commit_message>
<xml_diff>
--- a/legend-dynamics/aurora/Aurora_Players_Guide.docx
+++ b/legend-dynamics/aurora/Aurora_Players_Guide.docx
@@ -25154,6 +25154,89 @@
       </w:r>
       <w:r>
         <w:t xml:space="preserve">between cases, swap one cantrip for another with a week of study.</w:t>
+      </w:r>
+    </w:p>
+    <w:p>
+      <w:pPr>
+        <w:numPr>
+          <w:ilvl w:val="0"/>
+          <w:numId w:val="1018"/>
+        </w:numPr>
+        <w:pStyle w:val="Compact"/>
+      </w:pPr>
+      <w:r>
+        <w:rPr>
+          <w:bCs/>
+          <w:b/>
+        </w:rPr>
+        <w:t xml:space="preserve">Pure sorcery (optional):</w:t>
+      </w:r>
+      <w:r>
+        <w:t xml:space="preserve"> </w:t>
+      </w:r>
+      <w:r>
+        <w:t xml:space="preserve">a character who is nothing but a spellcaster can let Cantrips take</w:t>
+      </w:r>
+      <w:r>
+        <w:t xml:space="preserve"> </w:t>
+      </w:r>
+      <w:r>
+        <w:rPr>
+          <w:bCs/>
+          <w:b/>
+        </w:rPr>
+        <w:t xml:space="preserve">all</w:t>
+      </w:r>
+      <w:r>
+        <w:t xml:space="preserve"> </w:t>
+      </w:r>
+      <w:r>
+        <w:t xml:space="preserve">their power slots. It works at the best slot’s Class, and each slot given up adds</w:t>
+      </w:r>
+      <w:r>
+        <w:t xml:space="preserve"> </w:t>
+      </w:r>
+      <w:r>
+        <w:rPr>
+          <w:bCs/>
+          <w:b/>
+        </w:rPr>
+        <w:t xml:space="preserve">2 more cantrips</w:t>
+      </w:r>
+      <w:r>
+        <w:t xml:space="preserve">. A tier 2 character (Class II, I and I) becomes Cantrips II with 3 + 2 + 2 =</w:t>
+      </w:r>
+      <w:r>
+        <w:t xml:space="preserve"> </w:t>
+      </w:r>
+      <w:r>
+        <w:rPr>
+          <w:bCs/>
+          <w:b/>
+        </w:rPr>
+        <w:t xml:space="preserve">7 cantrips</w:t>
+      </w:r>
+      <w:r>
+        <w:t xml:space="preserve"> </w:t>
+      </w:r>
+      <w:r>
+        <w:t xml:space="preserve">and no other powers. Tick</w:t>
+      </w:r>
+      <w:r>
+        <w:t xml:space="preserve"> </w:t>
+      </w:r>
+      <w:r>
+        <w:rPr>
+          <w:iCs/>
+          <w:i/>
+        </w:rPr>
+        <w:t xml:space="preserve">Pure sorcery</w:t>
+      </w:r>
+      <w:r>
+        <w:t xml:space="preserve"> </w:t>
+      </w:r>
+      <w:r>
+        <w:t xml:space="preserve">in the creator’s step 4.</w:t>
       </w:r>
     </w:p>
     <w:tbl>

</xml_diff>

<commit_message>
Cantrip tiers: Seals for The Shattered Crown, Circles for Aurora
Every Shattered Crown cantrip now holds three Seals, and Sorcery breaks
them (Trained the First, Specialty the Second, Expert the Third). The
creator shows each cantrip at the caster's Seal, and the sheet names it.
Magic advancement becomes Deeper Seal (one cantrip a Seal deeper), Ritual
by heart and Archmage. In Aurora, the Cantrips power's Class is its Circle.

Co-Authored-By: Claude Opus 5.5 <noreply@anthropic.com>
Claude-Session: https://claude.ai/code/session_015SADCFzhKijkC2foUmXrpC
</commit_message>
<xml_diff>
--- a/legend-dynamics/aurora/Aurora_Players_Guide.docx
+++ b/legend-dynamics/aurora/Aurora_Players_Guide.docx
@@ -20455,37 +20455,37 @@
               <w:rPr>
                 <w:sz w:val="19"/>
               </w:rPr>
-              <w:t xml:space="preserve">Know 2 cantrips: quick spells cast in one action, each working at Class I.</w:t>
-            </w:r>
-          </w:p>
-        </w:tc>
-        <w:tc>
-          <w:tcPr/>
-          <w:p>
-            <w:pPr>
-              <w:pStyle w:val="Compact"/>
-              <w:jc w:val="left"/>
-            </w:pPr>
-            <w:r>
-              <w:rPr>
-                <w:sz w:val="19"/>
-              </w:rPr>
-              <w:t xml:space="preserve">Know 3 cantrips, each working at Class II.</w:t>
-            </w:r>
-          </w:p>
-        </w:tc>
-        <w:tc>
-          <w:tcPr/>
-          <w:p>
-            <w:pPr>
-              <w:pStyle w:val="Compact"/>
-              <w:jc w:val="left"/>
-            </w:pPr>
-            <w:r>
-              <w:rPr>
-                <w:sz w:val="19"/>
-              </w:rPr>
-              <w:t xml:space="preserve">Know 4 cantrips, each working at Class III.</w:t>
+              <w:t xml:space="preserve">First Circle: know 2 cantrips, quick spells cast in one action, each working at Class I.</w:t>
+            </w:r>
+          </w:p>
+        </w:tc>
+        <w:tc>
+          <w:tcPr/>
+          <w:p>
+            <w:pPr>
+              <w:pStyle w:val="Compact"/>
+              <w:jc w:val="left"/>
+            </w:pPr>
+            <w:r>
+              <w:rPr>
+                <w:sz w:val="19"/>
+              </w:rPr>
+              <w:t xml:space="preserve">Second Circle: know 3 cantrips, each working at Class II.</w:t>
+            </w:r>
+          </w:p>
+        </w:tc>
+        <w:tc>
+          <w:tcPr/>
+          <w:p>
+            <w:pPr>
+              <w:pStyle w:val="Compact"/>
+              <w:jc w:val="left"/>
+            </w:pPr>
+            <w:r>
+              <w:rPr>
+                <w:sz w:val="19"/>
+              </w:rPr>
+              <w:t xml:space="preserve">Third Circle: know 4 cantrips, each working at Class III.</w:t>
             </w:r>
           </w:p>
         </w:tc>
@@ -23884,37 +23884,37 @@
               <w:rPr>
                 <w:sz w:val="19"/>
               </w:rPr>
-              <w:t xml:space="preserve">Know 5 cantrips, each working at Class IV.</w:t>
-            </w:r>
-          </w:p>
-        </w:tc>
-        <w:tc>
-          <w:tcPr/>
-          <w:p>
-            <w:pPr>
-              <w:pStyle w:val="Compact"/>
-              <w:jc w:val="left"/>
-            </w:pPr>
-            <w:r>
-              <w:rPr>
-                <w:sz w:val="19"/>
-              </w:rPr>
-              <w:t xml:space="preserve">Know 6 cantrips, each working at Class V.</w:t>
-            </w:r>
-          </w:p>
-        </w:tc>
-        <w:tc>
-          <w:tcPr/>
-          <w:p>
-            <w:pPr>
-              <w:pStyle w:val="Compact"/>
-              <w:jc w:val="left"/>
-            </w:pPr>
-            <w:r>
-              <w:rPr>
-                <w:sz w:val="19"/>
-              </w:rPr>
-              <w:t xml:space="preserve">Know 7 cantrips, each working at Class VI.</w:t>
+              <w:t xml:space="preserve">Fourth Circle: know 5 cantrips, each working at Class IV.</w:t>
+            </w:r>
+          </w:p>
+        </w:tc>
+        <w:tc>
+          <w:tcPr/>
+          <w:p>
+            <w:pPr>
+              <w:pStyle w:val="Compact"/>
+              <w:jc w:val="left"/>
+            </w:pPr>
+            <w:r>
+              <w:rPr>
+                <w:sz w:val="19"/>
+              </w:rPr>
+              <w:t xml:space="preserve">Fifth Circle: know 6 cantrips, each working at Class V.</w:t>
+            </w:r>
+          </w:p>
+        </w:tc>
+        <w:tc>
+          <w:tcPr/>
+          <w:p>
+            <w:pPr>
+              <w:pStyle w:val="Compact"/>
+              <w:jc w:val="left"/>
+            </w:pPr>
+            <w:r>
+              <w:rPr>
+                <w:sz w:val="19"/>
+              </w:rPr>
+              <w:t xml:space="preserve">Sixth Circle: know 7 cantrips, each working at Class VI.</w:t>
             </w:r>
           </w:p>
         </w:tc>
@@ -24837,7 +24837,33 @@
         <w:t xml:space="preserve"> </w:t>
       </w:r>
       <w:r>
-        <w:t xml:space="preserve">is a power for that. Instead of one effect, it gives you a few quick spells, and each one works at the power’s Class.</w:t>
+        <w:t xml:space="preserve">is a power for that. Instead of one effect, it gives you a few quick spells. The power’s Class is your</w:t>
+      </w:r>
+      <w:r>
+        <w:t xml:space="preserve"> </w:t>
+      </w:r>
+      <w:r>
+        <w:rPr>
+          <w:bCs/>
+          <w:b/>
+        </w:rPr>
+        <w:t xml:space="preserve">Circle</w:t>
+      </w:r>
+      <w:r>
+        <w:t xml:space="preserve">, and every cantrip you know works at it: a Class II caster is a sorcerer of the</w:t>
+      </w:r>
+      <w:r>
+        <w:t xml:space="preserve"> </w:t>
+      </w:r>
+      <w:r>
+        <w:rPr>
+          <w:bCs/>
+          <w:b/>
+        </w:rPr>
+        <w:t xml:space="preserve">Second Circle</w:t>
+      </w:r>
+      <w:r>
+        <w:t xml:space="preserve">.</w:t>
       </w:r>
     </w:p>
     <w:tbl>
@@ -24856,8 +24882,9 @@
         </w:tblBorders>
       </w:tblPr>
       <w:tblGrid>
-        <w:gridCol w:w="3960"/>
-        <w:gridCol w:w="3960"/>
+        <w:gridCol w:w="2640"/>
+        <w:gridCol w:w="2640"/>
+        <w:gridCol w:w="2640"/>
       </w:tblGrid>
       <w:tr>
         <w:trPr>
@@ -24877,7 +24904,7 @@
                 <w:b/>
                 <w:sz w:val="19"/>
               </w:rPr>
-              <w:t xml:space="preserve">Cantrips Class</w:t>
+              <w:t xml:space="preserve">Circle</w:t>
             </w:r>
           </w:p>
         </w:tc>
@@ -24895,6 +24922,24 @@
                 <w:b/>
                 <w:sz w:val="19"/>
               </w:rPr>
+              <w:t xml:space="preserve">Cantrips Class</w:t>
+            </w:r>
+          </w:p>
+        </w:tc>
+        <w:tc>
+          <w:tcPr>
+            <w:shd w:val="clear" w:fill="E8EEF8"/>
+          </w:tcPr>
+          <w:p>
+            <w:pPr>
+              <w:pStyle w:val="Compact"/>
+              <w:jc w:val="left"/>
+            </w:pPr>
+            <w:r>
+              <w:rPr>
+                <w:b/>
+                <w:sz w:val="19"/>
+              </w:rPr>
               <w:t xml:space="preserve">Cantrips known</w:t>
             </w:r>
           </w:p>
@@ -24913,6 +24958,21 @@
                 <w:b/>
                 <w:sz w:val="19"/>
               </w:rPr>
+              <w:t xml:space="preserve">First</w:t>
+            </w:r>
+          </w:p>
+        </w:tc>
+        <w:tc>
+          <w:tcPr/>
+          <w:p>
+            <w:pPr>
+              <w:pStyle w:val="Compact"/>
+              <w:jc w:val="left"/>
+            </w:pPr>
+            <w:r>
+              <w:rPr>
+                <w:sz w:val="19"/>
+              </w:rPr>
               <w:t xml:space="preserve">I</w:t>
             </w:r>
           </w:p>
@@ -24946,6 +25006,21 @@
                 <w:b/>
                 <w:sz w:val="19"/>
               </w:rPr>
+              <w:t xml:space="preserve">Second</w:t>
+            </w:r>
+          </w:p>
+        </w:tc>
+        <w:tc>
+          <w:tcPr/>
+          <w:p>
+            <w:pPr>
+              <w:pStyle w:val="Compact"/>
+              <w:jc w:val="left"/>
+            </w:pPr>
+            <w:r>
+              <w:rPr>
+                <w:sz w:val="19"/>
+              </w:rPr>
               <w:t xml:space="preserve">II</w:t>
             </w:r>
           </w:p>
@@ -24979,6 +25054,21 @@
                 <w:b/>
                 <w:sz w:val="19"/>
               </w:rPr>
+              <w:t xml:space="preserve">Third</w:t>
+            </w:r>
+          </w:p>
+        </w:tc>
+        <w:tc>
+          <w:tcPr/>
+          <w:p>
+            <w:pPr>
+              <w:pStyle w:val="Compact"/>
+              <w:jc w:val="left"/>
+            </w:pPr>
+            <w:r>
+              <w:rPr>
+                <w:sz w:val="19"/>
+              </w:rPr>
               <w:t xml:space="preserve">III</w:t>
             </w:r>
           </w:p>
@@ -25012,7 +25102,22 @@
                 <w:b/>
                 <w:sz w:val="19"/>
               </w:rPr>
-              <w:t xml:space="preserve">IV (GM’s approval)</w:t>
+              <w:t xml:space="preserve">Fourth (GM’s approval)</w:t>
+            </w:r>
+          </w:p>
+        </w:tc>
+        <w:tc>
+          <w:tcPr/>
+          <w:p>
+            <w:pPr>
+              <w:pStyle w:val="Compact"/>
+              <w:jc w:val="left"/>
+            </w:pPr>
+            <w:r>
+              <w:rPr>
+                <w:sz w:val="19"/>
+              </w:rPr>
+              <w:t xml:space="preserve">IV</w:t>
             </w:r>
           </w:p>
         </w:tc>
@@ -25028,6 +25133,102 @@
                 <w:sz w:val="19"/>
               </w:rPr>
               <w:t xml:space="preserve">5</w:t>
+            </w:r>
+          </w:p>
+        </w:tc>
+      </w:tr>
+      <w:tr>
+        <w:tc>
+          <w:tcPr/>
+          <w:p>
+            <w:pPr>
+              <w:pStyle w:val="Compact"/>
+              <w:jc w:val="left"/>
+            </w:pPr>
+            <w:r>
+              <w:rPr>
+                <w:b/>
+                <w:sz w:val="19"/>
+              </w:rPr>
+              <w:t xml:space="preserve">Fifth</w:t>
+            </w:r>
+          </w:p>
+        </w:tc>
+        <w:tc>
+          <w:tcPr/>
+          <w:p>
+            <w:pPr>
+              <w:pStyle w:val="Compact"/>
+              <w:jc w:val="left"/>
+            </w:pPr>
+            <w:r>
+              <w:rPr>
+                <w:sz w:val="19"/>
+              </w:rPr>
+              <w:t xml:space="preserve">V</w:t>
+            </w:r>
+          </w:p>
+        </w:tc>
+        <w:tc>
+          <w:tcPr/>
+          <w:p>
+            <w:pPr>
+              <w:pStyle w:val="Compact"/>
+              <w:jc w:val="left"/>
+            </w:pPr>
+            <w:r>
+              <w:rPr>
+                <w:sz w:val="19"/>
+              </w:rPr>
+              <w:t xml:space="preserve">6</w:t>
+            </w:r>
+          </w:p>
+        </w:tc>
+      </w:tr>
+      <w:tr>
+        <w:tc>
+          <w:tcPr/>
+          <w:p>
+            <w:pPr>
+              <w:pStyle w:val="Compact"/>
+              <w:jc w:val="left"/>
+            </w:pPr>
+            <w:r>
+              <w:rPr>
+                <w:b/>
+                <w:sz w:val="19"/>
+              </w:rPr>
+              <w:t xml:space="preserve">Sixth</w:t>
+            </w:r>
+          </w:p>
+        </w:tc>
+        <w:tc>
+          <w:tcPr/>
+          <w:p>
+            <w:pPr>
+              <w:pStyle w:val="Compact"/>
+              <w:jc w:val="left"/>
+            </w:pPr>
+            <w:r>
+              <w:rPr>
+                <w:sz w:val="19"/>
+              </w:rPr>
+              <w:t xml:space="preserve">VI</w:t>
+            </w:r>
+          </w:p>
+        </w:tc>
+        <w:tc>
+          <w:tcPr/>
+          <w:p>
+            <w:pPr>
+              <w:pStyle w:val="Compact"/>
+              <w:jc w:val="left"/>
+            </w:pPr>
+            <w:r>
+              <w:rPr>
+                <w:sz w:val="19"/>
+              </w:rPr>
+              <w:t xml:space="preserve">7</w:t>
             </w:r>
           </w:p>
         </w:tc>
@@ -25109,7 +25310,7 @@
         <w:t xml:space="preserve"> </w:t>
       </w:r>
       <w:r>
-        <w:t xml:space="preserve">pushing, Stronger Power and growth in play all work as usual; each Class higher teaches you another cantrip and strengthens them all.</w:t>
+        <w:t xml:space="preserve">pushing, Stronger Power and growth in play all work as usual; each Class higher raises you a Circle, teaches you another cantrip and strengthens them all.</w:t>
       </w:r>
     </w:p>
     <w:p>
@@ -25327,7 +25528,7 @@
               <w:rPr>
                 <w:sz w:val="19"/>
               </w:rPr>
-              <w:t xml:space="preserve">A mystic blast: an attack at the power’s Class, effective at Short range.</w:t>
+              <w:t xml:space="preserve">A mystic blast: an attack at your Circle’s Class, effective at Short range.</w:t>
             </w:r>
           </w:p>
         </w:tc>

</xml_diff>

<commit_message>
Aurora: one Officer calling and a Defense note; shield Dodge in the roller
- Aurora: Federal Agent, Sheriff, Police Officer and Detective become
  Officer (FBI agent or marshal, sheriff, city cop, detective, licensed
  private eye); the Allegiance says which force. New allegiances: A County
  Sheriff's Office, A City Police Department. ExLAW Agent, Aegis Pilot and
  International Operative stay. Old callings open as Officer. The example,
  Sheriff Wade Collier, serves his county sheriff's office.
- Aurora guide: Defense (a power's Class) is armor, not a defense roll; it
  applies after Dodge, Parry or Block and doesn't use them up.
- Creator: gear that adds to Dodge (The Shattered Crown's shield) gives a
  "Dodge with shield" option in the roller and shows on the sheet.

Co-Authored-By: Claude Opus 5.5 <noreply@anthropic.com>
Claude-Session: https://claude.ai/code/session_015SADCFzhKijkC2foUmXrpC
</commit_message>
<xml_diff>
--- a/legend-dynamics/aurora/Aurora_Players_Guide.docx
+++ b/legend-dynamics/aurora/Aurora_Players_Guide.docx
@@ -493,7 +493,7 @@
                 <w:b/>
                 <w:sz w:val="19"/>
               </w:rPr>
-              <w:t xml:space="preserve">Federal Agent</w:t>
+              <w:t xml:space="preserve">Officer</w:t>
             </w:r>
           </w:p>
         </w:tc>
@@ -523,211 +523,22 @@
               <w:rPr>
                 <w:sz w:val="19"/>
               </w:rPr>
-              <w:t xml:space="preserve">FBI, US Marshals, ATF or Homeland Security, working alongside ExLAW, or around it.</w:t>
-            </w:r>
-          </w:p>
-        </w:tc>
-        <w:tc>
-          <w:tcPr/>
-          <w:p>
-            <w:pPr>
-              <w:pStyle w:val="Compact"/>
-              <w:jc w:val="left"/>
-            </w:pPr>
-            <w:r>
-              <w:rPr>
-                <w:sz w:val="19"/>
-              </w:rPr>
-              <w:t xml:space="preserve">Investigation, Law, Computers, Persuasion</w:t>
-            </w:r>
-          </w:p>
-        </w:tc>
-      </w:tr>
-      <w:tr>
-        <w:tc>
-          <w:tcPr/>
-          <w:p>
-            <w:pPr>
-              <w:pStyle w:val="Compact"/>
-              <w:jc w:val="left"/>
-            </w:pPr>
-            <w:r>
-              <w:rPr>
-                <w:b/>
-                <w:sz w:val="19"/>
-              </w:rPr>
-              <w:t xml:space="preserve">Sheriff</w:t>
-            </w:r>
-          </w:p>
-        </w:tc>
-        <w:tc>
-          <w:tcPr/>
-          <w:p>
-            <w:pPr>
-              <w:pStyle w:val="Compact"/>
-              <w:jc w:val="left"/>
-            </w:pPr>
-            <w:r>
-              <w:rPr>
-                <w:sz w:val="19"/>
-              </w:rPr>
-              <w:t xml:space="preserve">The Badge</w:t>
-            </w:r>
-          </w:p>
-        </w:tc>
-        <w:tc>
-          <w:tcPr/>
-          <w:p>
-            <w:pPr>
-              <w:pStyle w:val="Compact"/>
-              <w:jc w:val="left"/>
-            </w:pPr>
-            <w:r>
-              <w:rPr>
-                <w:sz w:val="19"/>
-              </w:rPr>
-              <w:t xml:space="preserve">an elected county lawman who answers to the voters, not to Washington; maybe on the edge of the Mad Forest.</w:t>
-            </w:r>
-          </w:p>
-        </w:tc>
-        <w:tc>
-          <w:tcPr/>
-          <w:p>
-            <w:pPr>
-              <w:pStyle w:val="Compact"/>
-              <w:jc w:val="left"/>
-            </w:pPr>
-            <w:r>
-              <w:rPr>
-                <w:sz w:val="19"/>
-              </w:rPr>
-              <w:t xml:space="preserve">Leadership, Firearms, Law, Persuasion</w:t>
-            </w:r>
-          </w:p>
-        </w:tc>
-      </w:tr>
-      <w:tr>
-        <w:tc>
-          <w:tcPr/>
-          <w:p>
-            <w:pPr>
-              <w:pStyle w:val="Compact"/>
-              <w:jc w:val="left"/>
-            </w:pPr>
-            <w:r>
-              <w:rPr>
-                <w:b/>
-                <w:sz w:val="19"/>
-              </w:rPr>
-              <w:t xml:space="preserve">Police Officer</w:t>
-            </w:r>
-          </w:p>
-        </w:tc>
-        <w:tc>
-          <w:tcPr/>
-          <w:p>
-            <w:pPr>
-              <w:pStyle w:val="Compact"/>
-              <w:jc w:val="left"/>
-            </w:pPr>
-            <w:r>
-              <w:rPr>
-                <w:sz w:val="19"/>
-              </w:rPr>
-              <w:t xml:space="preserve">The Badge</w:t>
-            </w:r>
-          </w:p>
-        </w:tc>
-        <w:tc>
-          <w:tcPr/>
-          <w:p>
-            <w:pPr>
-              <w:pStyle w:val="Compact"/>
-              <w:jc w:val="left"/>
-            </w:pPr>
-            <w:r>
-              <w:rPr>
-                <w:sz w:val="19"/>
-              </w:rPr>
-              <w:t xml:space="preserve">city patrol, first on the scene when an Operant fight breaks out, and last to get the credit.</w:t>
-            </w:r>
-          </w:p>
-        </w:tc>
-        <w:tc>
-          <w:tcPr/>
-          <w:p>
-            <w:pPr>
-              <w:pStyle w:val="Compact"/>
-              <w:jc w:val="left"/>
-            </w:pPr>
-            <w:r>
-              <w:rPr>
-                <w:sz w:val="19"/>
-              </w:rPr>
-              <w:t xml:space="preserve">Firearms, Piloting, Brawling, Read People</w:t>
-            </w:r>
-          </w:p>
-        </w:tc>
-      </w:tr>
-      <w:tr>
-        <w:tc>
-          <w:tcPr/>
-          <w:p>
-            <w:pPr>
-              <w:pStyle w:val="Compact"/>
-              <w:jc w:val="left"/>
-            </w:pPr>
-            <w:r>
-              <w:rPr>
-                <w:b/>
-                <w:sz w:val="19"/>
-              </w:rPr>
-              <w:t xml:space="preserve">Detective</w:t>
-            </w:r>
-          </w:p>
-        </w:tc>
-        <w:tc>
-          <w:tcPr/>
-          <w:p>
-            <w:pPr>
-              <w:pStyle w:val="Compact"/>
-              <w:jc w:val="left"/>
-            </w:pPr>
-            <w:r>
-              <w:rPr>
-                <w:sz w:val="19"/>
-              </w:rPr>
-              <w:t xml:space="preserve">The Badge</w:t>
-            </w:r>
-          </w:p>
-        </w:tc>
-        <w:tc>
-          <w:tcPr/>
-          <w:p>
-            <w:pPr>
-              <w:pStyle w:val="Compact"/>
-              <w:jc w:val="left"/>
-            </w:pPr>
-            <w:r>
-              <w:rPr>
-                <w:sz w:val="19"/>
-              </w:rPr>
-              <w:t xml:space="preserve">police or private eye, working the cases nobody else will take.</w:t>
-            </w:r>
-          </w:p>
-        </w:tc>
-        <w:tc>
-          <w:tcPr/>
-          <w:p>
-            <w:pPr>
-              <w:pStyle w:val="Compact"/>
-              <w:jc w:val="left"/>
-            </w:pPr>
-            <w:r>
-              <w:rPr>
-                <w:sz w:val="19"/>
-              </w:rPr>
-              <w:t xml:space="preserve">Investigation, Streetwise, Read People, Firearms</w:t>
+              <w:t xml:space="preserve">carries a badge and the law’s authority, working alongside ExLAW or around it: an FBI agent or U.S. marshal, an elected county sheriff (maybe on the edge of the Mad Fringe), a city cop first on the scene of an Operant fight, a detective, or a licensed private eye. Your Allegiance says which force you serve.</w:t>
+            </w:r>
+          </w:p>
+        </w:tc>
+        <w:tc>
+          <w:tcPr/>
+          <w:p>
+            <w:pPr>
+              <w:pStyle w:val="Compact"/>
+              <w:jc w:val="left"/>
+            </w:pPr>
+            <w:r>
+              <w:rPr>
+                <w:sz w:val="19"/>
+              </w:rPr>
+              <w:t xml:space="preserve">Investigation, Firearms, Law, Read People</w:t>
             </w:r>
           </w:p>
         </w:tc>
@@ -4604,6 +4415,102 @@
                 <w:sz w:val="19"/>
               </w:rPr>
               <w:t xml:space="preserve">Duty: the agency’s priorities, and its turf war with ExLAW.</w:t>
+            </w:r>
+          </w:p>
+        </w:tc>
+      </w:tr>
+      <w:tr>
+        <w:tc>
+          <w:tcPr/>
+          <w:p>
+            <w:pPr>
+              <w:pStyle w:val="Compact"/>
+              <w:jc w:val="left"/>
+            </w:pPr>
+            <w:r>
+              <w:rPr>
+                <w:b/>
+                <w:sz w:val="19"/>
+              </w:rPr>
+              <w:t xml:space="preserve">A County Sheriff’s Office</w:t>
+            </w:r>
+          </w:p>
+        </w:tc>
+        <w:tc>
+          <w:tcPr/>
+          <w:p>
+            <w:pPr>
+              <w:pStyle w:val="Compact"/>
+              <w:jc w:val="left"/>
+            </w:pPr>
+            <w:r>
+              <w:rPr>
+                <w:sz w:val="19"/>
+              </w:rPr>
+              <w:t xml:space="preserve">Once per case, a deputy’s help, the county jail, or the county’s records and a word with the judge.</w:t>
+            </w:r>
+          </w:p>
+        </w:tc>
+        <w:tc>
+          <w:tcPr/>
+          <w:p>
+            <w:pPr>
+              <w:pStyle w:val="Compact"/>
+              <w:jc w:val="left"/>
+            </w:pPr>
+            <w:r>
+              <w:rPr>
+                <w:sz w:val="19"/>
+              </w:rPr>
+              <w:t xml:space="preserve">Duty: the sheriff answers to the voters, and the county’s feuds and elections become yours.</w:t>
+            </w:r>
+          </w:p>
+        </w:tc>
+      </w:tr>
+      <w:tr>
+        <w:tc>
+          <w:tcPr/>
+          <w:p>
+            <w:pPr>
+              <w:pStyle w:val="Compact"/>
+              <w:jc w:val="left"/>
+            </w:pPr>
+            <w:r>
+              <w:rPr>
+                <w:b/>
+                <w:sz w:val="19"/>
+              </w:rPr>
+              <w:t xml:space="preserve">A City Police Department</w:t>
+            </w:r>
+          </w:p>
+        </w:tc>
+        <w:tc>
+          <w:tcPr/>
+          <w:p>
+            <w:pPr>
+              <w:pStyle w:val="Compact"/>
+              <w:jc w:val="left"/>
+            </w:pPr>
+            <w:r>
+              <w:rPr>
+                <w:sz w:val="19"/>
+              </w:rPr>
+              <w:t xml:space="preserve">Once per case, patrol backup, a holding cell, or the department’s files and crime lab.</w:t>
+            </w:r>
+          </w:p>
+        </w:tc>
+        <w:tc>
+          <w:tcPr/>
+          <w:p>
+            <w:pPr>
+              <w:pStyle w:val="Compact"/>
+              <w:jc w:val="left"/>
+            </w:pPr>
+            <w:r>
+              <w:rPr>
+                <w:sz w:val="19"/>
+              </w:rPr>
+              <w:t xml:space="preserve">Duty: the chain of command, the union’s politics, and a department that resents Operants and ExLAW alike.</w:t>
             </w:r>
           </w:p>
         </w:tc>
@@ -9969,6 +9876,56 @@
       </w:r>
       <w:r>
         <w:t xml:space="preserve">it does nothing. A bulletproof Operant (Defense II) ignores pistols and rifles, and an Aegis cannon still marks a box.</w:t>
+      </w:r>
+    </w:p>
+    <w:p>
+      <w:pPr>
+        <w:pStyle w:val="BodyText"/>
+      </w:pPr>
+      <w:r>
+        <w:rPr>
+          <w:iCs/>
+          <w:i/>
+        </w:rPr>
+        <w:t xml:space="preserve">Defense is not a defense roll.</w:t>
+      </w:r>
+      <w:r>
+        <w:t xml:space="preserve"> </w:t>
+      </w:r>
+      <w:r>
+        <w:t xml:space="preserve">Your</w:t>
+      </w:r>
+      <w:r>
+        <w:t xml:space="preserve"> </w:t>
+      </w:r>
+      <w:r>
+        <w:rPr>
+          <w:bCs/>
+          <w:b/>
+        </w:rPr>
+        <w:t xml:space="preserve">defense</w:t>
+      </w:r>
+      <w:r>
+        <w:t xml:space="preserve"> </w:t>
+      </w:r>
+      <w:r>
+        <w:t xml:space="preserve">(Dodge, Parry or Block, one a round) decides whether an attack hits at all. Your</w:t>
+      </w:r>
+      <w:r>
+        <w:t xml:space="preserve"> </w:t>
+      </w:r>
+      <w:r>
+        <w:rPr>
+          <w:bCs/>
+          <w:b/>
+        </w:rPr>
+        <w:t xml:space="preserve">Defense</w:t>
+      </w:r>
+      <w:r>
+        <w:t xml:space="preserve"> </w:t>
+      </w:r>
+      <w:r>
+        <w:t xml:space="preserve">Class is armor: it applies to whatever hits, every time, at no cost. A Force Field doesn’t use up your Dodge.</w:t>
       </w:r>
     </w:p>
     <w:p>
@@ -17827,7 +17784,7 @@
         <w:t xml:space="preserve"> </w:t>
       </w:r>
       <w:r>
-        <w:t xml:space="preserve">An attack above your Defense hits in full; an equal one marks a box fewer; a lower one does nothing.</w:t>
+        <w:t xml:space="preserve">Armor, not a defense roll: an attack above your Defense hits in full; an equal one marks a box fewer; a lower one does nothing. It applies after your Dodge, Parry or Block.</w:t>
       </w:r>
     </w:p>
     <w:p>

</xml_diff>

<commit_message>
Aurora: Interpol replaces UNILED
- The Allegiance, the International Operative calling, the timeline, the
  Raster Eight entry and the factions list now name Interpol, whose
  Operant division hunts fugitives across borders and fills Raster Eight.
- The allegiance keeps its id, so characters who chose it keep it.
- Website kit blocks rebuilt.

Co-Authored-By: Claude Opus 5.5 <noreply@anthropic.com>
Claude-Session: https://claude.ai/code/session_015SADCFzhKijkC2foUmXrpC
</commit_message>
<xml_diff>
--- a/legend-dynamics/aurora/Aurora_Players_Guide.docx
+++ b/legend-dynamics/aurora/Aurora_Players_Guide.docx
@@ -649,7 +649,7 @@
               <w:rPr>
                 <w:sz w:val="19"/>
               </w:rPr>
-              <w:t xml:space="preserve">UNILED, the French Affaires spéciales, MI5 or Interpol; the law has borders, Operants don’t.</w:t>
+              <w:t xml:space="preserve">Interpol, the French Affaires spéciales or MI5; the law has borders, Operants don’t.</w:t>
             </w:r>
           </w:p>
         </w:tc>
@@ -4576,37 +4576,37 @@
                 <w:b/>
                 <w:sz w:val="19"/>
               </w:rPr>
-              <w:t xml:space="preserve">UNILED</w:t>
-            </w:r>
-          </w:p>
-        </w:tc>
-        <w:tc>
-          <w:tcPr/>
-          <w:p>
-            <w:pPr>
-              <w:pStyle w:val="Compact"/>
-              <w:jc w:val="left"/>
-            </w:pPr>
-            <w:r>
-              <w:rPr>
-                <w:sz w:val="19"/>
-              </w:rPr>
-              <w:t xml:space="preserve">Once per case, international reach: a foreign agency’s help or a flight to anywhere.</w:t>
-            </w:r>
-          </w:p>
-        </w:tc>
-        <w:tc>
-          <w:tcPr/>
-          <w:p>
-            <w:pPr>
-              <w:pStyle w:val="Compact"/>
-              <w:jc w:val="left"/>
-            </w:pPr>
-            <w:r>
-              <w:rPr>
-                <w:sz w:val="19"/>
-              </w:rPr>
-              <w:t xml:space="preserve">Duty: UN politics, and member states who want different things.</w:t>
+              <w:t xml:space="preserve">Interpol</w:t>
+            </w:r>
+          </w:p>
+        </w:tc>
+        <w:tc>
+          <w:tcPr/>
+          <w:p>
+            <w:pPr>
+              <w:pStyle w:val="Compact"/>
+              <w:jc w:val="left"/>
+            </w:pPr>
+            <w:r>
+              <w:rPr>
+                <w:sz w:val="19"/>
+              </w:rPr>
+              <w:t xml:space="preserve">Once per case, international reach: a Red Notice, a foreign police force’s help, or a flight to anywhere.</w:t>
+            </w:r>
+          </w:p>
+        </w:tc>
+        <w:tc>
+          <w:tcPr/>
+          <w:p>
+            <w:pPr>
+              <w:pStyle w:val="Compact"/>
+              <w:jc w:val="left"/>
+            </w:pPr>
+            <w:r>
+              <w:rPr>
+                <w:sz w:val="19"/>
+              </w:rPr>
+              <w:t xml:space="preserve">Duty: member countries who want different things, and fugitives who know your face.</w:t>
             </w:r>
           </w:p>
         </w:tc>
@@ -15835,20 +15835,23 @@
         <w:t xml:space="preserve"> </w:t>
       </w:r>
       <w:r>
-        <w:t xml:space="preserve">in low Earth orbit, and revealed the</w:t>
-      </w:r>
-      <w:r>
-        <w:t xml:space="preserve"> </w:t>
-      </w:r>
-      <w:r>
-        <w:rPr>
-          <w:bCs/>
-          <w:b/>
-        </w:rPr>
-        <w:t xml:space="preserve">United Nations International Law Enforcement Directorate (UNILED)</w:t>
-      </w:r>
-      <w:r>
-        <w:t xml:space="preserve">, pooling the resources of the US, the Commonwealth of Independent States, Britain, China and many others against terrorism and Operant crime.</w:t>
+        <w:t xml:space="preserve">in low Earth orbit, and</w:t>
+      </w:r>
+      <w:r>
+        <w:t xml:space="preserve"> </w:t>
+      </w:r>
+      <w:r>
+        <w:rPr>
+          <w:bCs/>
+          <w:b/>
+        </w:rPr>
+        <w:t xml:space="preserve">Interpol</w:t>
+      </w:r>
+      <w:r>
+        <w:t xml:space="preserve"> </w:t>
+      </w:r>
+      <w:r>
+        <w:t xml:space="preserve">opened its Operant division, pooling the police of the US, the Commonwealth of Independent States, Britain, China and many others against terrorism and Operant crime.</w:t>
       </w:r>
     </w:p>
     <w:bookmarkEnd w:id="78"/>
@@ -16011,7 +16014,7 @@
         <w:t xml:space="preserve">invasion of Iraq</w:t>
       </w:r>
       <w:r>
-        <w:t xml:space="preserve">, which had sheltered White Hand training camps. ExLAW and UNILED turned on the White Hand and the</w:t>
+        <w:t xml:space="preserve">, which had sheltered White Hand training camps. ExLAW and Interpol turned on the White Hand and the</w:t>
       </w:r>
       <w:r>
         <w:t xml:space="preserve"> </w:t>
@@ -17568,7 +17571,7 @@
         <w:t xml:space="preserve">Raster Eight</w:t>
       </w:r>
       <w:r>
-        <w:t xml:space="preserve">: the UN’s prison in low Earth orbit, run by UNILED.</w:t>
+        <w:t xml:space="preserve">: the UN’s prison in low Earth orbit, where Interpol sends the Operants it catches.</w:t>
       </w:r>
     </w:p>
     <w:p>
@@ -28531,13 +28534,13 @@
           <w:bCs/>
           <w:b/>
         </w:rPr>
-        <w:t xml:space="preserve">UNILED.</w:t>
-      </w:r>
-      <w:r>
-        <w:t xml:space="preserve"> </w:t>
-      </w:r>
-      <w:r>
-        <w:t xml:space="preserve">The UN’s international enforcement directorate, which runs Raster Eight.</w:t>
+        <w:t xml:space="preserve">Interpol.</w:t>
+      </w:r>
+      <w:r>
+        <w:t xml:space="preserve"> </w:t>
+      </w:r>
+      <w:r>
+        <w:t xml:space="preserve">The international police organization, whose Operant division hunts fugitives across borders and fills Raster Eight.</w:t>
       </w:r>
     </w:p>
     <w:p>

</xml_diff>

<commit_message>
Aurora and Fracture Lines: riot shields; body armor as gear data
- Riot shield (new gear in both): +1 to Block against blows, blades, fists,
  thrown objects (and missiles in Aurora); never a bullet, slug or beam;
  -2 to Stealth while carried. The roller offers "Block, riot shield".
- Body armor in both is now protection data as well as gear text (Aurora:
  a Class I hit marks one fewer; Fracture Lines: a 2+ box hit marks one
  fewer, once per fight), ready for the Rules Lab.

Co-Authored-By: Claude Opus 5.5 <noreply@anthropic.com>
Claude-Session: https://claude.ai/code/session_015SADCFzhKijkC2foUmXrpC
</commit_message>
<xml_diff>
--- a/legend-dynamics/aurora/Aurora_Players_Guide.docx
+++ b/legend-dynamics/aurora/Aurora_Players_Guide.docx
@@ -6696,6 +6696,39 @@
                 <w:sz w:val="19"/>
               </w:rPr>
               <w:t xml:space="preserve">Once per fight, a Class I hit marks one box fewer.</w:t>
+            </w:r>
+          </w:p>
+        </w:tc>
+      </w:tr>
+      <w:tr>
+        <w:tc>
+          <w:tcPr/>
+          <w:p>
+            <w:pPr>
+              <w:pStyle w:val="Compact"/>
+              <w:jc w:val="left"/>
+            </w:pPr>
+            <w:r>
+              <w:rPr>
+                <w:b/>
+                <w:sz w:val="19"/>
+              </w:rPr>
+              <w:t xml:space="preserve">Riot shield</w:t>
+            </w:r>
+          </w:p>
+        </w:tc>
+        <w:tc>
+          <w:tcPr/>
+          <w:p>
+            <w:pPr>
+              <w:pStyle w:val="Compact"/>
+              <w:jc w:val="left"/>
+            </w:pPr>
+            <w:r>
+              <w:rPr>
+                <w:sz w:val="19"/>
+              </w:rPr>
+              <w:t xml:space="preserve">A clear polycarbonate shield: +1 to Block against blows, thrown objects and missiles. It won’t stop a bullet. −2 to Stealth while you carry it.</w:t>
             </w:r>
           </w:p>
         </w:tc>

</xml_diff>

<commit_message>
Battle map: name the party per setting
A new "party" term (posse, party, crew, team) names the button that places
the characters, the lane they stand in, and the instructions on the map and
in the rules.

Co-Authored-By: Claude Opus 5.5 <noreply@anthropic.com>
Claude-Session: https://claude.ai/code/session_015SADCFzhKijkC2foUmXrpC
</commit_message>
<xml_diff>
--- a/legend-dynamics/aurora/Aurora_Players_Guide.docx
+++ b/legend-dynamics/aurora/Aurora_Players_Guide.docx
@@ -11915,7 +11915,7 @@
         <w:t xml:space="preserve"> </w:t>
       </w:r>
       <w:r>
-        <w:t xml:space="preserve">for fights where only distance matters: a chase, a running fight across open country. It has a lane for the party and one for each range band. Moving a token into the next lane moves it one band in or out.</w:t>
+        <w:t xml:space="preserve">for fights where only distance matters: a chase, a running fight across open country. It has a lane for the team and one for each range band. Moving a token into the next lane moves it one band in or out.</w:t>
       </w:r>
     </w:p>
     <w:p>
@@ -11933,7 +11933,7 @@
         <w:t xml:space="preserve"> </w:t>
       </w:r>
       <w:r>
-        <w:t xml:space="preserve">The GM places the party with one button. Their tokens stay linked to the characters in the GM view: marking Injury, Dying, the stunned condition or a Spark point on a token marks it on the character, and the other way round. Opponents come from the setting’s threats with their boxes filled in. Their pips fill as they are hurt, and a token whose boxes are all marked is taken out.</w:t>
+        <w:t xml:space="preserve">The GM places the team with one button. Their tokens stay linked to the characters in the GM view: marking Injury, Dying, the stunned condition or a Spark point on a token marks it on the character, and the other way round. Opponents come from the setting’s threats with their boxes filled in. Their pips fill as they are hurt, and a token whose boxes are all marked is taken out.</w:t>
       </w:r>
     </w:p>
     <w:p>

</xml_diff>

<commit_message>
Starting-card advantages renamed to match: Classified Archive, Sealed Binder
Fracture Lines' Classified Codex is now Classified Archive and Aurora's
Sealed Case Files is now Sealed Binder, to match the collections. Their
ids (codex, casefiles) are unchanged, so saved characters keep them.

Co-Authored-By: Claude Opus 5.5 <noreply@anthropic.com>
Claude-Session: https://claude.ai/code/session_015SADCFzhKijkC2foUmXrpC
</commit_message>
<xml_diff>
--- a/legend-dynamics/aurora/Aurora_Players_Guide.docx
+++ b/legend-dynamics/aurora/Aurora_Players_Guide.docx
@@ -17388,13 +17388,13 @@
       </w:r>
     </w:p>
     <w:bookmarkEnd w:id="82"/>
-    <w:bookmarkStart w:id="83" w:name="sealed-case-files"/>
+    <w:bookmarkStart w:id="83" w:name="sealed-binder"/>
     <w:p>
       <w:pPr>
         <w:pStyle w:val="Heading3"/>
       </w:pPr>
       <w:r>
-        <w:t xml:space="preserve">Sealed Case Files</w:t>
+        <w:t xml:space="preserve">Sealed Binder</w:t>
       </w:r>
     </w:p>
     <w:p>
@@ -17412,7 +17412,7 @@
           <w:bCs/>
           <w:b/>
         </w:rPr>
-        <w:t xml:space="preserve">Sealed Case Files</w:t>
+        <w:t xml:space="preserve">Sealed Binder</w:t>
       </w:r>
       <w:r>
         <w:t xml:space="preserve"> </w:t>
@@ -35236,7 +35236,7 @@
                 <w:b/>
                 <w:sz w:val="19"/>
               </w:rPr>
-              <w:t xml:space="preserve">Sealed Case Files</w:t>
+              <w:t xml:space="preserve">Sealed Binder</w:t>
             </w:r>
           </w:p>
         </w:tc>

</xml_diff>

<commit_message>
Fracture Lines and Aurora: rename the paths to Specialist and Expert
Both settings now match the core rules: Specialist (one Specialty, nine
Trained) and Expert (one Expert skill, seven Trained). Rebuilt the
creators, Players' Guides and site copies.

Co-Authored-By: Claude Opus 5.5 <noreply@anthropic.com>
Claude-Session: https://claude.ai/code/session_015SADCFzhKijkC2foUmXrpC
</commit_message>
<xml_diff>
--- a/legend-dynamics/aurora/Aurora_Players_Guide.docx
+++ b/legend-dynamics/aurora/Aurora_Players_Guide.docx
@@ -1904,13 +1904,13 @@
         <w:t xml:space="preserve">Trained when you choose it. Keep them, raise one to your Specialty, or swap any of them for other skills; changing role swaps the core skills you haven’t changed.</w:t>
       </w:r>
     </w:p>
-    <w:bookmarkStart w:id="22" w:name="generalist-or-specialist"/>
+    <w:bookmarkStart w:id="22" w:name="specialist-or-expert"/>
     <w:p>
       <w:pPr>
         <w:pStyle w:val="Heading3"/>
       </w:pPr>
       <w:r>
-        <w:t xml:space="preserve">Generalist or Specialist</w:t>
+        <w:t xml:space="preserve">Specialist or Expert</w:t>
       </w:r>
     </w:p>
     <w:p>
@@ -1934,7 +1934,7 @@
           <w:bCs/>
           <w:b/>
         </w:rPr>
-        <w:t xml:space="preserve">Generalist:</w:t>
+        <w:t xml:space="preserve">Specialist:</w:t>
       </w:r>
       <w:r>
         <w:t xml:space="preserve"> </w:t>
@@ -1956,7 +1956,7 @@
           <w:bCs/>
           <w:b/>
         </w:rPr>
-        <w:t xml:space="preserve">Specialist:</w:t>
+        <w:t xml:space="preserve">Expert:</w:t>
       </w:r>
       <w:r>
         <w:t xml:space="preserve"> </w:t>
@@ -3803,7 +3803,7 @@
           <w:bCs/>
           <w:b/>
         </w:rPr>
-        <w:t xml:space="preserve">A Generalist</w:t>
+        <w:t xml:space="preserve">A Specialist</w:t>
       </w:r>
       <w:r>
         <w:t xml:space="preserve"> </w:t>
@@ -3851,7 +3851,7 @@
           <w:bCs/>
           <w:b/>
         </w:rPr>
-        <w:t xml:space="preserve">A Specialist</w:t>
+        <w:t xml:space="preserve">An Expert</w:t>
       </w:r>
       <w:r>
         <w:t xml:space="preserve"> </w:t>
@@ -3954,7 +3954,7 @@
         <w:t xml:space="preserve"> </w:t>
       </w:r>
       <w:r>
-        <w:t xml:space="preserve">A Specialist can broaden later (the GM’s call, usually after a significant case): the Expert skill becomes a Specialty at +3, and two more skills become Trained.</w:t>
+        <w:t xml:space="preserve">An Expert can broaden later (the GM’s call, usually after a significant case): the Expert skill becomes a Specialty at +3, and two more skills become Trained.</w:t>
       </w:r>
     </w:p>
     <w:bookmarkEnd w:id="30"/>
@@ -16099,7 +16099,7 @@
               <w:rPr>
                 <w:sz w:val="19"/>
               </w:rPr>
-              <w:t xml:space="preserve">Specialty (+3) is the ceiling: only a Specialist’s starting skill is Expert, unless they broaden (see Step 3)</w:t>
+              <w:t xml:space="preserve">Specialty (+3) is the ceiling: only an Expert’s starting skill is Expert, unless they broaden (see Step 3)</w:t>
             </w:r>
           </w:p>
         </w:tc>
@@ -33058,7 +33058,7 @@
           <w:iCs/>
           <w:i/>
         </w:rPr>
-        <w:t xml:space="preserve">Aegis pilot, Chicago wing, Aegis Pilot. Non-Operant (tier 0); Specialist.</w:t>
+        <w:t xml:space="preserve">Aegis pilot, Chicago wing, Aegis Pilot. Non-Operant (tier 0); Expert.</w:t>
       </w:r>
       <w:r>
         <w:t xml:space="preserve"> </w:t>
@@ -33496,7 +33496,7 @@
           <w:iCs/>
           <w:i/>
         </w:rPr>
-        <w:t xml:space="preserve">Professor of comparative religion; Earth Warden, Occultist. Adept (tier 1); Specialist.</w:t>
+        <w:t xml:space="preserve">Professor of comparative religion; Earth Warden, Occultist. Adept (tier 1); Expert.</w:t>
       </w:r>
       <w:r>
         <w:t xml:space="preserve"> </w:t>
@@ -41322,7 +41322,7 @@
         <w:t xml:space="preserve"> </w:t>
       </w:r>
       <w:r>
-        <w:t xml:space="preserve">attributes start at 10, adjusted by origin (always totaling zero), plus 5 points; maximum 13 plus any origin bonus. 4 points split between origin tier and Edges. Generalist: one Specialty and nine Trained. Specialist: one Expert at +5 and seven Trained. One advantage (general or origin) and one complication; an optional Allegiance.</w:t>
+        <w:t xml:space="preserve">attributes start at 10, adjusted by origin (always totaling zero), plus 5 points; maximum 13 plus any origin bonus. 4 points split between origin tier and Edges. Specialist: one Specialty and nine Trained. Expert: one Expert at +5 and seven Trained. One advantage (general or origin) and one complication; an optional Allegiance.</w:t>
       </w:r>
     </w:p>
     <w:p>
@@ -41340,7 +41340,7 @@
         <w:t xml:space="preserve"> </w:t>
       </w:r>
       <w:r>
-        <w:t xml:space="preserve">Untrained = attribute −4; Trained = attribute +1; Specialty = attribute +3; Expert (Specialist) = attribute +5.</w:t>
+        <w:t xml:space="preserve">Untrained = attribute −4; Trained = attribute +1; Specialty = attribute +3; Expert (Expert) = attribute +5.</w:t>
       </w:r>
     </w:p>
     <w:p>

</xml_diff>

<commit_message>
Aurora: Exposure is relative to who already knows
A secret identity is secret from someone. Each hero with a Secret
Identity keeps a list of who knows: people and groups they add (their
allegiance is offered, plus family and a close friend), and what their
legal status means (Registered: the EMD; Reserve Agent: ExLAW's
Director; Full Agent: ExLAW). Exposure now measures the secret getting
past them, and the rules say someone new who learns it goes on the
list. Shown on the play tab, the print sheet and the GM view's card.

Co-Authored-By: Claude Opus 5.5 <noreply@anthropic.com>
Claude-Session: https://claude.ai/code/session_015SADCFzhKijkC2foUmXrpC
</commit_message>
<xml_diff>
--- a/legend-dynamics/aurora/Aurora_Players_Guide.docx
+++ b/legend-dynamics/aurora/Aurora_Players_Guide.docx
@@ -15622,7 +15622,91 @@
         <w:t xml:space="preserve">Exposure</w:t>
       </w:r>
       <w:r>
-        <w:t xml:space="preserve">: four boxes for how close the world is to learning who is behind the mask.</w:t>
+        <w:t xml:space="preserve">: four boxes for how close the secret is to getting out.</w:t>
+      </w:r>
+    </w:p>
+    <w:p>
+      <w:pPr>
+        <w:pStyle w:val="BodyText"/>
+      </w:pPr>
+      <w:r>
+        <w:t xml:space="preserve">A secret identity is secret</w:t>
+      </w:r>
+      <w:r>
+        <w:t xml:space="preserve"> </w:t>
+      </w:r>
+      <w:r>
+        <w:rPr>
+          <w:iCs/>
+          <w:i/>
+        </w:rPr>
+        <w:t xml:space="preserve">from someone</w:t>
+      </w:r>
+      <w:r>
+        <w:t xml:space="preserve">. Some heroes’ secrets are known to no one; others are known to their family, their team, or the government. Each character keeps a list of</w:t>
+      </w:r>
+      <w:r>
+        <w:t xml:space="preserve"> </w:t>
+      </w:r>
+      <w:r>
+        <w:rPr>
+          <w:bCs/>
+          <w:b/>
+        </w:rPr>
+        <w:t xml:space="preserve">who knows</w:t>
+      </w:r>
+      <w:r>
+        <w:t xml:space="preserve">: people (a sister, a partner, an old mentor) and groups (the Legion’s founders, ExLAW, the Morcain). Your legal status can put someone on it whether you like it or not: a</w:t>
+      </w:r>
+      <w:r>
+        <w:t xml:space="preserve"> </w:t>
+      </w:r>
+      <w:r>
+        <w:rPr>
+          <w:bCs/>
+          <w:b/>
+        </w:rPr>
+        <w:t xml:space="preserve">Registered</w:t>
+      </w:r>
+      <w:r>
+        <w:t xml:space="preserve"> </w:t>
+      </w:r>
+      <w:r>
+        <w:t xml:space="preserve">Operant’s identity is in the EMD for anyone with access, a</w:t>
+      </w:r>
+      <w:r>
+        <w:t xml:space="preserve"> </w:t>
+      </w:r>
+      <w:r>
+        <w:rPr>
+          <w:bCs/>
+          <w:b/>
+        </w:rPr>
+        <w:t xml:space="preserve">Reserve Agent</w:t>
+      </w:r>
+      <w:r>
+        <w:t xml:space="preserve">’s is held by ExLAW’s Director, and a</w:t>
+      </w:r>
+      <w:r>
+        <w:t xml:space="preserve"> </w:t>
+      </w:r>
+      <w:r>
+        <w:rPr>
+          <w:bCs/>
+          <w:b/>
+        </w:rPr>
+        <w:t xml:space="preserve">Full Agent</w:t>
+      </w:r>
+      <w:r>
+        <w:t xml:space="preserve">’s by ExLAW. A group you’re affiliated with only knows if you’ve told it, or it found out.</w:t>
+      </w:r>
+    </w:p>
+    <w:p>
+      <w:pPr>
+        <w:pStyle w:val="BodyText"/>
+      </w:pPr>
+      <w:r>
+        <w:t xml:space="preserve">Exposure measures the secret getting past the people who already know it:</w:t>
       </w:r>
     </w:p>
     <w:tbl>
@@ -15713,7 +15797,7 @@
               <w:rPr>
                 <w:sz w:val="19"/>
               </w:rPr>
-              <w:t xml:space="preserve">Safe: no one has put the two of you together</w:t>
+              <w:t xml:space="preserve">Safe: your secret is held only by those who already know it</w:t>
             </w:r>
           </w:p>
         </w:tc>
@@ -15746,7 +15830,7 @@
               <w:rPr>
                 <w:sz w:val="19"/>
               </w:rPr>
-              <w:t xml:space="preserve">Rumors: a reporter or a neighbour wonders out loud</w:t>
+              <w:t xml:space="preserve">Rumors: someone outside the circle wonders out loud</w:t>
             </w:r>
           </w:p>
         </w:tc>
@@ -15779,7 +15863,7 @@
               <w:rPr>
                 <w:sz w:val="19"/>
               </w:rPr>
-              <w:t xml:space="preserve">Suspected: someone who matters is sure; −2 to Deception about who you are</w:t>
+              <w:t xml:space="preserve">Suspected: someone outside the circle who matters is sure; −2 to Deception about who you are</w:t>
             </w:r>
           </w:p>
         </w:tc>
@@ -15871,6 +15955,28 @@
       </w:r>
       <w:r>
         <w:t xml:space="preserve">the secret slips. You’re seen changing, you use a power in your civilian life, a villain’s file names you, an injury shows up on both of you, you can’t explain where you were. A success at a cost can mark it.</w:t>
+      </w:r>
+    </w:p>
+    <w:p>
+      <w:pPr>
+        <w:numPr>
+          <w:ilvl w:val="0"/>
+          <w:numId w:val="1019"/>
+        </w:numPr>
+        <w:pStyle w:val="Compact"/>
+      </w:pPr>
+      <w:r>
+        <w:rPr>
+          <w:bCs/>
+          <w:b/>
+        </w:rPr>
+        <w:t xml:space="preserve">Someone new learns.</w:t>
+      </w:r>
+      <w:r>
+        <w:t xml:space="preserve"> </w:t>
+      </w:r>
+      <w:r>
+        <w:t xml:space="preserve">When one person or group finds out (and not the world), they go on your list instead: a villain who learns your name, a reporter you take into your confidence, an agency that reads the wrong file. Mark a box of Exposure only if they won’t keep it to themselves. Whoever is on the list can protect the secret or use it: the GM can bring them in as a complication.</w:t>
       </w:r>
     </w:p>
     <w:p>
@@ -16909,7 +17015,7 @@
         <w:t xml:space="preserve">destroyed</w:t>
       </w:r>
       <w:r>
-        <w:t xml:space="preserve">: burn the folder, wipe the drive, discredit the source. A destroyed file gives nothing, and if it held the hero’s secret identity, destroying it clears a box of Exposure.</w:t>
+        <w:t xml:space="preserve">: burn the folder, wipe the drive, discredit the source. A destroyed file gives nothing, and if it held the hero’s secret identity, destroying it clears a box of Exposure (the villain who read it still knows, and stays on the hero’s list).</w:t>
       </w:r>
     </w:p>
     <w:bookmarkEnd w:id="81"/>

</xml_diff>